<commit_message>
Deploying to gh-pages from @ Morrison-Lab/mds@95e5928f8e7f176f5853fe6c9316bdeef7a1c2aa 🚀
</commit_message>
<xml_diff>
--- a/functions.docx
+++ b/functions.docx
@@ -15,7 +15,7 @@
         <w:pStyle w:val="Date"/>
       </w:pPr>
       <w:r>
-        <w:t xml:space="preserve">Last modified: 2026-10-16 02:45:37 (PDT)</w:t>
+        <w:t xml:space="preserve">Last modified: 2026-10-16 03:50:53 (PDT)</w:t>
       </w:r>
     </w:p>
     <w:p>
@@ -6874,16 +6874,21 @@
         <w:t xml:space="preserve"> </w:t>
       </w:r>
       <m:oMath>
-        <m:acc>
-          <m:accPr>
-            <m:chr m:val="̃"/>
-          </m:accPr>
+        <m:limLow>
           <m:e>
             <m:r>
               <m:t>x</m:t>
             </m:r>
           </m:e>
-        </m:acc>
+          <m:lim>
+            <m:r>
+              <m:rPr>
+                <m:sty m:val="p"/>
+              </m:rPr>
+              <m:t>∼</m:t>
+            </m:r>
+          </m:lim>
+        </m:limLow>
         <m:r>
           <m:rPr>
             <m:sty m:val="p"/>
@@ -7036,16 +7041,21 @@
         <w:t xml:space="preserve"> </w:t>
       </w:r>
       <m:oMath>
-        <m:acc>
-          <m:accPr>
-            <m:chr m:val="̃"/>
-          </m:accPr>
+        <m:limLow>
           <m:e>
             <m:r>
               <m:t>x</m:t>
             </m:r>
           </m:e>
-        </m:acc>
+          <m:lim>
+            <m:r>
+              <m:rPr>
+                <m:sty m:val="p"/>
+              </m:rPr>
+              <m:t>∼</m:t>
+            </m:r>
+          </m:lim>
+        </m:limLow>
       </m:oMath>
       <w:r>
         <w:t xml:space="preserve">,</w:t>
@@ -7081,16 +7091,21 @@
           </m:rPr>
           <m:t>(</m:t>
         </m:r>
-        <m:acc>
-          <m:accPr>
-            <m:chr m:val="̃"/>
-          </m:accPr>
+        <m:limLow>
           <m:e>
             <m:r>
               <m:t>x</m:t>
             </m:r>
           </m:e>
-        </m:acc>
+          <m:lim>
+            <m:r>
+              <m:rPr>
+                <m:sty m:val="p"/>
+              </m:rPr>
+              <m:t>∼</m:t>
+            </m:r>
+          </m:lim>
+        </m:limLow>
         <m:r>
           <m:rPr>
             <m:sty m:val="p"/>
@@ -7125,16 +7140,21 @@
         <w:t xml:space="preserve"> </w:t>
       </w:r>
       <m:oMath>
-        <m:acc>
-          <m:accPr>
-            <m:chr m:val="̃"/>
-          </m:accPr>
+        <m:limLow>
           <m:e>
             <m:r>
               <m:t>x</m:t>
             </m:r>
           </m:e>
-        </m:acc>
+          <m:lim>
+            <m:r>
+              <m:rPr>
+                <m:sty m:val="p"/>
+              </m:rPr>
+              <m:t>∼</m:t>
+            </m:r>
+          </m:lim>
+        </m:limLow>
       </m:oMath>
       <w:r>
         <w:t xml:space="preserve">:</w:t>
@@ -7170,16 +7190,21 @@
             </m:rPr>
             <m:t>(</m:t>
           </m:r>
-          <m:acc>
-            <m:accPr>
-              <m:chr m:val="̃"/>
-            </m:accPr>
+          <m:limLow>
             <m:e>
               <m:r>
                 <m:t>x</m:t>
               </m:r>
             </m:e>
-          </m:acc>
+            <m:lim>
+              <m:r>
+                <m:rPr>
+                  <m:sty m:val="p"/>
+                </m:rPr>
+                <m:t>∼</m:t>
+              </m:r>
+            </m:lim>
+          </m:limLow>
           <m:r>
             <m:rPr>
               <m:sty m:val="p"/>
@@ -7489,16 +7514,21 @@
         <w:t xml:space="preserve"> </w:t>
       </w:r>
       <m:oMath>
-        <m:acc>
-          <m:accPr>
-            <m:chr m:val="̃"/>
-          </m:accPr>
+        <m:limLow>
           <m:e>
             <m:r>
               <m:t>x</m:t>
             </m:r>
           </m:e>
-        </m:acc>
+          <m:lim>
+            <m:r>
+              <m:rPr>
+                <m:sty m:val="p"/>
+              </m:rPr>
+              <m:t>∼</m:t>
+            </m:r>
+          </m:lim>
+        </m:limLow>
         <m:r>
           <m:rPr>
             <m:sty m:val="p"/>
@@ -7730,16 +7760,21 @@
                 </m:rPr>
                 <m:t>(</m:t>
               </m:r>
-              <m:acc>
-                <m:accPr>
-                  <m:chr m:val="̃"/>
-                </m:accPr>
+              <m:limLow>
                 <m:e>
                   <m:r>
                     <m:t>x</m:t>
                   </m:r>
                 </m:e>
-              </m:acc>
+                <m:lim>
+                  <m:r>
+                    <m:rPr>
+                      <m:sty m:val="p"/>
+                    </m:rPr>
+                    <m:t>∼</m:t>
+                  </m:r>
+                </m:lim>
+              </m:limLow>
               <m:r>
                 <m:rPr>
                   <m:sty m:val="p"/>
@@ -7869,16 +7904,21 @@
                 </m:rPr>
                 <m:t>(</m:t>
               </m:r>
-              <m:acc>
-                <m:accPr>
-                  <m:chr m:val="̃"/>
-                </m:accPr>
+              <m:limLow>
                 <m:e>
                   <m:r>
                     <m:t>x</m:t>
                   </m:r>
                 </m:e>
-              </m:acc>
+                <m:lim>
+                  <m:r>
+                    <m:rPr>
+                      <m:sty m:val="p"/>
+                    </m:rPr>
+                    <m:t>∼</m:t>
+                  </m:r>
+                </m:lim>
+              </m:limLow>
               <m:r>
                 <m:rPr>
                   <m:sty m:val="p"/>
@@ -8269,16 +8309,21 @@
           </m:rPr>
           <m:t>(</m:t>
         </m:r>
-        <m:acc>
-          <m:accPr>
-            <m:chr m:val="̃"/>
-          </m:accPr>
+        <m:limLow>
           <m:e>
             <m:r>
               <m:t>x</m:t>
             </m:r>
           </m:e>
-        </m:acc>
+          <m:lim>
+            <m:r>
+              <m:rPr>
+                <m:sty m:val="p"/>
+              </m:rPr>
+              <m:t>∼</m:t>
+            </m:r>
+          </m:lim>
+        </m:limLow>
         <m:r>
           <m:rPr>
             <m:sty m:val="p"/>
@@ -8332,16 +8377,21 @@
           </m:rPr>
           <m:t>(</m:t>
         </m:r>
-        <m:acc>
-          <m:accPr>
-            <m:chr m:val="̃"/>
-          </m:accPr>
+        <m:limLow>
           <m:e>
             <m:r>
               <m:t>x</m:t>
             </m:r>
           </m:e>
-        </m:acc>
+          <m:lim>
+            <m:r>
+              <m:rPr>
+                <m:sty m:val="p"/>
+              </m:rPr>
+              <m:t>∼</m:t>
+            </m:r>
+          </m:lim>
+        </m:limLow>
         <m:r>
           <m:rPr>
             <m:sty m:val="p"/>
@@ -8371,16 +8421,21 @@
         <w:t xml:space="preserve"> </w:t>
       </w:r>
       <m:oMath>
-        <m:acc>
-          <m:accPr>
-            <m:chr m:val="̃"/>
-          </m:accPr>
+        <m:limLow>
           <m:e>
             <m:r>
               <m:t>x</m:t>
             </m:r>
           </m:e>
-        </m:acc>
+          <m:lim>
+            <m:r>
+              <m:rPr>
+                <m:sty m:val="p"/>
+              </m:rPr>
+              <m:t>∼</m:t>
+            </m:r>
+          </m:lim>
+        </m:limLow>
       </m:oMath>
       <w:r>
         <w:t xml:space="preserve"> </w:t>
@@ -8527,16 +8582,21 @@
           </m:rPr>
           <m:t>(</m:t>
         </m:r>
-        <m:acc>
-          <m:accPr>
-            <m:chr m:val="̃"/>
-          </m:accPr>
+        <m:limLow>
           <m:e>
             <m:r>
               <m:t>x</m:t>
             </m:r>
           </m:e>
-        </m:acc>
+          <m:lim>
+            <m:r>
+              <m:rPr>
+                <m:sty m:val="p"/>
+              </m:rPr>
+              <m:t>∼</m:t>
+            </m:r>
+          </m:lim>
+        </m:limLow>
         <m:r>
           <m:rPr>
             <m:sty m:val="p"/>
@@ -8607,16 +8667,21 @@
             </m:r>
           </m:e>
           <m:sub>
-            <m:acc>
-              <m:accPr>
-                <m:chr m:val="̃"/>
-              </m:accPr>
+            <m:limLow>
               <m:e>
                 <m:r>
                   <m:t>β</m:t>
                 </m:r>
               </m:e>
-            </m:acc>
+              <m:lim>
+                <m:r>
+                  <m:rPr>
+                    <m:sty m:val="p"/>
+                  </m:rPr>
+                  <m:t>∼</m:t>
+                </m:r>
+              </m:lim>
+            </m:limLow>
           </m:sub>
         </m:sSub>
       </m:oMath>

</xml_diff>

<commit_message>
Deploying to gh-pages from @ Morrison-Lab/mds@9f3dad8fb721301f384b17495163826b4ea7e916 🚀
</commit_message>
<xml_diff>
--- a/functions.docx
+++ b/functions.docx
@@ -15,7 +15,7 @@
         <w:pStyle w:val="Date"/>
       </w:pPr>
       <w:r>
-        <w:t xml:space="preserve">Last modified: 2026-10-16 18:32:13 (PDT)</w:t>
+        <w:t xml:space="preserve">Last modified: 2026-10-16 19:32:00 (PDT)</w:t>
       </w:r>
     </w:p>
     <w:p>
@@ -71,7 +71,7 @@
         <w:t xml:space="preserve">page.</w:t>
       </w:r>
     </w:p>
-    <w:bookmarkStart w:id="48" w:name="functions"/>
+    <w:bookmarkStart w:id="55" w:name="functions"/>
     <w:p>
       <w:pPr>
         <w:pStyle w:val="Heading2"/>
@@ -9627,7 +9627,7 @@
       </w:r>
     </w:p>
     <w:bookmarkEnd w:id="42"/>
-    <w:bookmarkStart w:id="44" w:name="def-sequence"/>
+    <w:bookmarkStart w:id="43" w:name="def-operator"/>
     <w:p>
       <w:pPr>
         <w:pStyle w:val="FirstParagraph"/>
@@ -9637,13 +9637,13 @@
           <w:b/>
           <w:bCs/>
         </w:rPr>
-        <w:t xml:space="preserve">Definition 15 (Sequence)</w:t>
-      </w:r>
-      <w:r>
-        <w:t xml:space="preserve"> </w:t>
-      </w:r>
-      <w:r>
-        <w:t xml:space="preserve">A</w:t>
+        <w:t xml:space="preserve">Definition 15 (Operator)</w:t>
+      </w:r>
+      <w:r>
+        <w:t xml:space="preserve"> </w:t>
+      </w:r>
+      <w:r>
+        <w:t xml:space="preserve">An</w:t>
       </w:r>
       <w:r>
         <w:t xml:space="preserve"> </w:t>
@@ -9653,22 +9653,8 @@
           <w:b/>
           <w:bCs/>
         </w:rPr>
-        <w:t xml:space="preserve">sequence</w:t>
-      </w:r>
-      <w:r>
-        <w:t xml:space="preserve"> </w:t>
-      </w:r>
-      <w:r>
-        <w:t xml:space="preserve">in a set</w:t>
-      </w:r>
-      <w:r>
-        <w:t xml:space="preserve"> </w:t>
-      </w:r>
-      <m:oMath>
-        <m:r>
-          <m:t>S</m:t>
-        </m:r>
-      </m:oMath>
+        <w:t xml:space="preserve">operator</w:t>
+      </w:r>
       <w:r>
         <w:t xml:space="preserve"> </w:t>
       </w:r>
@@ -9689,234 +9675,46 @@
       <w:r>
         <w:t xml:space="preserve"> </w:t>
       </w:r>
-      <m:oMath>
-        <m:r>
-          <m:t>a</m:t>
-        </m:r>
-        <m:r>
-          <m:rPr>
-            <m:sty m:val="p"/>
-          </m:rPr>
-          <m:t>:</m:t>
-        </m:r>
-        <m:r>
-          <m:rPr>
-            <m:scr m:val="double-struck"/>
-            <m:sty m:val="p"/>
-          </m:rPr>
-          <m:t>N</m:t>
-        </m:r>
-        <m:r>
-          <m:rPr>
-            <m:sty m:val="p"/>
-          </m:rPr>
-          <m:t>→</m:t>
-        </m:r>
-        <m:r>
-          <m:t>S</m:t>
-        </m:r>
-      </m:oMath>
-      <w:r>
-        <w:t xml:space="preserve"> </w:t>
-      </w:r>
-      <w:r>
-        <w:t xml:space="preserve">from the</w:t>
-      </w:r>
-      <w:r>
-        <w:t xml:space="preserve"> </w:t>
-      </w:r>
-      <w:hyperlink r:id="rId43">
+      <w:r>
+        <w:t xml:space="preserve">whose</w:t>
+      </w:r>
+      <w:r>
+        <w:t xml:space="preserve"> </w:t>
+      </w:r>
+      <w:hyperlink w:anchor="def-argument">
         <w:r>
           <w:rPr>
             <w:rStyle w:val="Hyperlink"/>
           </w:rPr>
-          <w:t xml:space="preserve">natural numbers</w:t>
+          <w:t xml:space="preserve">arguments</w:t>
         </w:r>
       </w:hyperlink>
       <w:r>
         <w:t xml:space="preserve"> </w:t>
       </w:r>
       <w:r>
-        <w:t xml:space="preserve">to</w:t>
-      </w:r>
-      <w:r>
-        <w:t xml:space="preserve"> </w:t>
-      </w:r>
-      <m:oMath>
-        <m:r>
-          <m:t>S</m:t>
-        </m:r>
-      </m:oMath>
-      <w:r>
-        <w:t xml:space="preserve">.</w:t>
-      </w:r>
-      <w:r>
-        <w:t xml:space="preserve"> </w:t>
-      </w:r>
-      <w:r>
-        <w:t xml:space="preserve">Its value</w:t>
-      </w:r>
-      <w:r>
-        <w:t xml:space="preserve"> </w:t>
-      </w:r>
-      <m:oMath>
-        <m:r>
-          <m:t>a</m:t>
-        </m:r>
-        <m:r>
-          <m:rPr>
-            <m:sty m:val="p"/>
-          </m:rPr>
-          <m:t>(</m:t>
-        </m:r>
-        <m:r>
-          <m:t>n</m:t>
-        </m:r>
-        <m:r>
-          <m:rPr>
-            <m:sty m:val="p"/>
-          </m:rPr>
-          <m:t>)</m:t>
-        </m:r>
-      </m:oMath>
-      <w:r>
-        <w:t xml:space="preserve"> </w:t>
-      </w:r>
-      <w:r>
-        <w:t xml:space="preserve">is written</w:t>
-      </w:r>
-      <w:r>
-        <w:t xml:space="preserve"> </w:t>
-      </w:r>
-      <m:oMath>
-        <m:sSub>
-          <m:e>
-            <m:r>
-              <m:t>a</m:t>
-            </m:r>
-          </m:e>
-          <m:sub>
-            <m:r>
-              <m:t>n</m:t>
-            </m:r>
-          </m:sub>
-        </m:sSub>
-      </m:oMath>
-      <w:r>
-        <w:t xml:space="preserve">,</w:t>
-      </w:r>
-      <w:r>
-        <w:t xml:space="preserve"> </w:t>
-      </w:r>
-      <w:r>
-        <w:t xml:space="preserve">and the sequence is written</w:t>
-      </w:r>
-      <w:r>
-        <w:t xml:space="preserve"> </w:t>
-      </w:r>
-      <m:oMath>
-        <m:r>
-          <m:rPr>
-            <m:sty m:val="p"/>
-          </m:rPr>
-          <m:t>(</m:t>
-        </m:r>
-        <m:sSub>
-          <m:e>
-            <m:r>
-              <m:t>a</m:t>
-            </m:r>
-          </m:e>
-          <m:sub>
-            <m:r>
-              <m:t>n</m:t>
-            </m:r>
-          </m:sub>
-        </m:sSub>
-        <m:r>
-          <m:rPr>
-            <m:sty m:val="p"/>
-          </m:rPr>
-          <m:t>)</m:t>
-        </m:r>
-      </m:oMath>
-      <w:r>
-        <w:t xml:space="preserve"> </w:t>
-      </w:r>
-      <w:r>
-        <w:t xml:space="preserve">or</w:t>
-      </w:r>
-      <w:r>
-        <w:t xml:space="preserve"> </w:t>
-      </w:r>
-      <m:oMath>
-        <m:sSub>
-          <m:e>
-            <m:r>
-              <m:t>a</m:t>
-            </m:r>
-          </m:e>
-          <m:sub>
-            <m:r>
-              <m:t>1</m:t>
-            </m:r>
-          </m:sub>
-        </m:sSub>
-        <m:r>
-          <m:rPr>
-            <m:sty m:val="p"/>
-          </m:rPr>
-          <m:t>,</m:t>
-        </m:r>
-        <m:sSub>
-          <m:e>
-            <m:r>
-              <m:t>a</m:t>
-            </m:r>
-          </m:e>
-          <m:sub>
-            <m:r>
-              <m:t>2</m:t>
-            </m:r>
-          </m:sub>
-        </m:sSub>
-        <m:r>
-          <m:rPr>
-            <m:sty m:val="p"/>
-          </m:rPr>
-          <m:t>,</m:t>
-        </m:r>
-        <m:sSub>
-          <m:e>
-            <m:r>
-              <m:t>a</m:t>
-            </m:r>
-          </m:e>
-          <m:sub>
-            <m:r>
-              <m:t>3</m:t>
-            </m:r>
-          </m:sub>
-        </m:sSub>
-        <m:r>
-          <m:rPr>
-            <m:sty m:val="p"/>
-          </m:rPr>
-          <m:t>,</m:t>
-        </m:r>
-        <m:r>
-          <m:rPr>
-            <m:sty m:val="p"/>
-          </m:rPr>
-          <m:t>…</m:t>
-        </m:r>
-      </m:oMath>
-      <w:r>
-        <w:t xml:space="preserve">.</w:t>
+        <w:t xml:space="preserve">and</w:t>
+      </w:r>
+      <w:r>
+        <w:t xml:space="preserve"> </w:t>
+      </w:r>
+      <w:hyperlink w:anchor="def-value">
+        <w:r>
+          <w:rPr>
+            <w:rStyle w:val="Hyperlink"/>
+          </w:rPr>
+          <w:t xml:space="preserve">values</w:t>
+        </w:r>
+      </w:hyperlink>
+      <w:r>
+        <w:t xml:space="preserve"> </w:t>
+      </w:r>
+      <w:r>
+        <w:t xml:space="preserve">are both functions or both vectors.</w:t>
       </w:r>
     </w:p>
-    <w:bookmarkEnd w:id="44"/>
-    <w:bookmarkStart w:id="45" w:name="def-sequence-term"/>
+    <w:bookmarkEnd w:id="43"/>
+    <w:bookmarkStart w:id="44" w:name="exm-operator"/>
     <w:p>
       <w:pPr>
         <w:pStyle w:val="BodyText"/>
@@ -9926,110 +9724,394 @@
           <w:b/>
           <w:bCs/>
         </w:rPr>
-        <w:t xml:space="preserve">Definition 16 (Term of a sequence)</w:t>
-      </w:r>
-      <w:r>
-        <w:t xml:space="preserve"> </w:t>
-      </w:r>
-      <w:r>
-        <w:t xml:space="preserve">The value</w:t>
-      </w:r>
-      <w:r>
-        <w:t xml:space="preserve"> </w:t>
-      </w:r>
-      <m:oMath>
-        <m:sSub>
+        <w:t xml:space="preserve">Example 11 (The derivative as an operator)</w:t>
+      </w:r>
+      <w:r>
+        <w:t xml:space="preserve"> </w:t>
+      </w:r>
+      <w:r>
+        <w:t xml:space="preserve">Let</w:t>
+      </w:r>
+      <w:r>
+        <w:t xml:space="preserve"> </w:t>
+      </w:r>
+      <m:oMath>
+        <m:r>
+          <m:t>D</m:t>
+        </m:r>
+      </m:oMath>
+      <w:r>
+        <w:t xml:space="preserve"> </w:t>
+      </w:r>
+      <w:r>
+        <w:t xml:space="preserve">send each differentiable function</w:t>
+      </w:r>
+      <w:r>
+        <w:t xml:space="preserve"> </w:t>
+      </w:r>
+      <m:oMath>
+        <m:r>
+          <m:t>f</m:t>
+        </m:r>
+        <m:r>
+          <m:rPr>
+            <m:sty m:val="p"/>
+          </m:rPr>
+          <m:t>:</m:t>
+        </m:r>
+        <m:r>
+          <m:rPr>
+            <m:scr m:val="double-struck"/>
+            <m:sty m:val="p"/>
+          </m:rPr>
+          <m:t>R</m:t>
+        </m:r>
+        <m:r>
+          <m:rPr>
+            <m:sty m:val="p"/>
+          </m:rPr>
+          <m:t>→</m:t>
+        </m:r>
+        <m:r>
+          <m:rPr>
+            <m:scr m:val="double-struck"/>
+            <m:sty m:val="p"/>
+          </m:rPr>
+          <m:t>R</m:t>
+        </m:r>
+      </m:oMath>
+      <w:r>
+        <w:t xml:space="preserve"> </w:t>
+      </w:r>
+      <w:r>
+        <w:t xml:space="preserve">to its derivative function</w:t>
+      </w:r>
+      <w:r>
+        <w:t xml:space="preserve"> </w:t>
+      </w:r>
+      <m:oMath>
+        <m:r>
+          <m:t>D</m:t>
+        </m:r>
+        <m:r>
+          <m:t>f</m:t>
+        </m:r>
+        <m:r>
+          <m:rPr>
+            <m:sty m:val="p"/>
+          </m:rPr>
+          <m:t>=</m:t>
+        </m:r>
+        <m:sSup>
           <m:e>
             <m:r>
-              <m:t>a</m:t>
+              <m:t>f</m:t>
             </m:r>
           </m:e>
-          <m:sub>
-            <m:r>
-              <m:t>n</m:t>
-            </m:r>
-          </m:sub>
-        </m:sSub>
-      </m:oMath>
-      <w:r>
-        <w:t xml:space="preserve"> </w:t>
-      </w:r>
-      <w:r>
-        <w:t xml:space="preserve">of a sequence</w:t>
-      </w:r>
-      <w:r>
-        <w:t xml:space="preserve"> </w:t>
-      </w:r>
-      <m:oMath>
+          <m:sup>
+            <m:r>
+              <m:rPr>
+                <m:sty m:val="p"/>
+              </m:rPr>
+              <m:t>′</m:t>
+            </m:r>
+          </m:sup>
+        </m:sSup>
+      </m:oMath>
+      <w:r>
+        <w:t xml:space="preserve">.</w:t>
+      </w:r>
+      <w:r>
+        <w:t xml:space="preserve"> </w:t>
+      </w:r>
+      <w:r>
+        <w:t xml:space="preserve">Then</w:t>
+      </w:r>
+      <w:r>
+        <w:t xml:space="preserve"> </w:t>
+      </w:r>
+      <m:oMath>
+        <m:r>
+          <m:t>D</m:t>
+        </m:r>
+      </m:oMath>
+      <w:r>
+        <w:t xml:space="preserve"> </w:t>
+      </w:r>
+      <w:r>
+        <w:t xml:space="preserve">is an operator, because its arguments and its values are functions.</w:t>
+      </w:r>
+      <w:r>
+        <w:t xml:space="preserve"> </w:t>
+      </w:r>
+      <w:r>
+        <w:t xml:space="preserve">For example,</w:t>
+      </w:r>
+      <w:r>
+        <w:t xml:space="preserve"> </w:t>
+      </w:r>
+      <m:oMath>
+        <m:r>
+          <m:t>D</m:t>
+        </m:r>
+      </m:oMath>
+      <w:r>
+        <w:t xml:space="preserve"> </w:t>
+      </w:r>
+      <w:r>
+        <w:t xml:space="preserve">sends</w:t>
+      </w:r>
+      <w:r>
+        <w:t xml:space="preserve"> </w:t>
+      </w:r>
+      <m:oMath>
+        <m:r>
+          <m:t>f</m:t>
+        </m:r>
         <m:r>
           <m:rPr>
             <m:sty m:val="p"/>
           </m:rPr>
           <m:t>(</m:t>
         </m:r>
-        <m:sSub>
+        <m:r>
+          <m:t>x</m:t>
+        </m:r>
+        <m:r>
+          <m:rPr>
+            <m:sty m:val="p"/>
+          </m:rPr>
+          <m:t>)</m:t>
+        </m:r>
+        <m:r>
+          <m:rPr>
+            <m:sty m:val="p"/>
+          </m:rPr>
+          <m:t>=</m:t>
+        </m:r>
+        <m:sSup>
           <m:e>
             <m:r>
-              <m:t>a</m:t>
+              <m:t>x</m:t>
             </m:r>
           </m:e>
-          <m:sub>
-            <m:r>
-              <m:t>n</m:t>
-            </m:r>
-          </m:sub>
-        </m:sSub>
+          <m:sup>
+            <m:r>
+              <m:t>2</m:t>
+            </m:r>
+          </m:sup>
+        </m:sSup>
+      </m:oMath>
+      <w:r>
+        <w:t xml:space="preserve"> </w:t>
+      </w:r>
+      <w:r>
+        <w:t xml:space="preserve">to the function</w:t>
+      </w:r>
+      <w:r>
+        <w:t xml:space="preserve"> </w:t>
+      </w:r>
+      <m:oMath>
+        <m:r>
+          <m:rPr>
+            <m:sty m:val="p"/>
+          </m:rPr>
+          <m:t>(</m:t>
+        </m:r>
+        <m:r>
+          <m:t>D</m:t>
+        </m:r>
+        <m:r>
+          <m:t>f</m:t>
+        </m:r>
         <m:r>
           <m:rPr>
             <m:sty m:val="p"/>
           </m:rPr>
           <m:t>)</m:t>
         </m:r>
-      </m:oMath>
-      <w:r>
-        <w:t xml:space="preserve"> </w:t>
-      </w:r>
-      <w:r>
-        <w:t xml:space="preserve">(</w:t>
-      </w:r>
-      <w:hyperlink w:anchor="def-sequence">
+        <m:r>
+          <m:rPr>
+            <m:sty m:val="p"/>
+          </m:rPr>
+          <m:t>(</m:t>
+        </m:r>
+        <m:r>
+          <m:t>x</m:t>
+        </m:r>
+        <m:r>
+          <m:rPr>
+            <m:sty m:val="p"/>
+          </m:rPr>
+          <m:t>)</m:t>
+        </m:r>
+        <m:r>
+          <m:rPr>
+            <m:sty m:val="p"/>
+          </m:rPr>
+          <m:t>=</m:t>
+        </m:r>
+        <m:r>
+          <m:t>2</m:t>
+        </m:r>
+        <m:r>
+          <m:t>x</m:t>
+        </m:r>
+      </m:oMath>
+      <w:r>
+        <w:t xml:space="preserve">.</w:t>
+      </w:r>
+    </w:p>
+    <w:bookmarkEnd w:id="44"/>
+    <w:bookmarkStart w:id="46" w:name="rem-operator"/>
+    <w:p>
+      <w:pPr>
+        <w:pStyle w:val="BodyText"/>
+      </w:pPr>
+      <w:r>
+        <w:rPr>
+          <w:i/>
+          <w:iCs/>
+        </w:rPr>
+        <w:t xml:space="preserve">Remark 6</w:t>
+      </w:r>
+      <w:r>
+        <w:t xml:space="preserve"> (Other uses of</w:t>
+      </w:r>
+      <w:r>
+        <w:t xml:space="preserve"> </w:t>
+      </w:r>
+      <w:r>
+        <w:t xml:space="preserve">“operator”</w:t>
+      </w:r>
+      <w:r>
+        <w:t xml:space="preserve">). </w:t>
+      </w:r>
+      <w:r>
+        <w:t xml:space="preserve">Some authors call every function an operator,</w:t>
+      </w:r>
+      <w:r>
+        <w:t xml:space="preserve"> </w:t>
+      </w:r>
+      <w:r>
+        <w:t xml:space="preserve">and others reserve the word for functions whose domain and codomain are the same set,</w:t>
+      </w:r>
+      <w:r>
+        <w:t xml:space="preserve"> </w:t>
+      </w:r>
+      <w:r>
+        <w:t xml:space="preserve">as in the</w:t>
+      </w:r>
+      <w:r>
+        <w:t xml:space="preserve"> </w:t>
+      </w:r>
+      <w:hyperlink r:id="rId45">
         <w:r>
           <w:rPr>
             <w:rStyle w:val="Hyperlink"/>
           </w:rPr>
-          <w:t xml:space="preserve">Definition 15</w:t>
+          <w:t xml:space="preserve">linear operator</w:t>
         </w:r>
       </w:hyperlink>
       <w:r>
-        <w:t xml:space="preserve">) is called its</w:t>
-      </w:r>
-      <w:r>
-        <w:t xml:space="preserve"> </w:t>
-      </w:r>
-      <m:oMath>
-        <m:r>
-          <m:t>n</m:t>
-        </m:r>
-      </m:oMath>
-      <w:r>
-        <w:t xml:space="preserve">th</w:t>
-      </w:r>
-      <w:r>
-        <w:t xml:space="preserve"> </w:t>
-      </w:r>
+        <w:t xml:space="preserve">.</w:t>
+      </w:r>
+    </w:p>
+    <w:bookmarkEnd w:id="46"/>
+    <w:bookmarkStart w:id="47" w:name="def-functional"/>
+    <w:p>
+      <w:pPr>
+        <w:pStyle w:val="BodyText"/>
+      </w:pPr>
       <w:r>
         <w:rPr>
           <w:b/>
           <w:bCs/>
         </w:rPr>
-        <w:t xml:space="preserve">term</w:t>
-      </w:r>
-      <w:r>
-        <w:t xml:space="preserve">.</w:t>
+        <w:t xml:space="preserve">Definition 16 (Functional)</w:t>
+      </w:r>
+      <w:r>
+        <w:t xml:space="preserve"> </w:t>
+      </w:r>
+      <w:r>
+        <w:t xml:space="preserve">A</w:t>
+      </w:r>
+      <w:r>
+        <w:t xml:space="preserve"> </w:t>
+      </w:r>
+      <w:r>
+        <w:rPr>
+          <w:b/>
+          <w:bCs/>
+        </w:rPr>
+        <w:t xml:space="preserve">functional</w:t>
+      </w:r>
+      <w:r>
+        <w:t xml:space="preserve"> </w:t>
+      </w:r>
+      <w:r>
+        <w:t xml:space="preserve">is a</w:t>
+      </w:r>
+      <w:r>
+        <w:t xml:space="preserve"> </w:t>
+      </w:r>
+      <w:hyperlink w:anchor="def-function">
+        <w:r>
+          <w:rPr>
+            <w:rStyle w:val="Hyperlink"/>
+          </w:rPr>
+          <w:t xml:space="preserve">function</w:t>
+        </w:r>
+      </w:hyperlink>
+      <w:r>
+        <w:t xml:space="preserve"> </w:t>
+      </w:r>
+      <w:r>
+        <w:t xml:space="preserve">whose</w:t>
+      </w:r>
+      <w:r>
+        <w:t xml:space="preserve"> </w:t>
+      </w:r>
+      <w:hyperlink w:anchor="def-argument">
+        <w:r>
+          <w:rPr>
+            <w:rStyle w:val="Hyperlink"/>
+          </w:rPr>
+          <w:t xml:space="preserve">arguments</w:t>
+        </w:r>
+      </w:hyperlink>
+      <w:r>
+        <w:t xml:space="preserve"> </w:t>
+      </w:r>
+      <w:r>
+        <w:t xml:space="preserve">are functions or vectors</w:t>
+      </w:r>
+      <w:r>
+        <w:t xml:space="preserve"> </w:t>
+      </w:r>
+      <w:r>
+        <w:t xml:space="preserve">and whose</w:t>
+      </w:r>
+      <w:r>
+        <w:t xml:space="preserve"> </w:t>
+      </w:r>
+      <w:hyperlink w:anchor="def-value">
+        <w:r>
+          <w:rPr>
+            <w:rStyle w:val="Hyperlink"/>
+          </w:rPr>
+          <w:t xml:space="preserve">values</w:t>
+        </w:r>
+      </w:hyperlink>
+      <w:r>
+        <w:t xml:space="preserve"> </w:t>
+      </w:r>
+      <w:r>
+        <w:t xml:space="preserve">are real numbers.</w:t>
       </w:r>
     </w:p>
-    <w:bookmarkEnd w:id="45"/>
-    <w:bookmarkStart w:id="46" w:name="exm-sequence"/>
+    <w:bookmarkEnd w:id="47"/>
+    <w:bookmarkStart w:id="49" w:name="exm-functional"/>
     <w:p>
       <w:pPr>
         <w:pStyle w:val="BodyText"/>
@@ -10039,7 +10121,7 @@
           <w:b/>
           <w:bCs/>
         </w:rPr>
-        <w:t xml:space="preserve">Example 11 (Sequences)</w:t>
+        <w:t xml:space="preserve">Example 12 (Evaluation, integration and expectation as functionals)</w:t>
       </w:r>
       <w:r>
         <w:t xml:space="preserve"> </w:t>
@@ -10056,176 +10138,85 @@
           <w:numId w:val="1009"/>
         </w:numPr>
       </w:pPr>
-      <m:oMath>
-        <m:sSub>
-          <m:e>
-            <m:r>
-              <m:t>a</m:t>
-            </m:r>
-          </m:e>
-          <m:sub>
-            <m:r>
-              <m:t>n</m:t>
-            </m:r>
-          </m:sub>
-        </m:sSub>
-        <m:r>
-          <m:rPr>
-            <m:sty m:val="p"/>
-          </m:rPr>
-          <m:t>=</m:t>
-        </m:r>
-        <m:f>
-          <m:fPr>
-            <m:type m:val="bar"/>
-          </m:fPr>
-          <m:num>
-            <m:r>
-              <m:t>1</m:t>
-            </m:r>
-          </m:num>
-          <m:den>
-            <m:r>
-              <m:t>n</m:t>
-            </m:r>
-          </m:den>
-        </m:f>
-      </m:oMath>
-      <w:r>
-        <w:t xml:space="preserve"> </w:t>
-      </w:r>
-      <w:r>
-        <w:t xml:space="preserve">is the sequence</w:t>
-      </w:r>
-      <w:r>
-        <w:t xml:space="preserve"> </w:t>
-      </w:r>
-      <m:oMath>
-        <m:r>
-          <m:t>1</m:t>
-        </m:r>
-        <m:r>
-          <m:rPr>
-            <m:sty m:val="p"/>
-          </m:rPr>
-          <m:t>,</m:t>
-        </m:r>
-        <m:f>
-          <m:fPr>
-            <m:type m:val="bar"/>
-          </m:fPr>
-          <m:num>
-            <m:r>
-              <m:t>1</m:t>
-            </m:r>
-          </m:num>
-          <m:den>
-            <m:r>
-              <m:t>2</m:t>
-            </m:r>
-          </m:den>
-        </m:f>
-        <m:r>
-          <m:rPr>
-            <m:sty m:val="p"/>
-          </m:rPr>
-          <m:t>,</m:t>
-        </m:r>
-        <m:f>
-          <m:fPr>
-            <m:type m:val="bar"/>
-          </m:fPr>
-          <m:num>
-            <m:r>
-              <m:t>1</m:t>
-            </m:r>
-          </m:num>
-          <m:den>
-            <m:r>
-              <m:t>3</m:t>
-            </m:r>
-          </m:den>
-        </m:f>
-        <m:r>
-          <m:rPr>
-            <m:sty m:val="p"/>
-          </m:rPr>
-          <m:t>,</m:t>
-        </m:r>
-        <m:f>
-          <m:fPr>
-            <m:type m:val="bar"/>
-          </m:fPr>
-          <m:num>
-            <m:r>
-              <m:t>1</m:t>
-            </m:r>
-          </m:num>
-          <m:den>
-            <m:r>
-              <m:t>4</m:t>
-            </m:r>
-          </m:den>
-        </m:f>
-        <m:r>
-          <m:rPr>
-            <m:sty m:val="p"/>
-          </m:rPr>
-          <m:t>,</m:t>
-        </m:r>
-        <m:r>
-          <m:rPr>
-            <m:sty m:val="p"/>
-          </m:rPr>
-          <m:t>…</m:t>
-        </m:r>
-      </m:oMath>
-      <w:r>
-        <w:t xml:space="preserve">;</w:t>
-      </w:r>
-      <w:r>
-        <w:t xml:space="preserve"> </w:t>
-      </w:r>
-      <w:r>
-        <w:t xml:space="preserve">its third term is</w:t>
-      </w:r>
-      <w:r>
-        <w:t xml:space="preserve"> </w:t>
-      </w:r>
-      <m:oMath>
-        <m:sSub>
-          <m:e>
-            <m:r>
-              <m:t>a</m:t>
-            </m:r>
-          </m:e>
-          <m:sub>
-            <m:r>
-              <m:t>3</m:t>
-            </m:r>
-          </m:sub>
-        </m:sSub>
-        <m:r>
-          <m:rPr>
-            <m:sty m:val="p"/>
-          </m:rPr>
-          <m:t>=</m:t>
-        </m:r>
-        <m:f>
-          <m:fPr>
-            <m:type m:val="bar"/>
-          </m:fPr>
-          <m:num>
-            <m:r>
-              <m:t>1</m:t>
-            </m:r>
-          </m:num>
-          <m:den>
-            <m:r>
-              <m:t>3</m:t>
-            </m:r>
-          </m:den>
-        </m:f>
+      <w:r>
+        <w:t xml:space="preserve">Evaluation at</w:t>
+      </w:r>
+      <w:r>
+        <w:t xml:space="preserve"> </w:t>
+      </w:r>
+      <m:oMath>
+        <m:r>
+          <m:t>0</m:t>
+        </m:r>
+      </m:oMath>
+      <w:r>
+        <w:t xml:space="preserve"> </w:t>
+      </w:r>
+      <w:r>
+        <w:t xml:space="preserve">sends each function</w:t>
+      </w:r>
+      <w:r>
+        <w:t xml:space="preserve"> </w:t>
+      </w:r>
+      <m:oMath>
+        <m:r>
+          <m:t>f</m:t>
+        </m:r>
+        <m:r>
+          <m:rPr>
+            <m:sty m:val="p"/>
+          </m:rPr>
+          <m:t>:</m:t>
+        </m:r>
+        <m:r>
+          <m:rPr>
+            <m:scr m:val="double-struck"/>
+            <m:sty m:val="p"/>
+          </m:rPr>
+          <m:t>R</m:t>
+        </m:r>
+        <m:r>
+          <m:rPr>
+            <m:sty m:val="p"/>
+          </m:rPr>
+          <m:t>→</m:t>
+        </m:r>
+        <m:r>
+          <m:rPr>
+            <m:scr m:val="double-struck"/>
+            <m:sty m:val="p"/>
+          </m:rPr>
+          <m:t>R</m:t>
+        </m:r>
+      </m:oMath>
+      <w:r>
+        <w:t xml:space="preserve"> </w:t>
+      </w:r>
+      <w:r>
+        <w:t xml:space="preserve">to the number</w:t>
+      </w:r>
+      <w:r>
+        <w:t xml:space="preserve"> </w:t>
+      </w:r>
+      <m:oMath>
+        <m:r>
+          <m:t>f</m:t>
+        </m:r>
+        <m:r>
+          <m:rPr>
+            <m:sty m:val="p"/>
+          </m:rPr>
+          <m:t>(</m:t>
+        </m:r>
+        <m:r>
+          <m:t>0</m:t>
+        </m:r>
+        <m:r>
+          <m:rPr>
+            <m:sty m:val="p"/>
+          </m:rPr>
+          <m:t>)</m:t>
+        </m:r>
       </m:oMath>
       <w:r>
         <w:t xml:space="preserve">.</w:t>
@@ -10239,129 +10230,193 @@
           <w:numId w:val="1009"/>
         </w:numPr>
       </w:pPr>
-      <m:oMath>
-        <m:sSub>
+      <w:r>
+        <w:t xml:space="preserve">The definite integral sends each continuous function</w:t>
+      </w:r>
+      <w:r>
+        <w:t xml:space="preserve"> </w:t>
+      </w:r>
+      <m:oMath>
+        <m:r>
+          <m:t>f</m:t>
+        </m:r>
+        <m:r>
+          <m:rPr>
+            <m:sty m:val="p"/>
+          </m:rPr>
+          <m:t>:</m:t>
+        </m:r>
+        <m:r>
+          <m:rPr>
+            <m:sty m:val="p"/>
+          </m:rPr>
+          <m:t>[</m:t>
+        </m:r>
+        <m:r>
+          <m:t>0</m:t>
+        </m:r>
+        <m:r>
+          <m:rPr>
+            <m:sty m:val="p"/>
+          </m:rPr>
+          <m:t>,</m:t>
+        </m:r>
+        <m:r>
+          <m:t>1</m:t>
+        </m:r>
+        <m:r>
+          <m:rPr>
+            <m:sty m:val="p"/>
+          </m:rPr>
+          <m:t>]</m:t>
+        </m:r>
+        <m:r>
+          <m:rPr>
+            <m:sty m:val="p"/>
+          </m:rPr>
+          <m:t>→</m:t>
+        </m:r>
+        <m:r>
+          <m:rPr>
+            <m:scr m:val="double-struck"/>
+            <m:sty m:val="p"/>
+          </m:rPr>
+          <m:t>R</m:t>
+        </m:r>
+      </m:oMath>
+      <w:r>
+        <w:t xml:space="preserve"> </w:t>
+      </w:r>
+      <w:r>
+        <w:t xml:space="preserve">to the number</w:t>
+      </w:r>
+      <w:r>
+        <w:t xml:space="preserve"> </w:t>
+      </w:r>
+      <m:oMath>
+        <m:nary>
+          <m:naryPr>
+            <m:chr m:val="∫"/>
+            <m:limLoc m:val="subSup"/>
+            <m:subHide m:val="off"/>
+            <m:supHide m:val="off"/>
+          </m:naryPr>
+          <m:sub>
+            <m:r>
+              <m:t>0</m:t>
+            </m:r>
+          </m:sub>
+          <m:sup>
+            <m:r>
+              <m:t>1</m:t>
+            </m:r>
+          </m:sup>
           <m:e>
             <m:r>
-              <m:t>b</m:t>
+              <m:t>f</m:t>
             </m:r>
           </m:e>
-          <m:sub>
-            <m:r>
-              <m:t>n</m:t>
-            </m:r>
-          </m:sub>
-        </m:sSub>
+        </m:nary>
+        <m:r>
+          <m:rPr>
+            <m:sty m:val="p"/>
+          </m:rPr>
+          <m:t>(</m:t>
+        </m:r>
+        <m:r>
+          <m:t>x</m:t>
+        </m:r>
+        <m:r>
+          <m:rPr>
+            <m:sty m:val="p"/>
+          </m:rPr>
+          <m:t>)</m:t>
+        </m:r>
+        <m:r>
+          <m:t> </m:t>
+        </m:r>
+        <m:r>
+          <m:t>d</m:t>
+        </m:r>
+        <m:r>
+          <m:t>x</m:t>
+        </m:r>
+      </m:oMath>
+      <w:r>
+        <w:t xml:space="preserve">.</w:t>
+      </w:r>
+      <w:r>
+        <w:t xml:space="preserve"> </w:t>
+      </w:r>
+      <w:r>
+        <w:t xml:space="preserve">For</w:t>
+      </w:r>
+      <w:r>
+        <w:t xml:space="preserve"> </w:t>
+      </w:r>
+      <m:oMath>
+        <m:r>
+          <m:t>f</m:t>
+        </m:r>
+        <m:r>
+          <m:rPr>
+            <m:sty m:val="p"/>
+          </m:rPr>
+          <m:t>(</m:t>
+        </m:r>
+        <m:r>
+          <m:t>x</m:t>
+        </m:r>
+        <m:r>
+          <m:rPr>
+            <m:sty m:val="p"/>
+          </m:rPr>
+          <m:t>)</m:t>
+        </m:r>
         <m:r>
           <m:rPr>
             <m:sty m:val="p"/>
           </m:rPr>
           <m:t>=</m:t>
-        </m:r>
-        <m:r>
-          <m:rPr>
-            <m:sty m:val="p"/>
-          </m:rPr>
-          <m:t>(</m:t>
-        </m:r>
-        <m:r>
-          <m:rPr>
-            <m:sty m:val="p"/>
-          </m:rPr>
-          <m:t>−</m:t>
-        </m:r>
-        <m:r>
-          <m:t>1</m:t>
         </m:r>
         <m:sSup>
           <m:e>
             <m:r>
-              <m:rPr>
-                <m:sty m:val="p"/>
-              </m:rPr>
-              <m:t>)</m:t>
+              <m:t>x</m:t>
             </m:r>
           </m:e>
           <m:sup>
             <m:r>
-              <m:t>n</m:t>
+              <m:t>2</m:t>
             </m:r>
           </m:sup>
         </m:sSup>
       </m:oMath>
       <w:r>
-        <w:t xml:space="preserve"> </w:t>
-      </w:r>
-      <w:r>
-        <w:t xml:space="preserve">is the sequence</w:t>
-      </w:r>
-      <w:r>
-        <w:t xml:space="preserve"> </w:t>
-      </w:r>
-      <m:oMath>
-        <m:r>
-          <m:rPr>
-            <m:sty m:val="p"/>
-          </m:rPr>
-          <m:t>−</m:t>
-        </m:r>
-        <m:r>
-          <m:t>1</m:t>
-        </m:r>
-        <m:r>
-          <m:rPr>
-            <m:sty m:val="p"/>
-          </m:rPr>
-          <m:t>,</m:t>
-        </m:r>
-        <m:r>
-          <m:t>1</m:t>
-        </m:r>
-        <m:r>
-          <m:rPr>
-            <m:sty m:val="p"/>
-          </m:rPr>
-          <m:t>,</m:t>
-        </m:r>
-        <m:r>
-          <m:rPr>
-            <m:sty m:val="p"/>
-          </m:rPr>
-          <m:t>−</m:t>
-        </m:r>
-        <m:r>
-          <m:t>1</m:t>
-        </m:r>
-        <m:r>
-          <m:rPr>
-            <m:sty m:val="p"/>
-          </m:rPr>
-          <m:t>,</m:t>
-        </m:r>
-        <m:r>
-          <m:t>1</m:t>
-        </m:r>
-        <m:r>
-          <m:rPr>
-            <m:sty m:val="p"/>
-          </m:rPr>
-          <m:t>,</m:t>
-        </m:r>
-        <m:r>
-          <m:rPr>
-            <m:sty m:val="p"/>
-          </m:rPr>
-          <m:t>…</m:t>
-        </m:r>
-      </m:oMath>
-      <w:r>
-        <w:t xml:space="preserve">:</w:t>
-      </w:r>
-      <w:r>
-        <w:t xml:space="preserve"> </w:t>
-      </w:r>
-      <w:r>
-        <w:t xml:space="preserve">a sequence can repeat values.</w:t>
+        <w:t xml:space="preserve">, the value is</w:t>
+      </w:r>
+      <w:r>
+        <w:t xml:space="preserve"> </w:t>
+      </w:r>
+      <m:oMath>
+        <m:f>
+          <m:fPr>
+            <m:type m:val="bar"/>
+          </m:fPr>
+          <m:num>
+            <m:r>
+              <m:t>1</m:t>
+            </m:r>
+          </m:num>
+          <m:den>
+            <m:r>
+              <m:t>3</m:t>
+            </m:r>
+          </m:den>
+        </m:f>
+      </m:oMath>
+      <w:r>
+        <w:t xml:space="preserve">.</w:t>
       </w:r>
     </w:p>
     <w:p>
@@ -10373,6 +10428,931 @@
         </w:numPr>
       </w:pPr>
       <w:r>
+        <w:t xml:space="preserve">The</w:t>
+      </w:r>
+      <w:r>
+        <w:t xml:space="preserve"> </w:t>
+      </w:r>
+      <w:hyperlink r:id="rId48">
+        <w:r>
+          <w:rPr>
+            <w:rStyle w:val="Hyperlink"/>
+          </w:rPr>
+          <w:t xml:space="preserve">expectation</w:t>
+        </w:r>
+      </w:hyperlink>
+      <w:r>
+        <w:t xml:space="preserve"> </w:t>
+      </w:r>
+      <w:r>
+        <w:t xml:space="preserve">sends each random variable, which is a function,</w:t>
+      </w:r>
+      <w:r>
+        <w:t xml:space="preserve"> </w:t>
+      </w:r>
+      <w:r>
+        <w:t xml:space="preserve">to a real number, its population mean.</w:t>
+      </w:r>
+    </w:p>
+    <w:p>
+      <w:pPr>
+        <w:pStyle w:val="Compact"/>
+        <w:numPr>
+          <w:ilvl w:val="0"/>
+          <w:numId w:val="1009"/>
+        </w:numPr>
+      </w:pPr>
+      <w:r>
+        <w:t xml:space="preserve">Summing the entries sends each vector</w:t>
+      </w:r>
+      <w:r>
+        <w:t xml:space="preserve"> </w:t>
+      </w:r>
+      <m:oMath>
+        <m:limLow>
+          <m:e>
+            <m:r>
+              <m:t>x</m:t>
+            </m:r>
+          </m:e>
+          <m:lim>
+            <m:r>
+              <m:rPr>
+                <m:sty m:val="p"/>
+              </m:rPr>
+              <m:t>∼</m:t>
+            </m:r>
+          </m:lim>
+        </m:limLow>
+        <m:r>
+          <m:rPr>
+            <m:sty m:val="p"/>
+          </m:rPr>
+          <m:t>∈</m:t>
+        </m:r>
+        <m:sSup>
+          <m:e>
+            <m:r>
+              <m:rPr>
+                <m:scr m:val="double-struck"/>
+                <m:sty m:val="p"/>
+              </m:rPr>
+              <m:t>R</m:t>
+            </m:r>
+          </m:e>
+          <m:sup>
+            <m:r>
+              <m:t>n</m:t>
+            </m:r>
+          </m:sup>
+        </m:sSup>
+      </m:oMath>
+      <w:r>
+        <w:t xml:space="preserve"> </w:t>
+      </w:r>
+      <w:r>
+        <w:t xml:space="preserve">to the number</w:t>
+      </w:r>
+      <w:r>
+        <w:t xml:space="preserve"> </w:t>
+      </w:r>
+      <m:oMath>
+        <m:nary>
+          <m:naryPr>
+            <m:chr m:val="∑"/>
+            <m:limLoc m:val="undOvr"/>
+            <m:subHide m:val="off"/>
+            <m:supHide m:val="off"/>
+          </m:naryPr>
+          <m:sub>
+            <m:r>
+              <m:t>i</m:t>
+            </m:r>
+            <m:r>
+              <m:rPr>
+                <m:sty m:val="p"/>
+              </m:rPr>
+              <m:t>=</m:t>
+            </m:r>
+            <m:r>
+              <m:t>1</m:t>
+            </m:r>
+          </m:sub>
+          <m:sup>
+            <m:r>
+              <m:t>n</m:t>
+            </m:r>
+          </m:sup>
+          <m:e>
+            <m:sSub>
+              <m:e>
+                <m:r>
+                  <m:t>x</m:t>
+                </m:r>
+              </m:e>
+              <m:sub>
+                <m:r>
+                  <m:t>i</m:t>
+                </m:r>
+              </m:sub>
+            </m:sSub>
+          </m:e>
+        </m:nary>
+      </m:oMath>
+      <w:r>
+        <w:t xml:space="preserve">.</w:t>
+      </w:r>
+    </w:p>
+    <w:p>
+      <w:pPr>
+        <w:pStyle w:val="FirstParagraph"/>
+      </w:pPr>
+      <w:r>
+        <w:t xml:space="preserve">Each takes a function or a vector as its argument and returns a number,</w:t>
+      </w:r>
+      <w:r>
+        <w:t xml:space="preserve"> </w:t>
+      </w:r>
+      <w:r>
+        <w:t xml:space="preserve">so each is a functional.</w:t>
+      </w:r>
+      <w:r>
+        <w:t xml:space="preserve"> </w:t>
+      </w:r>
+      <w:r>
+        <w:t xml:space="preserve">The derivative operator in</w:t>
+      </w:r>
+      <w:r>
+        <w:t xml:space="preserve"> </w:t>
+      </w:r>
+      <w:hyperlink w:anchor="exm-operator">
+        <w:r>
+          <w:rPr>
+            <w:rStyle w:val="Hyperlink"/>
+          </w:rPr>
+          <w:t xml:space="preserve">Example 11</w:t>
+        </w:r>
+      </w:hyperlink>
+      <w:r>
+        <w:t xml:space="preserve"> </w:t>
+      </w:r>
+      <w:r>
+        <w:t xml:space="preserve">is not a functional,</w:t>
+      </w:r>
+      <w:r>
+        <w:t xml:space="preserve"> </w:t>
+      </w:r>
+      <w:r>
+        <w:t xml:space="preserve">because its values are functions, not numbers.</w:t>
+      </w:r>
+    </w:p>
+    <w:bookmarkEnd w:id="49"/>
+    <w:bookmarkStart w:id="51" w:name="def-sequence"/>
+    <w:p>
+      <w:pPr>
+        <w:pStyle w:val="BodyText"/>
+      </w:pPr>
+      <w:r>
+        <w:rPr>
+          <w:b/>
+          <w:bCs/>
+        </w:rPr>
+        <w:t xml:space="preserve">Definition 17 (Sequence)</w:t>
+      </w:r>
+      <w:r>
+        <w:t xml:space="preserve"> </w:t>
+      </w:r>
+      <w:r>
+        <w:t xml:space="preserve">A</w:t>
+      </w:r>
+      <w:r>
+        <w:t xml:space="preserve"> </w:t>
+      </w:r>
+      <w:r>
+        <w:rPr>
+          <w:b/>
+          <w:bCs/>
+        </w:rPr>
+        <w:t xml:space="preserve">sequence</w:t>
+      </w:r>
+      <w:r>
+        <w:t xml:space="preserve"> </w:t>
+      </w:r>
+      <w:r>
+        <w:t xml:space="preserve">in a set</w:t>
+      </w:r>
+      <w:r>
+        <w:t xml:space="preserve"> </w:t>
+      </w:r>
+      <m:oMath>
+        <m:r>
+          <m:t>S</m:t>
+        </m:r>
+      </m:oMath>
+      <w:r>
+        <w:t xml:space="preserve"> </w:t>
+      </w:r>
+      <w:r>
+        <w:t xml:space="preserve">is a</w:t>
+      </w:r>
+      <w:r>
+        <w:t xml:space="preserve"> </w:t>
+      </w:r>
+      <w:hyperlink w:anchor="def-function">
+        <w:r>
+          <w:rPr>
+            <w:rStyle w:val="Hyperlink"/>
+          </w:rPr>
+          <w:t xml:space="preserve">function</w:t>
+        </w:r>
+      </w:hyperlink>
+      <w:r>
+        <w:t xml:space="preserve"> </w:t>
+      </w:r>
+      <m:oMath>
+        <m:r>
+          <m:t>a</m:t>
+        </m:r>
+        <m:r>
+          <m:rPr>
+            <m:sty m:val="p"/>
+          </m:rPr>
+          <m:t>:</m:t>
+        </m:r>
+        <m:r>
+          <m:rPr>
+            <m:scr m:val="double-struck"/>
+            <m:sty m:val="p"/>
+          </m:rPr>
+          <m:t>N</m:t>
+        </m:r>
+        <m:r>
+          <m:rPr>
+            <m:sty m:val="p"/>
+          </m:rPr>
+          <m:t>→</m:t>
+        </m:r>
+        <m:r>
+          <m:t>S</m:t>
+        </m:r>
+      </m:oMath>
+      <w:r>
+        <w:t xml:space="preserve"> </w:t>
+      </w:r>
+      <w:r>
+        <w:t xml:space="preserve">from the</w:t>
+      </w:r>
+      <w:r>
+        <w:t xml:space="preserve"> </w:t>
+      </w:r>
+      <w:hyperlink r:id="rId50">
+        <w:r>
+          <w:rPr>
+            <w:rStyle w:val="Hyperlink"/>
+          </w:rPr>
+          <w:t xml:space="preserve">natural numbers</w:t>
+        </w:r>
+      </w:hyperlink>
+      <w:r>
+        <w:t xml:space="preserve"> </w:t>
+      </w:r>
+      <w:r>
+        <w:t xml:space="preserve">to</w:t>
+      </w:r>
+      <w:r>
+        <w:t xml:space="preserve"> </w:t>
+      </w:r>
+      <m:oMath>
+        <m:r>
+          <m:t>S</m:t>
+        </m:r>
+      </m:oMath>
+      <w:r>
+        <w:t xml:space="preserve">.</w:t>
+      </w:r>
+      <w:r>
+        <w:t xml:space="preserve"> </w:t>
+      </w:r>
+      <w:r>
+        <w:t xml:space="preserve">Its value</w:t>
+      </w:r>
+      <w:r>
+        <w:t xml:space="preserve"> </w:t>
+      </w:r>
+      <m:oMath>
+        <m:r>
+          <m:t>a</m:t>
+        </m:r>
+        <m:r>
+          <m:rPr>
+            <m:sty m:val="p"/>
+          </m:rPr>
+          <m:t>(</m:t>
+        </m:r>
+        <m:r>
+          <m:t>n</m:t>
+        </m:r>
+        <m:r>
+          <m:rPr>
+            <m:sty m:val="p"/>
+          </m:rPr>
+          <m:t>)</m:t>
+        </m:r>
+      </m:oMath>
+      <w:r>
+        <w:t xml:space="preserve"> </w:t>
+      </w:r>
+      <w:r>
+        <w:t xml:space="preserve">is written</w:t>
+      </w:r>
+      <w:r>
+        <w:t xml:space="preserve"> </w:t>
+      </w:r>
+      <m:oMath>
+        <m:sSub>
+          <m:e>
+            <m:r>
+              <m:t>a</m:t>
+            </m:r>
+          </m:e>
+          <m:sub>
+            <m:r>
+              <m:t>n</m:t>
+            </m:r>
+          </m:sub>
+        </m:sSub>
+      </m:oMath>
+      <w:r>
+        <w:t xml:space="preserve">,</w:t>
+      </w:r>
+      <w:r>
+        <w:t xml:space="preserve"> </w:t>
+      </w:r>
+      <w:r>
+        <w:t xml:space="preserve">and the sequence is written</w:t>
+      </w:r>
+      <w:r>
+        <w:t xml:space="preserve"> </w:t>
+      </w:r>
+      <m:oMath>
+        <m:r>
+          <m:rPr>
+            <m:sty m:val="p"/>
+          </m:rPr>
+          <m:t>(</m:t>
+        </m:r>
+        <m:sSub>
+          <m:e>
+            <m:r>
+              <m:t>a</m:t>
+            </m:r>
+          </m:e>
+          <m:sub>
+            <m:r>
+              <m:t>n</m:t>
+            </m:r>
+          </m:sub>
+        </m:sSub>
+        <m:r>
+          <m:rPr>
+            <m:sty m:val="p"/>
+          </m:rPr>
+          <m:t>)</m:t>
+        </m:r>
+      </m:oMath>
+      <w:r>
+        <w:t xml:space="preserve"> </w:t>
+      </w:r>
+      <w:r>
+        <w:t xml:space="preserve">or</w:t>
+      </w:r>
+      <w:r>
+        <w:t xml:space="preserve"> </w:t>
+      </w:r>
+      <m:oMath>
+        <m:sSub>
+          <m:e>
+            <m:r>
+              <m:t>a</m:t>
+            </m:r>
+          </m:e>
+          <m:sub>
+            <m:r>
+              <m:t>1</m:t>
+            </m:r>
+          </m:sub>
+        </m:sSub>
+        <m:r>
+          <m:rPr>
+            <m:sty m:val="p"/>
+          </m:rPr>
+          <m:t>,</m:t>
+        </m:r>
+        <m:sSub>
+          <m:e>
+            <m:r>
+              <m:t>a</m:t>
+            </m:r>
+          </m:e>
+          <m:sub>
+            <m:r>
+              <m:t>2</m:t>
+            </m:r>
+          </m:sub>
+        </m:sSub>
+        <m:r>
+          <m:rPr>
+            <m:sty m:val="p"/>
+          </m:rPr>
+          <m:t>,</m:t>
+        </m:r>
+        <m:sSub>
+          <m:e>
+            <m:r>
+              <m:t>a</m:t>
+            </m:r>
+          </m:e>
+          <m:sub>
+            <m:r>
+              <m:t>3</m:t>
+            </m:r>
+          </m:sub>
+        </m:sSub>
+        <m:r>
+          <m:rPr>
+            <m:sty m:val="p"/>
+          </m:rPr>
+          <m:t>,</m:t>
+        </m:r>
+        <m:r>
+          <m:rPr>
+            <m:sty m:val="p"/>
+          </m:rPr>
+          <m:t>…</m:t>
+        </m:r>
+      </m:oMath>
+      <w:r>
+        <w:t xml:space="preserve">.</w:t>
+      </w:r>
+    </w:p>
+    <w:bookmarkEnd w:id="51"/>
+    <w:bookmarkStart w:id="52" w:name="def-sequence-term"/>
+    <w:p>
+      <w:pPr>
+        <w:pStyle w:val="BodyText"/>
+      </w:pPr>
+      <w:r>
+        <w:rPr>
+          <w:b/>
+          <w:bCs/>
+        </w:rPr>
+        <w:t xml:space="preserve">Definition 18 (Term of a sequence)</w:t>
+      </w:r>
+      <w:r>
+        <w:t xml:space="preserve"> </w:t>
+      </w:r>
+      <w:r>
+        <w:t xml:space="preserve">The value</w:t>
+      </w:r>
+      <w:r>
+        <w:t xml:space="preserve"> </w:t>
+      </w:r>
+      <m:oMath>
+        <m:sSub>
+          <m:e>
+            <m:r>
+              <m:t>a</m:t>
+            </m:r>
+          </m:e>
+          <m:sub>
+            <m:r>
+              <m:t>n</m:t>
+            </m:r>
+          </m:sub>
+        </m:sSub>
+      </m:oMath>
+      <w:r>
+        <w:t xml:space="preserve"> </w:t>
+      </w:r>
+      <w:r>
+        <w:t xml:space="preserve">of a sequence</w:t>
+      </w:r>
+      <w:r>
+        <w:t xml:space="preserve"> </w:t>
+      </w:r>
+      <m:oMath>
+        <m:r>
+          <m:rPr>
+            <m:sty m:val="p"/>
+          </m:rPr>
+          <m:t>(</m:t>
+        </m:r>
+        <m:sSub>
+          <m:e>
+            <m:r>
+              <m:t>a</m:t>
+            </m:r>
+          </m:e>
+          <m:sub>
+            <m:r>
+              <m:t>n</m:t>
+            </m:r>
+          </m:sub>
+        </m:sSub>
+        <m:r>
+          <m:rPr>
+            <m:sty m:val="p"/>
+          </m:rPr>
+          <m:t>)</m:t>
+        </m:r>
+      </m:oMath>
+      <w:r>
+        <w:t xml:space="preserve"> </w:t>
+      </w:r>
+      <w:r>
+        <w:t xml:space="preserve">(</w:t>
+      </w:r>
+      <w:hyperlink w:anchor="def-sequence">
+        <w:r>
+          <w:rPr>
+            <w:rStyle w:val="Hyperlink"/>
+          </w:rPr>
+          <w:t xml:space="preserve">Definition 17</w:t>
+        </w:r>
+      </w:hyperlink>
+      <w:r>
+        <w:t xml:space="preserve">) is called its</w:t>
+      </w:r>
+      <w:r>
+        <w:t xml:space="preserve"> </w:t>
+      </w:r>
+      <m:oMath>
+        <m:r>
+          <m:t>n</m:t>
+        </m:r>
+      </m:oMath>
+      <w:r>
+        <w:t xml:space="preserve">th</w:t>
+      </w:r>
+      <w:r>
+        <w:t xml:space="preserve"> </w:t>
+      </w:r>
+      <w:r>
+        <w:rPr>
+          <w:b/>
+          <w:bCs/>
+        </w:rPr>
+        <w:t xml:space="preserve">term</w:t>
+      </w:r>
+      <w:r>
+        <w:t xml:space="preserve">.</w:t>
+      </w:r>
+    </w:p>
+    <w:bookmarkEnd w:id="52"/>
+    <w:bookmarkStart w:id="53" w:name="exm-sequence"/>
+    <w:p>
+      <w:pPr>
+        <w:pStyle w:val="BodyText"/>
+      </w:pPr>
+      <w:r>
+        <w:rPr>
+          <w:b/>
+          <w:bCs/>
+        </w:rPr>
+        <w:t xml:space="preserve">Example 13 (Sequences)</w:t>
+      </w:r>
+      <w:r>
+        <w:t xml:space="preserve"> </w:t>
+      </w:r>
+      <w:r>
+        <w:t xml:space="preserve"> </w:t>
+      </w:r>
+    </w:p>
+    <w:p>
+      <w:pPr>
+        <w:pStyle w:val="Compact"/>
+        <w:numPr>
+          <w:ilvl w:val="0"/>
+          <w:numId w:val="1010"/>
+        </w:numPr>
+      </w:pPr>
+      <m:oMath>
+        <m:sSub>
+          <m:e>
+            <m:r>
+              <m:t>a</m:t>
+            </m:r>
+          </m:e>
+          <m:sub>
+            <m:r>
+              <m:t>n</m:t>
+            </m:r>
+          </m:sub>
+        </m:sSub>
+        <m:r>
+          <m:rPr>
+            <m:sty m:val="p"/>
+          </m:rPr>
+          <m:t>=</m:t>
+        </m:r>
+        <m:f>
+          <m:fPr>
+            <m:type m:val="bar"/>
+          </m:fPr>
+          <m:num>
+            <m:r>
+              <m:t>1</m:t>
+            </m:r>
+          </m:num>
+          <m:den>
+            <m:r>
+              <m:t>n</m:t>
+            </m:r>
+          </m:den>
+        </m:f>
+      </m:oMath>
+      <w:r>
+        <w:t xml:space="preserve"> </w:t>
+      </w:r>
+      <w:r>
+        <w:t xml:space="preserve">is the sequence</w:t>
+      </w:r>
+      <w:r>
+        <w:t xml:space="preserve"> </w:t>
+      </w:r>
+      <m:oMath>
+        <m:r>
+          <m:t>1</m:t>
+        </m:r>
+        <m:r>
+          <m:rPr>
+            <m:sty m:val="p"/>
+          </m:rPr>
+          <m:t>,</m:t>
+        </m:r>
+        <m:f>
+          <m:fPr>
+            <m:type m:val="bar"/>
+          </m:fPr>
+          <m:num>
+            <m:r>
+              <m:t>1</m:t>
+            </m:r>
+          </m:num>
+          <m:den>
+            <m:r>
+              <m:t>2</m:t>
+            </m:r>
+          </m:den>
+        </m:f>
+        <m:r>
+          <m:rPr>
+            <m:sty m:val="p"/>
+          </m:rPr>
+          <m:t>,</m:t>
+        </m:r>
+        <m:f>
+          <m:fPr>
+            <m:type m:val="bar"/>
+          </m:fPr>
+          <m:num>
+            <m:r>
+              <m:t>1</m:t>
+            </m:r>
+          </m:num>
+          <m:den>
+            <m:r>
+              <m:t>3</m:t>
+            </m:r>
+          </m:den>
+        </m:f>
+        <m:r>
+          <m:rPr>
+            <m:sty m:val="p"/>
+          </m:rPr>
+          <m:t>,</m:t>
+        </m:r>
+        <m:f>
+          <m:fPr>
+            <m:type m:val="bar"/>
+          </m:fPr>
+          <m:num>
+            <m:r>
+              <m:t>1</m:t>
+            </m:r>
+          </m:num>
+          <m:den>
+            <m:r>
+              <m:t>4</m:t>
+            </m:r>
+          </m:den>
+        </m:f>
+        <m:r>
+          <m:rPr>
+            <m:sty m:val="p"/>
+          </m:rPr>
+          <m:t>,</m:t>
+        </m:r>
+        <m:r>
+          <m:rPr>
+            <m:sty m:val="p"/>
+          </m:rPr>
+          <m:t>…</m:t>
+        </m:r>
+      </m:oMath>
+      <w:r>
+        <w:t xml:space="preserve">;</w:t>
+      </w:r>
+      <w:r>
+        <w:t xml:space="preserve"> </w:t>
+      </w:r>
+      <w:r>
+        <w:t xml:space="preserve">its third term is</w:t>
+      </w:r>
+      <w:r>
+        <w:t xml:space="preserve"> </w:t>
+      </w:r>
+      <m:oMath>
+        <m:sSub>
+          <m:e>
+            <m:r>
+              <m:t>a</m:t>
+            </m:r>
+          </m:e>
+          <m:sub>
+            <m:r>
+              <m:t>3</m:t>
+            </m:r>
+          </m:sub>
+        </m:sSub>
+        <m:r>
+          <m:rPr>
+            <m:sty m:val="p"/>
+          </m:rPr>
+          <m:t>=</m:t>
+        </m:r>
+        <m:f>
+          <m:fPr>
+            <m:type m:val="bar"/>
+          </m:fPr>
+          <m:num>
+            <m:r>
+              <m:t>1</m:t>
+            </m:r>
+          </m:num>
+          <m:den>
+            <m:r>
+              <m:t>3</m:t>
+            </m:r>
+          </m:den>
+        </m:f>
+      </m:oMath>
+      <w:r>
+        <w:t xml:space="preserve">.</w:t>
+      </w:r>
+    </w:p>
+    <w:p>
+      <w:pPr>
+        <w:pStyle w:val="Compact"/>
+        <w:numPr>
+          <w:ilvl w:val="0"/>
+          <w:numId w:val="1010"/>
+        </w:numPr>
+      </w:pPr>
+      <m:oMath>
+        <m:sSub>
+          <m:e>
+            <m:r>
+              <m:t>b</m:t>
+            </m:r>
+          </m:e>
+          <m:sub>
+            <m:r>
+              <m:t>n</m:t>
+            </m:r>
+          </m:sub>
+        </m:sSub>
+        <m:r>
+          <m:rPr>
+            <m:sty m:val="p"/>
+          </m:rPr>
+          <m:t>=</m:t>
+        </m:r>
+        <m:r>
+          <m:rPr>
+            <m:sty m:val="p"/>
+          </m:rPr>
+          <m:t>(</m:t>
+        </m:r>
+        <m:r>
+          <m:rPr>
+            <m:sty m:val="p"/>
+          </m:rPr>
+          <m:t>−</m:t>
+        </m:r>
+        <m:r>
+          <m:t>1</m:t>
+        </m:r>
+        <m:sSup>
+          <m:e>
+            <m:r>
+              <m:rPr>
+                <m:sty m:val="p"/>
+              </m:rPr>
+              <m:t>)</m:t>
+            </m:r>
+          </m:e>
+          <m:sup>
+            <m:r>
+              <m:t>n</m:t>
+            </m:r>
+          </m:sup>
+        </m:sSup>
+      </m:oMath>
+      <w:r>
+        <w:t xml:space="preserve"> </w:t>
+      </w:r>
+      <w:r>
+        <w:t xml:space="preserve">is the sequence</w:t>
+      </w:r>
+      <w:r>
+        <w:t xml:space="preserve"> </w:t>
+      </w:r>
+      <m:oMath>
+        <m:r>
+          <m:rPr>
+            <m:sty m:val="p"/>
+          </m:rPr>
+          <m:t>−</m:t>
+        </m:r>
+        <m:r>
+          <m:t>1</m:t>
+        </m:r>
+        <m:r>
+          <m:rPr>
+            <m:sty m:val="p"/>
+          </m:rPr>
+          <m:t>,</m:t>
+        </m:r>
+        <m:r>
+          <m:t>1</m:t>
+        </m:r>
+        <m:r>
+          <m:rPr>
+            <m:sty m:val="p"/>
+          </m:rPr>
+          <m:t>,</m:t>
+        </m:r>
+        <m:r>
+          <m:rPr>
+            <m:sty m:val="p"/>
+          </m:rPr>
+          <m:t>−</m:t>
+        </m:r>
+        <m:r>
+          <m:t>1</m:t>
+        </m:r>
+        <m:r>
+          <m:rPr>
+            <m:sty m:val="p"/>
+          </m:rPr>
+          <m:t>,</m:t>
+        </m:r>
+        <m:r>
+          <m:t>1</m:t>
+        </m:r>
+        <m:r>
+          <m:rPr>
+            <m:sty m:val="p"/>
+          </m:rPr>
+          <m:t>,</m:t>
+        </m:r>
+        <m:r>
+          <m:rPr>
+            <m:sty m:val="p"/>
+          </m:rPr>
+          <m:t>…</m:t>
+        </m:r>
+      </m:oMath>
+      <w:r>
+        <w:t xml:space="preserve">:</w:t>
+      </w:r>
+      <w:r>
+        <w:t xml:space="preserve"> </w:t>
+      </w:r>
+      <w:r>
+        <w:t xml:space="preserve">a sequence can repeat values.</w:t>
+      </w:r>
+    </w:p>
+    <w:p>
+      <w:pPr>
+        <w:pStyle w:val="Compact"/>
+        <w:numPr>
+          <w:ilvl w:val="0"/>
+          <w:numId w:val="1010"/>
+        </w:numPr>
+      </w:pPr>
+      <w:r>
         <w:t xml:space="preserve">The die rolls</w:t>
       </w:r>
       <w:r>
@@ -10603,8 +11583,8 @@
         <w:t xml:space="preserve">but as a sequence, the order and the repeats matter.</w:t>
       </w:r>
     </w:p>
-    <w:bookmarkEnd w:id="46"/>
-    <w:bookmarkStart w:id="47" w:name="def-finite-sequence"/>
+    <w:bookmarkEnd w:id="53"/>
+    <w:bookmarkStart w:id="54" w:name="def-finite-sequence"/>
     <w:p>
       <w:pPr>
         <w:pStyle w:val="FirstParagraph"/>
@@ -10614,7 +11594,7 @@
           <w:b/>
           <w:bCs/>
         </w:rPr>
-        <w:t xml:space="preserve">Definition 17 (Finite sequence)</w:t>
+        <w:t xml:space="preserve">Definition 19 (Finite sequence)</w:t>
       </w:r>
       <w:r>
         <w:t xml:space="preserve"> </w:t>
@@ -10791,9 +11771,9 @@
         <w:t xml:space="preserve">.</w:t>
       </w:r>
     </w:p>
-    <w:bookmarkEnd w:id="47"/>
-    <w:bookmarkEnd w:id="48"/>
-    <w:bookmarkStart w:id="66" w:name="countable-sets"/>
+    <w:bookmarkEnd w:id="54"/>
+    <w:bookmarkEnd w:id="55"/>
+    <w:bookmarkStart w:id="73" w:name="countable-sets"/>
     <w:p>
       <w:pPr>
         <w:pStyle w:val="Heading2"/>
@@ -10802,7 +11782,7 @@
         <w:t xml:space="preserve">2 Countable sets</w:t>
       </w:r>
     </w:p>
-    <w:bookmarkStart w:id="49" w:name="def-finite-set"/>
+    <w:bookmarkStart w:id="56" w:name="def-finite-set"/>
     <w:p>
       <w:pPr>
         <w:pStyle w:val="FirstParagraph"/>
@@ -10812,7 +11792,7 @@
           <w:b/>
           <w:bCs/>
         </w:rPr>
-        <w:t xml:space="preserve">Definition 18 (Finite set)</w:t>
+        <w:t xml:space="preserve">Definition 20 (Finite set)</w:t>
       </w:r>
       <w:r>
         <w:t xml:space="preserve"> </w:t>
@@ -10878,7 +11858,7 @@
           <w:rPr>
             <w:rStyle w:val="Hyperlink"/>
           </w:rPr>
-          <w:t xml:space="preserve">Definition 17</w:t>
+          <w:t xml:space="preserve">Definition 19</w:t>
         </w:r>
       </w:hyperlink>
       <w:r>
@@ -10952,8 +11932,8 @@
         <w:t xml:space="preserve">appears exactly once.</w:t>
       </w:r>
     </w:p>
-    <w:bookmarkEnd w:id="49"/>
-    <w:bookmarkStart w:id="50" w:name="def-cardinality"/>
+    <w:bookmarkEnd w:id="56"/>
+    <w:bookmarkStart w:id="57" w:name="def-cardinality"/>
     <w:p>
       <w:pPr>
         <w:pStyle w:val="BodyText"/>
@@ -10963,7 +11943,7 @@
           <w:b/>
           <w:bCs/>
         </w:rPr>
-        <w:t xml:space="preserve">Definition 19 (Cardinality)</w:t>
+        <w:t xml:space="preserve">Definition 21 (Cardinality)</w:t>
       </w:r>
       <w:r>
         <w:t xml:space="preserve"> </w:t>
@@ -10990,7 +11970,7 @@
           <w:rPr>
             <w:rStyle w:val="Hyperlink"/>
           </w:rPr>
-          <w:t xml:space="preserve">Definition 18</w:t>
+          <w:t xml:space="preserve">Definition 20</w:t>
         </w:r>
       </w:hyperlink>
       <w:r>
@@ -11122,8 +12102,8 @@
         <w:t xml:space="preserve">.</w:t>
       </w:r>
     </w:p>
-    <w:bookmarkEnd w:id="50"/>
-    <w:bookmarkStart w:id="53" w:name="rem-cardinality-bars"/>
+    <w:bookmarkEnd w:id="57"/>
+    <w:bookmarkStart w:id="60" w:name="rem-cardinality-bars"/>
     <w:p>
       <w:pPr>
         <w:pStyle w:val="BodyText"/>
@@ -11133,7 +12113,7 @@
           <w:i/>
           <w:iCs/>
         </w:rPr>
-        <w:t xml:space="preserve">Remark 6</w:t>
+        <w:t xml:space="preserve">Remark 7</w:t>
       </w:r>
       <w:r>
         <w:t xml:space="preserve"> (Two meanings of</w:t>
@@ -11251,7 +12231,7 @@
       <w:r>
         <w:t xml:space="preserve"> </w:t>
       </w:r>
-      <w:hyperlink r:id="rId51">
+      <w:hyperlink r:id="rId58">
         <w:r>
           <w:rPr>
             <w:rStyle w:val="Hyperlink"/>
@@ -11271,7 +12251,7 @@
       <w:r>
         <w:t xml:space="preserve"> </w:t>
       </w:r>
-      <w:hyperlink r:id="rId52">
+      <w:hyperlink r:id="rId59">
         <w:r>
           <w:rPr>
             <w:rStyle w:val="Hyperlink"/>
@@ -11406,8 +12386,8 @@
         <w:t xml:space="preserve">.</w:t>
       </w:r>
     </w:p>
-    <w:bookmarkEnd w:id="53"/>
-    <w:bookmarkStart w:id="54" w:name="exm-finite-set"/>
+    <w:bookmarkEnd w:id="60"/>
+    <w:bookmarkStart w:id="61" w:name="exm-finite-set"/>
     <w:p>
       <w:pPr>
         <w:pStyle w:val="BodyText"/>
@@ -11417,7 +12397,7 @@
           <w:b/>
           <w:bCs/>
         </w:rPr>
-        <w:t xml:space="preserve">Example 12 (Finite and infinite sets)</w:t>
+        <w:t xml:space="preserve">Example 14 (Finite and infinite sets)</w:t>
       </w:r>
       <w:r>
         <w:t xml:space="preserve"> </w:t>
@@ -11431,7 +12411,7 @@
         <w:pStyle w:val="Compact"/>
         <w:numPr>
           <w:ilvl w:val="0"/>
-          <w:numId w:val="1010"/>
+          <w:numId w:val="1011"/>
         </w:numPr>
       </w:pPr>
       <m:oMath>
@@ -11555,7 +12535,7 @@
         <w:pStyle w:val="Compact"/>
         <w:numPr>
           <w:ilvl w:val="0"/>
-          <w:numId w:val="1010"/>
+          <w:numId w:val="1011"/>
         </w:numPr>
       </w:pPr>
       <m:oMath>
@@ -11716,7 +12696,7 @@
         <w:pStyle w:val="Compact"/>
         <w:numPr>
           <w:ilvl w:val="0"/>
-          <w:numId w:val="1010"/>
+          <w:numId w:val="1011"/>
         </w:numPr>
       </w:pPr>
       <m:oMath>
@@ -11771,484 +12751,6 @@
       </m:oMath>
       <w:r>
         <w:t xml:space="preserve">.</w:t>
-      </w:r>
-    </w:p>
-    <w:p>
-      <w:pPr>
-        <w:pStyle w:val="Compact"/>
-        <w:numPr>
-          <w:ilvl w:val="0"/>
-          <w:numId w:val="1010"/>
-        </w:numPr>
-      </w:pPr>
-      <w:r>
-        <w:t xml:space="preserve">The natural numbers</w:t>
-      </w:r>
-      <w:r>
-        <w:t xml:space="preserve"> </w:t>
-      </w:r>
-      <m:oMath>
-        <m:r>
-          <m:rPr>
-            <m:scr m:val="double-struck"/>
-            <m:sty m:val="p"/>
-          </m:rPr>
-          <m:t>N</m:t>
-        </m:r>
-        <m:r>
-          <m:rPr>
-            <m:sty m:val="p"/>
-          </m:rPr>
-          <m:t>=</m:t>
-        </m:r>
-        <m:r>
-          <m:t>​</m:t>
-        </m:r>
-        <m:d>
-          <m:dPr>
-            <m:begChr m:val="{"/>
-            <m:sepChr m:val=""/>
-            <m:endChr m:val="}"/>
-            <m:grow/>
-          </m:dPr>
-          <m:e>
-            <m:r>
-              <m:t>1</m:t>
-            </m:r>
-            <m:r>
-              <m:rPr>
-                <m:sty m:val="p"/>
-              </m:rPr>
-              <m:t>,</m:t>
-            </m:r>
-            <m:r>
-              <m:t>2</m:t>
-            </m:r>
-            <m:r>
-              <m:rPr>
-                <m:sty m:val="p"/>
-              </m:rPr>
-              <m:t>,</m:t>
-            </m:r>
-            <m:r>
-              <m:t>3</m:t>
-            </m:r>
-            <m:r>
-              <m:rPr>
-                <m:sty m:val="p"/>
-              </m:rPr>
-              <m:t>,</m:t>
-            </m:r>
-            <m:r>
-              <m:rPr>
-                <m:sty m:val="p"/>
-              </m:rPr>
-              <m:t>…</m:t>
-            </m:r>
-          </m:e>
-        </m:d>
-        <m:r>
-          <m:t>​</m:t>
-        </m:r>
-      </m:oMath>
-      <w:r>
-        <w:t xml:space="preserve"> </w:t>
-      </w:r>
-      <w:r>
-        <w:t xml:space="preserve">are infinite:</w:t>
-      </w:r>
-      <w:r>
-        <w:t xml:space="preserve"> </w:t>
-      </w:r>
-      <w:r>
-        <w:t xml:space="preserve">for any</w:t>
-      </w:r>
-      <w:r>
-        <w:t xml:space="preserve"> </w:t>
-      </w:r>
-      <m:oMath>
-        <m:r>
-          <m:t>n</m:t>
-        </m:r>
-      </m:oMath>
-      <w:r>
-        <w:t xml:space="preserve">, a list</w:t>
-      </w:r>
-      <w:r>
-        <w:t xml:space="preserve"> </w:t>
-      </w:r>
-      <m:oMath>
-        <m:sSub>
-          <m:e>
-            <m:r>
-              <m:t>a</m:t>
-            </m:r>
-          </m:e>
-          <m:sub>
-            <m:r>
-              <m:t>1</m:t>
-            </m:r>
-          </m:sub>
-        </m:sSub>
-        <m:r>
-          <m:rPr>
-            <m:sty m:val="p"/>
-          </m:rPr>
-          <m:t>,</m:t>
-        </m:r>
-        <m:r>
-          <m:rPr>
-            <m:sty m:val="p"/>
-          </m:rPr>
-          <m:t>…</m:t>
-        </m:r>
-        <m:r>
-          <m:rPr>
-            <m:sty m:val="p"/>
-          </m:rPr>
-          <m:t>,</m:t>
-        </m:r>
-        <m:sSub>
-          <m:e>
-            <m:r>
-              <m:t>a</m:t>
-            </m:r>
-          </m:e>
-          <m:sub>
-            <m:r>
-              <m:t>n</m:t>
-            </m:r>
-          </m:sub>
-        </m:sSub>
-      </m:oMath>
-      <w:r>
-        <w:t xml:space="preserve"> </w:t>
-      </w:r>
-      <w:r>
-        <w:t xml:space="preserve">of natural numbers</w:t>
-      </w:r>
-      <w:r>
-        <w:t xml:space="preserve"> </w:t>
-      </w:r>
-      <w:r>
-        <w:t xml:space="preserve">misses the natural number</w:t>
-      </w:r>
-      <w:r>
-        <w:t xml:space="preserve"> </w:t>
-      </w:r>
-      <m:oMath>
-        <m:sSub>
-          <m:e>
-            <m:r>
-              <m:t>a</m:t>
-            </m:r>
-          </m:e>
-          <m:sub>
-            <m:r>
-              <m:t>1</m:t>
-            </m:r>
-          </m:sub>
-        </m:sSub>
-        <m:r>
-          <m:rPr>
-            <m:sty m:val="p"/>
-          </m:rPr>
-          <m:t>+</m:t>
-        </m:r>
-        <m:r>
-          <m:rPr>
-            <m:sty m:val="p"/>
-          </m:rPr>
-          <m:t>⋯</m:t>
-        </m:r>
-        <m:r>
-          <m:rPr>
-            <m:sty m:val="p"/>
-          </m:rPr>
-          <m:t>+</m:t>
-        </m:r>
-        <m:sSub>
-          <m:e>
-            <m:r>
-              <m:t>a</m:t>
-            </m:r>
-          </m:e>
-          <m:sub>
-            <m:r>
-              <m:t>n</m:t>
-            </m:r>
-          </m:sub>
-        </m:sSub>
-        <m:r>
-          <m:rPr>
-            <m:sty m:val="p"/>
-          </m:rPr>
-          <m:t>+</m:t>
-        </m:r>
-        <m:r>
-          <m:t>1</m:t>
-        </m:r>
-      </m:oMath>
-      <w:r>
-        <w:t xml:space="preserve">,</w:t>
-      </w:r>
-      <w:r>
-        <w:t xml:space="preserve"> </w:t>
-      </w:r>
-      <w:r>
-        <w:t xml:space="preserve">which is larger than every number in the list.</w:t>
-      </w:r>
-    </w:p>
-    <w:bookmarkEnd w:id="54"/>
-    <w:bookmarkStart w:id="55" w:name="def-infinite-set"/>
-    <w:p>
-      <w:pPr>
-        <w:pStyle w:val="FirstParagraph"/>
-      </w:pPr>
-      <w:r>
-        <w:rPr>
-          <w:b/>
-          <w:bCs/>
-        </w:rPr>
-        <w:t xml:space="preserve">Definition 20 (Infinite set)</w:t>
-      </w:r>
-      <w:r>
-        <w:t xml:space="preserve"> </w:t>
-      </w:r>
-      <w:r>
-        <w:t xml:space="preserve">A set that is not finite (</w:t>
-      </w:r>
-      <w:hyperlink w:anchor="def-finite-set">
-        <w:r>
-          <w:rPr>
-            <w:rStyle w:val="Hyperlink"/>
-          </w:rPr>
-          <w:t xml:space="preserve">Definition 18</w:t>
-        </w:r>
-      </w:hyperlink>
-      <w:r>
-        <w:t xml:space="preserve">) is</w:t>
-      </w:r>
-      <w:r>
-        <w:t xml:space="preserve"> </w:t>
-      </w:r>
-      <w:r>
-        <w:rPr>
-          <w:b/>
-          <w:bCs/>
-        </w:rPr>
-        <w:t xml:space="preserve">infinite</w:t>
-      </w:r>
-      <w:r>
-        <w:t xml:space="preserve">.</w:t>
-      </w:r>
-    </w:p>
-    <w:bookmarkEnd w:id="55"/>
-    <w:bookmarkStart w:id="56" w:name="def-countable-set"/>
-    <w:p>
-      <w:pPr>
-        <w:pStyle w:val="BodyText"/>
-      </w:pPr>
-      <w:r>
-        <w:rPr>
-          <w:b/>
-          <w:bCs/>
-        </w:rPr>
-        <w:t xml:space="preserve">Definition 21 (Countable set)</w:t>
-      </w:r>
-      <w:r>
-        <w:t xml:space="preserve"> </w:t>
-      </w:r>
-      <w:r>
-        <w:t xml:space="preserve">A set is</w:t>
-      </w:r>
-      <w:r>
-        <w:t xml:space="preserve"> </w:t>
-      </w:r>
-      <w:r>
-        <w:rPr>
-          <w:b/>
-          <w:bCs/>
-        </w:rPr>
-        <w:t xml:space="preserve">countable</w:t>
-      </w:r>
-      <w:r>
-        <w:t xml:space="preserve"> </w:t>
-      </w:r>
-      <w:r>
-        <w:t xml:space="preserve">if it is finite (</w:t>
-      </w:r>
-      <w:hyperlink w:anchor="def-finite-set">
-        <w:r>
-          <w:rPr>
-            <w:rStyle w:val="Hyperlink"/>
-          </w:rPr>
-          <w:t xml:space="preserve">Definition 18</w:t>
-        </w:r>
-      </w:hyperlink>
-      <w:r>
-        <w:t xml:space="preserve">),</w:t>
-      </w:r>
-      <w:r>
-        <w:t xml:space="preserve"> </w:t>
-      </w:r>
-      <w:r>
-        <w:t xml:space="preserve">or if its elements can be listed as a sequence (</w:t>
-      </w:r>
-      <w:hyperlink w:anchor="def-sequence">
-        <w:r>
-          <w:rPr>
-            <w:rStyle w:val="Hyperlink"/>
-          </w:rPr>
-          <w:t xml:space="preserve">Definition 15</w:t>
-        </w:r>
-      </w:hyperlink>
-      <w:r>
-        <w:t xml:space="preserve">)</w:t>
-      </w:r>
-      <w:r>
-        <w:t xml:space="preserve"> </w:t>
-      </w:r>
-      <m:oMath>
-        <m:sSub>
-          <m:e>
-            <m:r>
-              <m:t>a</m:t>
-            </m:r>
-          </m:e>
-          <m:sub>
-            <m:r>
-              <m:t>1</m:t>
-            </m:r>
-          </m:sub>
-        </m:sSub>
-        <m:r>
-          <m:rPr>
-            <m:sty m:val="p"/>
-          </m:rPr>
-          <m:t>,</m:t>
-        </m:r>
-        <m:sSub>
-          <m:e>
-            <m:r>
-              <m:t>a</m:t>
-            </m:r>
-          </m:e>
-          <m:sub>
-            <m:r>
-              <m:t>2</m:t>
-            </m:r>
-          </m:sub>
-        </m:sSub>
-        <m:r>
-          <m:rPr>
-            <m:sty m:val="p"/>
-          </m:rPr>
-          <m:t>,</m:t>
-        </m:r>
-        <m:sSub>
-          <m:e>
-            <m:r>
-              <m:t>a</m:t>
-            </m:r>
-          </m:e>
-          <m:sub>
-            <m:r>
-              <m:t>3</m:t>
-            </m:r>
-          </m:sub>
-        </m:sSub>
-        <m:r>
-          <m:rPr>
-            <m:sty m:val="p"/>
-          </m:rPr>
-          <m:t>,</m:t>
-        </m:r>
-        <m:r>
-          <m:rPr>
-            <m:sty m:val="p"/>
-          </m:rPr>
-          <m:t>…</m:t>
-        </m:r>
-      </m:oMath>
-      <w:r>
-        <w:t xml:space="preserve"> </w:t>
-      </w:r>
-      <w:r>
-        <w:t xml:space="preserve">in which every element appears.</w:t>
-      </w:r>
-    </w:p>
-    <w:bookmarkEnd w:id="56"/>
-    <w:bookmarkStart w:id="57" w:name="def-countably-infinite"/>
-    <w:p>
-      <w:pPr>
-        <w:pStyle w:val="BodyText"/>
-      </w:pPr>
-      <w:r>
-        <w:rPr>
-          <w:b/>
-          <w:bCs/>
-        </w:rPr>
-        <w:t xml:space="preserve">Definition 22 (Countably infinite set)</w:t>
-      </w:r>
-      <w:r>
-        <w:t xml:space="preserve"> </w:t>
-      </w:r>
-      <w:r>
-        <w:t xml:space="preserve">A set is</w:t>
-      </w:r>
-      <w:r>
-        <w:t xml:space="preserve"> </w:t>
-      </w:r>
-      <w:r>
-        <w:rPr>
-          <w:b/>
-          <w:bCs/>
-        </w:rPr>
-        <w:t xml:space="preserve">countably infinite</w:t>
-      </w:r>
-      <w:r>
-        <w:t xml:space="preserve"> </w:t>
-      </w:r>
-      <w:r>
-        <w:t xml:space="preserve">if it is</w:t>
-      </w:r>
-      <w:r>
-        <w:t xml:space="preserve"> </w:t>
-      </w:r>
-      <w:hyperlink w:anchor="def-countable-set">
-        <w:r>
-          <w:rPr>
-            <w:rStyle w:val="Hyperlink"/>
-          </w:rPr>
-          <w:t xml:space="preserve">countable</w:t>
-        </w:r>
-      </w:hyperlink>
-      <w:r>
-        <w:t xml:space="preserve"> </w:t>
-      </w:r>
-      <w:r>
-        <w:t xml:space="preserve">and not finite.</w:t>
-      </w:r>
-    </w:p>
-    <w:bookmarkEnd w:id="57"/>
-    <w:bookmarkStart w:id="60" w:name="exm-countable-set"/>
-    <w:p>
-      <w:pPr>
-        <w:pStyle w:val="BodyText"/>
-      </w:pPr>
-      <w:r>
-        <w:rPr>
-          <w:b/>
-          <w:bCs/>
-        </w:rPr>
-        <w:t xml:space="preserve">Example 13 (Countable and uncountable sets)</w:t>
-      </w:r>
-      <w:r>
-        <w:t xml:space="preserve"> </w:t>
-      </w:r>
-      <w:r>
-        <w:t xml:space="preserve"> </w:t>
       </w:r>
     </w:p>
     <w:p>
@@ -12259,7 +12761,26 @@
           <w:numId w:val="1011"/>
         </w:numPr>
       </w:pPr>
-      <m:oMath>
+      <w:r>
+        <w:t xml:space="preserve">The natural numbers</w:t>
+      </w:r>
+      <w:r>
+        <w:t xml:space="preserve"> </w:t>
+      </w:r>
+      <m:oMath>
+        <m:r>
+          <m:rPr>
+            <m:scr m:val="double-struck"/>
+            <m:sty m:val="p"/>
+          </m:rPr>
+          <m:t>N</m:t>
+        </m:r>
+        <m:r>
+          <m:rPr>
+            <m:sty m:val="p"/>
+          </m:rPr>
+          <m:t>=</m:t>
+        </m:r>
         <m:r>
           <m:t>​</m:t>
         </m:r>
@@ -12299,25 +12820,10 @@
               <m:t>,</m:t>
             </m:r>
             <m:r>
-              <m:t>4</m:t>
-            </m:r>
-            <m:r>
               <m:rPr>
                 <m:sty m:val="p"/>
               </m:rPr>
-              <m:t>,</m:t>
-            </m:r>
-            <m:r>
-              <m:t>5</m:t>
-            </m:r>
-            <m:r>
-              <m:rPr>
-                <m:sty m:val="p"/>
-              </m:rPr>
-              <m:t>,</m:t>
-            </m:r>
-            <m:r>
-              <m:t>6</m:t>
+              <m:t>…</m:t>
             </m:r>
           </m:e>
         </m:d>
@@ -12329,7 +12835,400 @@
         <w:t xml:space="preserve"> </w:t>
       </w:r>
       <w:r>
-        <w:t xml:space="preserve">is countable, because it is finite.</w:t>
+        <w:t xml:space="preserve">are infinite:</w:t>
+      </w:r>
+      <w:r>
+        <w:t xml:space="preserve"> </w:t>
+      </w:r>
+      <w:r>
+        <w:t xml:space="preserve">for any</w:t>
+      </w:r>
+      <w:r>
+        <w:t xml:space="preserve"> </w:t>
+      </w:r>
+      <m:oMath>
+        <m:r>
+          <m:t>n</m:t>
+        </m:r>
+      </m:oMath>
+      <w:r>
+        <w:t xml:space="preserve">, a list</w:t>
+      </w:r>
+      <w:r>
+        <w:t xml:space="preserve"> </w:t>
+      </w:r>
+      <m:oMath>
+        <m:sSub>
+          <m:e>
+            <m:r>
+              <m:t>a</m:t>
+            </m:r>
+          </m:e>
+          <m:sub>
+            <m:r>
+              <m:t>1</m:t>
+            </m:r>
+          </m:sub>
+        </m:sSub>
+        <m:r>
+          <m:rPr>
+            <m:sty m:val="p"/>
+          </m:rPr>
+          <m:t>,</m:t>
+        </m:r>
+        <m:r>
+          <m:rPr>
+            <m:sty m:val="p"/>
+          </m:rPr>
+          <m:t>…</m:t>
+        </m:r>
+        <m:r>
+          <m:rPr>
+            <m:sty m:val="p"/>
+          </m:rPr>
+          <m:t>,</m:t>
+        </m:r>
+        <m:sSub>
+          <m:e>
+            <m:r>
+              <m:t>a</m:t>
+            </m:r>
+          </m:e>
+          <m:sub>
+            <m:r>
+              <m:t>n</m:t>
+            </m:r>
+          </m:sub>
+        </m:sSub>
+      </m:oMath>
+      <w:r>
+        <w:t xml:space="preserve"> </w:t>
+      </w:r>
+      <w:r>
+        <w:t xml:space="preserve">of natural numbers</w:t>
+      </w:r>
+      <w:r>
+        <w:t xml:space="preserve"> </w:t>
+      </w:r>
+      <w:r>
+        <w:t xml:space="preserve">misses the natural number</w:t>
+      </w:r>
+      <w:r>
+        <w:t xml:space="preserve"> </w:t>
+      </w:r>
+      <m:oMath>
+        <m:sSub>
+          <m:e>
+            <m:r>
+              <m:t>a</m:t>
+            </m:r>
+          </m:e>
+          <m:sub>
+            <m:r>
+              <m:t>1</m:t>
+            </m:r>
+          </m:sub>
+        </m:sSub>
+        <m:r>
+          <m:rPr>
+            <m:sty m:val="p"/>
+          </m:rPr>
+          <m:t>+</m:t>
+        </m:r>
+        <m:r>
+          <m:rPr>
+            <m:sty m:val="p"/>
+          </m:rPr>
+          <m:t>⋯</m:t>
+        </m:r>
+        <m:r>
+          <m:rPr>
+            <m:sty m:val="p"/>
+          </m:rPr>
+          <m:t>+</m:t>
+        </m:r>
+        <m:sSub>
+          <m:e>
+            <m:r>
+              <m:t>a</m:t>
+            </m:r>
+          </m:e>
+          <m:sub>
+            <m:r>
+              <m:t>n</m:t>
+            </m:r>
+          </m:sub>
+        </m:sSub>
+        <m:r>
+          <m:rPr>
+            <m:sty m:val="p"/>
+          </m:rPr>
+          <m:t>+</m:t>
+        </m:r>
+        <m:r>
+          <m:t>1</m:t>
+        </m:r>
+      </m:oMath>
+      <w:r>
+        <w:t xml:space="preserve">,</w:t>
+      </w:r>
+      <w:r>
+        <w:t xml:space="preserve"> </w:t>
+      </w:r>
+      <w:r>
+        <w:t xml:space="preserve">which is larger than every number in the list.</w:t>
+      </w:r>
+    </w:p>
+    <w:bookmarkEnd w:id="61"/>
+    <w:bookmarkStart w:id="62" w:name="def-infinite-set"/>
+    <w:p>
+      <w:pPr>
+        <w:pStyle w:val="FirstParagraph"/>
+      </w:pPr>
+      <w:r>
+        <w:rPr>
+          <w:b/>
+          <w:bCs/>
+        </w:rPr>
+        <w:t xml:space="preserve">Definition 22 (Infinite set)</w:t>
+      </w:r>
+      <w:r>
+        <w:t xml:space="preserve"> </w:t>
+      </w:r>
+      <w:r>
+        <w:t xml:space="preserve">A set that is not finite (</w:t>
+      </w:r>
+      <w:hyperlink w:anchor="def-finite-set">
+        <w:r>
+          <w:rPr>
+            <w:rStyle w:val="Hyperlink"/>
+          </w:rPr>
+          <w:t xml:space="preserve">Definition 20</w:t>
+        </w:r>
+      </w:hyperlink>
+      <w:r>
+        <w:t xml:space="preserve">) is</w:t>
+      </w:r>
+      <w:r>
+        <w:t xml:space="preserve"> </w:t>
+      </w:r>
+      <w:r>
+        <w:rPr>
+          <w:b/>
+          <w:bCs/>
+        </w:rPr>
+        <w:t xml:space="preserve">infinite</w:t>
+      </w:r>
+      <w:r>
+        <w:t xml:space="preserve">.</w:t>
+      </w:r>
+    </w:p>
+    <w:bookmarkEnd w:id="62"/>
+    <w:bookmarkStart w:id="63" w:name="def-countable-set"/>
+    <w:p>
+      <w:pPr>
+        <w:pStyle w:val="BodyText"/>
+      </w:pPr>
+      <w:r>
+        <w:rPr>
+          <w:b/>
+          <w:bCs/>
+        </w:rPr>
+        <w:t xml:space="preserve">Definition 23 (Countable set)</w:t>
+      </w:r>
+      <w:r>
+        <w:t xml:space="preserve"> </w:t>
+      </w:r>
+      <w:r>
+        <w:t xml:space="preserve">A set is</w:t>
+      </w:r>
+      <w:r>
+        <w:t xml:space="preserve"> </w:t>
+      </w:r>
+      <w:r>
+        <w:rPr>
+          <w:b/>
+          <w:bCs/>
+        </w:rPr>
+        <w:t xml:space="preserve">countable</w:t>
+      </w:r>
+      <w:r>
+        <w:t xml:space="preserve"> </w:t>
+      </w:r>
+      <w:r>
+        <w:t xml:space="preserve">if it is finite (</w:t>
+      </w:r>
+      <w:hyperlink w:anchor="def-finite-set">
+        <w:r>
+          <w:rPr>
+            <w:rStyle w:val="Hyperlink"/>
+          </w:rPr>
+          <w:t xml:space="preserve">Definition 20</w:t>
+        </w:r>
+      </w:hyperlink>
+      <w:r>
+        <w:t xml:space="preserve">),</w:t>
+      </w:r>
+      <w:r>
+        <w:t xml:space="preserve"> </w:t>
+      </w:r>
+      <w:r>
+        <w:t xml:space="preserve">or if its elements can be listed as a sequence (</w:t>
+      </w:r>
+      <w:hyperlink w:anchor="def-sequence">
+        <w:r>
+          <w:rPr>
+            <w:rStyle w:val="Hyperlink"/>
+          </w:rPr>
+          <w:t xml:space="preserve">Definition 17</w:t>
+        </w:r>
+      </w:hyperlink>
+      <w:r>
+        <w:t xml:space="preserve">)</w:t>
+      </w:r>
+      <w:r>
+        <w:t xml:space="preserve"> </w:t>
+      </w:r>
+      <m:oMath>
+        <m:sSub>
+          <m:e>
+            <m:r>
+              <m:t>a</m:t>
+            </m:r>
+          </m:e>
+          <m:sub>
+            <m:r>
+              <m:t>1</m:t>
+            </m:r>
+          </m:sub>
+        </m:sSub>
+        <m:r>
+          <m:rPr>
+            <m:sty m:val="p"/>
+          </m:rPr>
+          <m:t>,</m:t>
+        </m:r>
+        <m:sSub>
+          <m:e>
+            <m:r>
+              <m:t>a</m:t>
+            </m:r>
+          </m:e>
+          <m:sub>
+            <m:r>
+              <m:t>2</m:t>
+            </m:r>
+          </m:sub>
+        </m:sSub>
+        <m:r>
+          <m:rPr>
+            <m:sty m:val="p"/>
+          </m:rPr>
+          <m:t>,</m:t>
+        </m:r>
+        <m:sSub>
+          <m:e>
+            <m:r>
+              <m:t>a</m:t>
+            </m:r>
+          </m:e>
+          <m:sub>
+            <m:r>
+              <m:t>3</m:t>
+            </m:r>
+          </m:sub>
+        </m:sSub>
+        <m:r>
+          <m:rPr>
+            <m:sty m:val="p"/>
+          </m:rPr>
+          <m:t>,</m:t>
+        </m:r>
+        <m:r>
+          <m:rPr>
+            <m:sty m:val="p"/>
+          </m:rPr>
+          <m:t>…</m:t>
+        </m:r>
+      </m:oMath>
+      <w:r>
+        <w:t xml:space="preserve"> </w:t>
+      </w:r>
+      <w:r>
+        <w:t xml:space="preserve">in which every element appears.</w:t>
+      </w:r>
+    </w:p>
+    <w:bookmarkEnd w:id="63"/>
+    <w:bookmarkStart w:id="64" w:name="def-countably-infinite"/>
+    <w:p>
+      <w:pPr>
+        <w:pStyle w:val="BodyText"/>
+      </w:pPr>
+      <w:r>
+        <w:rPr>
+          <w:b/>
+          <w:bCs/>
+        </w:rPr>
+        <w:t xml:space="preserve">Definition 24 (Countably infinite set)</w:t>
+      </w:r>
+      <w:r>
+        <w:t xml:space="preserve"> </w:t>
+      </w:r>
+      <w:r>
+        <w:t xml:space="preserve">A set is</w:t>
+      </w:r>
+      <w:r>
+        <w:t xml:space="preserve"> </w:t>
+      </w:r>
+      <w:r>
+        <w:rPr>
+          <w:b/>
+          <w:bCs/>
+        </w:rPr>
+        <w:t xml:space="preserve">countably infinite</w:t>
+      </w:r>
+      <w:r>
+        <w:t xml:space="preserve"> </w:t>
+      </w:r>
+      <w:r>
+        <w:t xml:space="preserve">if it is</w:t>
+      </w:r>
+      <w:r>
+        <w:t xml:space="preserve"> </w:t>
+      </w:r>
+      <w:hyperlink w:anchor="def-countable-set">
+        <w:r>
+          <w:rPr>
+            <w:rStyle w:val="Hyperlink"/>
+          </w:rPr>
+          <w:t xml:space="preserve">countable</w:t>
+        </w:r>
+      </w:hyperlink>
+      <w:r>
+        <w:t xml:space="preserve"> </w:t>
+      </w:r>
+      <w:r>
+        <w:t xml:space="preserve">and not finite.</w:t>
+      </w:r>
+    </w:p>
+    <w:bookmarkEnd w:id="64"/>
+    <w:bookmarkStart w:id="67" w:name="exm-countable-set"/>
+    <w:p>
+      <w:pPr>
+        <w:pStyle w:val="BodyText"/>
+      </w:pPr>
+      <w:r>
+        <w:rPr>
+          <w:b/>
+          <w:bCs/>
+        </w:rPr>
+        <w:t xml:space="preserve">Example 15 (Countable and uncountable sets)</w:t>
+      </w:r>
+      <w:r>
+        <w:t xml:space="preserve"> </w:t>
+      </w:r>
+      <w:r>
+        <w:t xml:space="preserve"> </w:t>
       </w:r>
     </w:p>
     <w:p>
@@ -12337,26 +13236,9 @@
         <w:pStyle w:val="Compact"/>
         <w:numPr>
           <w:ilvl w:val="0"/>
-          <w:numId w:val="1011"/>
+          <w:numId w:val="1012"/>
         </w:numPr>
       </w:pPr>
-      <w:r>
-        <w:t xml:space="preserve">The</w:t>
-      </w:r>
-      <w:r>
-        <w:t xml:space="preserve"> </w:t>
-      </w:r>
-      <w:hyperlink r:id="rId58">
-        <w:r>
-          <w:rPr>
-            <w:rStyle w:val="Hyperlink"/>
-          </w:rPr>
-          <w:t xml:space="preserve">non-negative integers</w:t>
-        </w:r>
-      </w:hyperlink>
-      <w:r>
-        <w:t xml:space="preserve"> </w:t>
-      </w:r>
       <m:oMath>
         <m:r>
           <m:t>​</m:t>
@@ -12370,7 +13252,7 @@
           </m:dPr>
           <m:e>
             <m:r>
-              <m:t>0</m:t>
+              <m:t>1</m:t>
             </m:r>
             <m:r>
               <m:rPr>
@@ -12379,7 +13261,7 @@
               <m:t>,</m:t>
             </m:r>
             <m:r>
-              <m:t>1</m:t>
+              <m:t>2</m:t>
             </m:r>
             <m:r>
               <m:rPr>
@@ -12388,7 +13270,7 @@
               <m:t>,</m:t>
             </m:r>
             <m:r>
-              <m:t>2</m:t>
+              <m:t>3</m:t>
             </m:r>
             <m:r>
               <m:rPr>
@@ -12397,10 +13279,25 @@
               <m:t>,</m:t>
             </m:r>
             <m:r>
+              <m:t>4</m:t>
+            </m:r>
+            <m:r>
               <m:rPr>
                 <m:sty m:val="p"/>
               </m:rPr>
-              <m:t>…</m:t>
+              <m:t>,</m:t>
+            </m:r>
+            <m:r>
+              <m:t>5</m:t>
+            </m:r>
+            <m:r>
+              <m:rPr>
+                <m:sty m:val="p"/>
+              </m:rPr>
+              <m:t>,</m:t>
+            </m:r>
+            <m:r>
+              <m:t>6</m:t>
             </m:r>
           </m:e>
         </m:d>
@@ -12412,57 +13309,7 @@
         <w:t xml:space="preserve"> </w:t>
       </w:r>
       <w:r>
-        <w:t xml:space="preserve">are countably infinite:</w:t>
-      </w:r>
-      <w:r>
-        <w:t xml:space="preserve"> </w:t>
-      </w:r>
-      <w:r>
-        <w:t xml:space="preserve">the sequence</w:t>
-      </w:r>
-      <w:r>
-        <w:t xml:space="preserve"> </w:t>
-      </w:r>
-      <m:oMath>
-        <m:r>
-          <m:t>0</m:t>
-        </m:r>
-        <m:r>
-          <m:rPr>
-            <m:sty m:val="p"/>
-          </m:rPr>
-          <m:t>,</m:t>
-        </m:r>
-        <m:r>
-          <m:t>1</m:t>
-        </m:r>
-        <m:r>
-          <m:rPr>
-            <m:sty m:val="p"/>
-          </m:rPr>
-          <m:t>,</m:t>
-        </m:r>
-        <m:r>
-          <m:t>2</m:t>
-        </m:r>
-        <m:r>
-          <m:rPr>
-            <m:sty m:val="p"/>
-          </m:rPr>
-          <m:t>,</m:t>
-        </m:r>
-        <m:r>
-          <m:rPr>
-            <m:sty m:val="p"/>
-          </m:rPr>
-          <m:t>…</m:t>
-        </m:r>
-      </m:oMath>
-      <w:r>
-        <w:t xml:space="preserve"> </w:t>
-      </w:r>
-      <w:r>
-        <w:t xml:space="preserve">lists them.</w:t>
+        <w:t xml:space="preserve">is countable, because it is finite.</w:t>
       </w:r>
     </w:p>
     <w:p>
@@ -12470,7 +13317,7 @@
         <w:pStyle w:val="Compact"/>
         <w:numPr>
           <w:ilvl w:val="0"/>
-          <w:numId w:val="1011"/>
+          <w:numId w:val="1012"/>
         </w:numPr>
       </w:pPr>
       <w:r>
@@ -12479,7 +13326,140 @@
       <w:r>
         <w:t xml:space="preserve"> </w:t>
       </w:r>
-      <w:hyperlink r:id="rId59">
+      <w:hyperlink r:id="rId65">
+        <w:r>
+          <w:rPr>
+            <w:rStyle w:val="Hyperlink"/>
+          </w:rPr>
+          <w:t xml:space="preserve">non-negative integers</w:t>
+        </w:r>
+      </w:hyperlink>
+      <w:r>
+        <w:t xml:space="preserve"> </w:t>
+      </w:r>
+      <m:oMath>
+        <m:r>
+          <m:t>​</m:t>
+        </m:r>
+        <m:d>
+          <m:dPr>
+            <m:begChr m:val="{"/>
+            <m:sepChr m:val=""/>
+            <m:endChr m:val="}"/>
+            <m:grow/>
+          </m:dPr>
+          <m:e>
+            <m:r>
+              <m:t>0</m:t>
+            </m:r>
+            <m:r>
+              <m:rPr>
+                <m:sty m:val="p"/>
+              </m:rPr>
+              <m:t>,</m:t>
+            </m:r>
+            <m:r>
+              <m:t>1</m:t>
+            </m:r>
+            <m:r>
+              <m:rPr>
+                <m:sty m:val="p"/>
+              </m:rPr>
+              <m:t>,</m:t>
+            </m:r>
+            <m:r>
+              <m:t>2</m:t>
+            </m:r>
+            <m:r>
+              <m:rPr>
+                <m:sty m:val="p"/>
+              </m:rPr>
+              <m:t>,</m:t>
+            </m:r>
+            <m:r>
+              <m:rPr>
+                <m:sty m:val="p"/>
+              </m:rPr>
+              <m:t>…</m:t>
+            </m:r>
+          </m:e>
+        </m:d>
+        <m:r>
+          <m:t>​</m:t>
+        </m:r>
+      </m:oMath>
+      <w:r>
+        <w:t xml:space="preserve"> </w:t>
+      </w:r>
+      <w:r>
+        <w:t xml:space="preserve">are countably infinite:</w:t>
+      </w:r>
+      <w:r>
+        <w:t xml:space="preserve"> </w:t>
+      </w:r>
+      <w:r>
+        <w:t xml:space="preserve">the sequence</w:t>
+      </w:r>
+      <w:r>
+        <w:t xml:space="preserve"> </w:t>
+      </w:r>
+      <m:oMath>
+        <m:r>
+          <m:t>0</m:t>
+        </m:r>
+        <m:r>
+          <m:rPr>
+            <m:sty m:val="p"/>
+          </m:rPr>
+          <m:t>,</m:t>
+        </m:r>
+        <m:r>
+          <m:t>1</m:t>
+        </m:r>
+        <m:r>
+          <m:rPr>
+            <m:sty m:val="p"/>
+          </m:rPr>
+          <m:t>,</m:t>
+        </m:r>
+        <m:r>
+          <m:t>2</m:t>
+        </m:r>
+        <m:r>
+          <m:rPr>
+            <m:sty m:val="p"/>
+          </m:rPr>
+          <m:t>,</m:t>
+        </m:r>
+        <m:r>
+          <m:rPr>
+            <m:sty m:val="p"/>
+          </m:rPr>
+          <m:t>…</m:t>
+        </m:r>
+      </m:oMath>
+      <w:r>
+        <w:t xml:space="preserve"> </w:t>
+      </w:r>
+      <w:r>
+        <w:t xml:space="preserve">lists them.</w:t>
+      </w:r>
+    </w:p>
+    <w:p>
+      <w:pPr>
+        <w:pStyle w:val="Compact"/>
+        <w:numPr>
+          <w:ilvl w:val="0"/>
+          <w:numId w:val="1012"/>
+        </w:numPr>
+      </w:pPr>
+      <w:r>
+        <w:t xml:space="preserve">The</w:t>
+      </w:r>
+      <w:r>
+        <w:t xml:space="preserve"> </w:t>
+      </w:r>
+      <w:hyperlink r:id="rId66">
         <w:r>
           <w:rPr>
             <w:rStyle w:val="Hyperlink"/>
@@ -12598,8 +13578,8 @@
         <w:t xml:space="preserve">lists every one of them.</w:t>
       </w:r>
     </w:p>
-    <w:bookmarkEnd w:id="60"/>
-    <w:bookmarkStart w:id="61" w:name="thm-interval-uncountable"/>
+    <w:bookmarkEnd w:id="67"/>
+    <w:bookmarkStart w:id="68" w:name="thm-interval-uncountable"/>
     <w:p>
       <w:pPr>
         <w:pStyle w:val="FirstParagraph"/>
@@ -12667,8 +13647,8 @@
         <w:t xml:space="preserve">.</w:t>
       </w:r>
     </w:p>
-    <w:bookmarkEnd w:id="61"/>
-    <w:bookmarkStart w:id="65" w:name="rem-cantor-diagonal"/>
+    <w:bookmarkEnd w:id="68"/>
+    <w:bookmarkStart w:id="72" w:name="rem-cantor-diagonal"/>
     <w:p>
       <w:pPr>
         <w:pStyle w:val="BodyText"/>
@@ -12678,7 +13658,7 @@
           <w:i/>
           <w:iCs/>
         </w:rPr>
-        <w:t xml:space="preserve">Remark 7</w:t>
+        <w:t xml:space="preserve">Remark 8</w:t>
       </w:r>
       <w:r>
         <w:t xml:space="preserve"> (Cantor’s diagonal argument). </w:t>
@@ -12689,7 +13669,7 @@
       <w:r>
         <w:t xml:space="preserve"> </w:t>
       </w:r>
-      <w:hyperlink r:id="rId62">
+      <w:hyperlink r:id="rId69">
         <w:r>
           <w:rPr>
             <w:rStyle w:val="Hyperlink"/>
@@ -12785,7 +13765,7 @@
       <w:r>
         <w:t xml:space="preserve"> </w:t>
       </w:r>
-      <w:hyperlink r:id="rId63">
+      <w:hyperlink r:id="rId70">
         <w:r>
           <w:rPr>
             <w:rStyle w:val="Hyperlink"/>
@@ -12894,7 +13874,7 @@
       <w:r>
         <w:t xml:space="preserve"> </w:t>
       </w:r>
-      <w:hyperlink r:id="rId64">
+      <w:hyperlink r:id="rId71">
         <w:r>
           <w:rPr>
             <w:rStyle w:val="Hyperlink"/>
@@ -13121,9 +14101,9 @@
         <w:t xml:space="preserve">and from the third in the third digit.</w:t>
       </w:r>
     </w:p>
-    <w:bookmarkEnd w:id="65"/>
-    <w:bookmarkEnd w:id="66"/>
-    <w:bookmarkStart w:id="70" w:name="references"/>
+    <w:bookmarkEnd w:id="72"/>
+    <w:bookmarkEnd w:id="73"/>
+    <w:bookmarkStart w:id="77" w:name="references"/>
     <w:p>
       <w:pPr>
         <w:pStyle w:val="Heading2"/>
@@ -13132,8 +14112,8 @@
         <w:t xml:space="preserve">References</w:t>
       </w:r>
     </w:p>
-    <w:bookmarkStart w:id="69" w:name="refs"/>
-    <w:bookmarkStart w:id="68" w:name="ref-halmos1974naive"/>
+    <w:bookmarkStart w:id="76" w:name="refs"/>
+    <w:bookmarkStart w:id="75" w:name="ref-halmos1974naive"/>
     <w:p>
       <w:pPr>
         <w:pStyle w:val="Bibliography"/>
@@ -13157,7 +14137,7 @@
       <w:r>
         <w:t xml:space="preserve"> </w:t>
       </w:r>
-      <w:hyperlink r:id="rId67">
+      <w:hyperlink r:id="rId74">
         <w:r>
           <w:rPr>
             <w:rStyle w:val="Hyperlink"/>
@@ -13169,9 +14149,9 @@
         <w:t xml:space="preserve">.</w:t>
       </w:r>
     </w:p>
-    <w:bookmarkEnd w:id="68"/>
-    <w:bookmarkEnd w:id="69"/>
-    <w:bookmarkEnd w:id="70"/>
+    <w:bookmarkEnd w:id="75"/>
+    <w:bookmarkEnd w:id="76"/>
+    <w:bookmarkEnd w:id="77"/>
     <w:sectPr>
       <w:footnotePr>
         <w:numRestart w:val="eachSect"/>
@@ -13531,6 +14511,9 @@
     <w:abstractNumId w:val="991"/>
   </w:num>
   <w:num w:numId="1011">
+    <w:abstractNumId w:val="991"/>
+  </w:num>
+  <w:num w:numId="1012">
     <w:abstractNumId w:val="991"/>
   </w:num>
 </w:numbering>

</xml_diff>

<commit_message>
Deploying to gh-pages from @ Morrison-Lab/mds@0777a1b519ff97806a5cc5bb5dfcdf7bf268123b 🚀
</commit_message>
<xml_diff>
--- a/functions.docx
+++ b/functions.docx
@@ -15,7 +15,7 @@
         <w:pStyle w:val="Date"/>
       </w:pPr>
       <w:r>
-        <w:t xml:space="preserve">Last modified: 2026-10-19 03:23:43 (PDT)</w:t>
+        <w:t xml:space="preserve">Last modified: 2026-10-19 04:41:29 (PDT)</w:t>
       </w:r>
     </w:p>
     <w:p>
@@ -71,7 +71,7 @@
         <w:t xml:space="preserve">page.</w:t>
       </w:r>
     </w:p>
-    <w:bookmarkStart w:id="54" w:name="functions"/>
+    <w:bookmarkStart w:id="56" w:name="functions"/>
     <w:p>
       <w:pPr>
         <w:pStyle w:val="Heading2"/>
@@ -10868,8 +10868,787 @@
       </w:r>
     </w:p>
     <w:bookmarkEnd w:id="53"/>
+    <w:bookmarkStart w:id="54" w:name="def-logistic-function"/>
+    <w:p>
+      <w:pPr>
+        <w:pStyle w:val="BodyText"/>
+      </w:pPr>
+      <w:r>
+        <w:rPr>
+          <w:b/>
+          <w:bCs/>
+        </w:rPr>
+        <w:t xml:space="preserve">Definition 20 (Logistic function (also called the sigmoid or expit))</w:t>
+      </w:r>
+      <w:r>
+        <w:t xml:space="preserve"> </w:t>
+      </w:r>
+      <w:r>
+        <w:t xml:space="preserve">The</w:t>
+      </w:r>
+      <w:r>
+        <w:t xml:space="preserve"> </w:t>
+      </w:r>
+      <w:r>
+        <w:rPr>
+          <w:b/>
+          <w:bCs/>
+        </w:rPr>
+        <w:t xml:space="preserve">logistic function</w:t>
+      </w:r>
+      <w:r>
+        <w:t xml:space="preserve">, also called the</w:t>
+      </w:r>
+      <w:r>
+        <w:t xml:space="preserve"> </w:t>
+      </w:r>
+      <w:r>
+        <w:rPr>
+          <w:b/>
+          <w:bCs/>
+        </w:rPr>
+        <w:t xml:space="preserve">sigmoid</w:t>
+      </w:r>
+      <w:r>
+        <w:t xml:space="preserve"> </w:t>
+      </w:r>
+      <w:r>
+        <w:t xml:space="preserve">or</w:t>
+      </w:r>
+      <w:r>
+        <w:t xml:space="preserve"> </w:t>
+      </w:r>
+      <w:r>
+        <w:rPr>
+          <w:b/>
+          <w:bCs/>
+        </w:rPr>
+        <w:t xml:space="preserve">expit</w:t>
+      </w:r>
+      <w:r>
+        <w:t xml:space="preserve">, is</w:t>
+      </w:r>
+      <w:r>
+        <w:t xml:space="preserve"> </w:t>
+      </w:r>
+      <w:r>
+        <w:t xml:space="preserve">the</w:t>
+      </w:r>
+      <w:r>
+        <w:t xml:space="preserve"> </w:t>
+      </w:r>
+      <w:hyperlink w:anchor="def-function">
+        <w:r>
+          <w:rPr>
+            <w:rStyle w:val="Hyperlink"/>
+          </w:rPr>
+          <w:t xml:space="preserve">function</w:t>
+        </w:r>
+      </w:hyperlink>
+      <w:r>
+        <w:t xml:space="preserve"> </w:t>
+      </w:r>
+      <m:oMath>
+        <m:r>
+          <m:t>σ</m:t>
+        </m:r>
+        <m:r>
+          <m:rPr>
+            <m:sty m:val="p"/>
+          </m:rPr>
+          <m:t>:</m:t>
+        </m:r>
+        <m:r>
+          <m:rPr>
+            <m:scr m:val="double-struck"/>
+            <m:sty m:val="p"/>
+          </m:rPr>
+          <m:t>R</m:t>
+        </m:r>
+        <m:r>
+          <m:rPr>
+            <m:sty m:val="p"/>
+          </m:rPr>
+          <m:t>→</m:t>
+        </m:r>
+        <m:r>
+          <m:rPr>
+            <m:sty m:val="p"/>
+          </m:rPr>
+          <m:t>(</m:t>
+        </m:r>
+        <m:r>
+          <m:t>0</m:t>
+        </m:r>
+        <m:r>
+          <m:rPr>
+            <m:sty m:val="p"/>
+          </m:rPr>
+          <m:t>,</m:t>
+        </m:r>
+        <m:r>
+          <m:t>1</m:t>
+        </m:r>
+        <m:r>
+          <m:rPr>
+            <m:sty m:val="p"/>
+          </m:rPr>
+          <m:t>)</m:t>
+        </m:r>
+      </m:oMath>
+      <w:r>
+        <w:t xml:space="preserve"> </w:t>
+      </w:r>
+      <w:r>
+        <w:t xml:space="preserve">with</w:t>
+      </w:r>
+      <w:r>
+        <w:t xml:space="preserve"> </w:t>
+      </w:r>
+      <w:r>
+        <w:t xml:space="preserve">[14]</w:t>
+      </w:r>
+    </w:p>
+    <w:p>
+      <w:pPr>
+        <w:pStyle w:val="BodyText"/>
+      </w:pPr>
+      <m:oMathPara>
+        <m:oMathParaPr>
+          <m:jc m:val="center"/>
+        </m:oMathParaPr>
+        <m:oMath>
+          <m:r>
+            <m:t>σ</m:t>
+          </m:r>
+          <m:r>
+            <m:t>​</m:t>
+          </m:r>
+          <m:d>
+            <m:dPr>
+              <m:begChr m:val="("/>
+              <m:sepChr m:val=""/>
+              <m:endChr m:val=")"/>
+              <m:grow/>
+            </m:dPr>
+            <m:e>
+              <m:r>
+                <m:t>z</m:t>
+              </m:r>
+            </m:e>
+          </m:d>
+          <m:r>
+            <m:t>​</m:t>
+          </m:r>
+          <m:limUpp>
+            <m:e>
+              <m:r>
+                <m:rPr>
+                  <m:sty m:val="p"/>
+                </m:rPr>
+                <m:t>=</m:t>
+              </m:r>
+            </m:e>
+            <m:lim>
+              <m:r>
+                <m:rPr>
+                  <m:nor/>
+                  <m:sty m:val="p"/>
+                </m:rPr>
+                <m:t>def</m:t>
+              </m:r>
+            </m:lim>
+          </m:limUpp>
+          <m:f>
+            <m:fPr>
+              <m:type m:val="bar"/>
+            </m:fPr>
+            <m:num>
+              <m:r>
+                <m:t>1</m:t>
+              </m:r>
+            </m:num>
+            <m:den>
+              <m:r>
+                <m:t>1</m:t>
+              </m:r>
+              <m:r>
+                <m:rPr>
+                  <m:sty m:val="p"/>
+                </m:rPr>
+                <m:t>+</m:t>
+              </m:r>
+              <m:sSup>
+                <m:e>
+                  <m:r>
+                    <m:t>e</m:t>
+                  </m:r>
+                </m:e>
+                <m:sup>
+                  <m:r>
+                    <m:rPr>
+                      <m:sty m:val="p"/>
+                    </m:rPr>
+                    <m:t>−</m:t>
+                  </m:r>
+                  <m:r>
+                    <m:t>z</m:t>
+                  </m:r>
+                </m:sup>
+              </m:sSup>
+            </m:den>
+          </m:f>
+          <m:r>
+            <m:rPr>
+              <m:sty m:val="p"/>
+            </m:rPr>
+            <m:t>.</m:t>
+          </m:r>
+        </m:oMath>
+      </m:oMathPara>
+    </w:p>
     <w:bookmarkEnd w:id="54"/>
-    <w:bookmarkStart w:id="71" w:name="countable-sets"/>
+    <w:bookmarkStart w:id="55" w:name="exm-logistic-function"/>
+    <w:p>
+      <w:pPr>
+        <w:pStyle w:val="FirstParagraph"/>
+      </w:pPr>
+      <w:r>
+        <w:rPr>
+          <w:b/>
+          <w:bCs/>
+        </w:rPr>
+        <w:t xml:space="preserve">Example 14 (Values of the logistic function)</w:t>
+      </w:r>
+      <w:r>
+        <w:t xml:space="preserve"> </w:t>
+      </w:r>
+      <w:r>
+        <w:t xml:space="preserve">The</w:t>
+      </w:r>
+      <w:r>
+        <w:t xml:space="preserve"> </w:t>
+      </w:r>
+      <w:hyperlink w:anchor="def-logistic-function">
+        <w:r>
+          <w:rPr>
+            <w:rStyle w:val="Hyperlink"/>
+          </w:rPr>
+          <w:t xml:space="preserve">logistic function</w:t>
+        </w:r>
+      </w:hyperlink>
+      <w:r>
+        <w:t xml:space="preserve"> </w:t>
+      </w:r>
+      <w:r>
+        <w:t xml:space="preserve">at</w:t>
+      </w:r>
+      <w:r>
+        <w:t xml:space="preserve"> </w:t>
+      </w:r>
+      <m:oMath>
+        <m:r>
+          <m:t>z</m:t>
+        </m:r>
+        <m:r>
+          <m:rPr>
+            <m:sty m:val="p"/>
+          </m:rPr>
+          <m:t>=</m:t>
+        </m:r>
+        <m:r>
+          <m:rPr>
+            <m:sty m:val="p"/>
+          </m:rPr>
+          <m:t>−</m:t>
+        </m:r>
+        <m:r>
+          <m:t>2</m:t>
+        </m:r>
+      </m:oMath>
+      <w:r>
+        <w:t xml:space="preserve">,</w:t>
+      </w:r>
+      <w:r>
+        <w:t xml:space="preserve"> </w:t>
+      </w:r>
+      <m:oMath>
+        <m:r>
+          <m:t>z</m:t>
+        </m:r>
+        <m:r>
+          <m:rPr>
+            <m:sty m:val="p"/>
+          </m:rPr>
+          <m:t>=</m:t>
+        </m:r>
+        <m:r>
+          <m:t>0</m:t>
+        </m:r>
+      </m:oMath>
+      <w:r>
+        <w:t xml:space="preserve"> </w:t>
+      </w:r>
+      <w:r>
+        <w:t xml:space="preserve">or</w:t>
+      </w:r>
+      <w:r>
+        <w:t xml:space="preserve"> </w:t>
+      </w:r>
+      <m:oMath>
+        <m:r>
+          <m:t>z</m:t>
+        </m:r>
+        <m:r>
+          <m:rPr>
+            <m:sty m:val="p"/>
+          </m:rPr>
+          <m:t>=</m:t>
+        </m:r>
+        <m:r>
+          <m:t>2</m:t>
+        </m:r>
+      </m:oMath>
+      <w:r>
+        <w:t xml:space="preserve"> </w:t>
+      </w:r>
+      <w:r>
+        <w:t xml:space="preserve">has these</w:t>
+      </w:r>
+      <w:r>
+        <w:t xml:space="preserve"> </w:t>
+      </w:r>
+      <w:hyperlink w:anchor="def-value">
+        <w:r>
+          <w:rPr>
+            <w:rStyle w:val="Hyperlink"/>
+          </w:rPr>
+          <w:t xml:space="preserve">values</w:t>
+        </w:r>
+      </w:hyperlink>
+      <w:r>
+        <w:t xml:space="preserve">:</w:t>
+      </w:r>
+    </w:p>
+    <w:p>
+      <w:pPr>
+        <w:pStyle w:val="SourceCode"/>
+      </w:pPr>
+      <w:r>
+        <w:rPr>
+          <w:rStyle w:val="NormalTok"/>
+        </w:rPr>
+        <w:t xml:space="preserve">z </w:t>
+      </w:r>
+      <w:r>
+        <w:rPr>
+          <w:rStyle w:val="OtherTok"/>
+        </w:rPr>
+        <w:t xml:space="preserve">&lt;-</w:t>
+      </w:r>
+      <w:r>
+        <w:rPr>
+          <w:rStyle w:val="NormalTok"/>
+        </w:rPr>
+        <w:t xml:space="preserve"> </w:t>
+      </w:r>
+      <w:r>
+        <w:rPr>
+          <w:rStyle w:val="FunctionTok"/>
+        </w:rPr>
+        <w:t xml:space="preserve">c</w:t>
+      </w:r>
+      <w:r>
+        <w:rPr>
+          <w:rStyle w:val="NormalTok"/>
+        </w:rPr>
+        <w:t xml:space="preserve">(</w:t>
+      </w:r>
+      <w:r>
+        <w:rPr>
+          <w:rStyle w:val="SpecialCharTok"/>
+        </w:rPr>
+        <w:t xml:space="preserve">-</w:t>
+      </w:r>
+      <w:r>
+        <w:rPr>
+          <w:rStyle w:val="DecValTok"/>
+        </w:rPr>
+        <w:t xml:space="preserve">2</w:t>
+      </w:r>
+      <w:r>
+        <w:rPr>
+          <w:rStyle w:val="NormalTok"/>
+        </w:rPr>
+        <w:t xml:space="preserve">, </w:t>
+      </w:r>
+      <w:r>
+        <w:rPr>
+          <w:rStyle w:val="DecValTok"/>
+        </w:rPr>
+        <w:t xml:space="preserve">0</w:t>
+      </w:r>
+      <w:r>
+        <w:rPr>
+          <w:rStyle w:val="NormalTok"/>
+        </w:rPr>
+        <w:t xml:space="preserve">, </w:t>
+      </w:r>
+      <w:r>
+        <w:rPr>
+          <w:rStyle w:val="DecValTok"/>
+        </w:rPr>
+        <w:t xml:space="preserve">2</w:t>
+      </w:r>
+      <w:r>
+        <w:rPr>
+          <w:rStyle w:val="NormalTok"/>
+        </w:rPr>
+        <w:t xml:space="preserve">)</w:t>
+      </w:r>
+      <w:r>
+        <w:br/>
+      </w:r>
+      <w:r>
+        <w:rPr>
+          <w:rStyle w:val="FunctionTok"/>
+        </w:rPr>
+        <w:t xml:space="preserve">data.frame</w:t>
+      </w:r>
+      <w:r>
+        <w:rPr>
+          <w:rStyle w:val="NormalTok"/>
+        </w:rPr>
+        <w:t xml:space="preserve">(</w:t>
+      </w:r>
+      <w:r>
+        <w:rPr>
+          <w:rStyle w:val="AttributeTok"/>
+        </w:rPr>
+        <w:t xml:space="preserve">z =</w:t>
+      </w:r>
+      <w:r>
+        <w:rPr>
+          <w:rStyle w:val="NormalTok"/>
+        </w:rPr>
+        <w:t xml:space="preserve"> z, </w:t>
+      </w:r>
+      <w:r>
+        <w:rPr>
+          <w:rStyle w:val="AttributeTok"/>
+        </w:rPr>
+        <w:t xml:space="preserve">sigmoid =</w:t>
+      </w:r>
+      <w:r>
+        <w:rPr>
+          <w:rStyle w:val="NormalTok"/>
+        </w:rPr>
+        <w:t xml:space="preserve"> </w:t>
+      </w:r>
+      <w:r>
+        <w:rPr>
+          <w:rStyle w:val="DecValTok"/>
+        </w:rPr>
+        <w:t xml:space="preserve">1</w:t>
+      </w:r>
+      <w:r>
+        <w:rPr>
+          <w:rStyle w:val="NormalTok"/>
+        </w:rPr>
+        <w:t xml:space="preserve"> </w:t>
+      </w:r>
+      <w:r>
+        <w:rPr>
+          <w:rStyle w:val="SpecialCharTok"/>
+        </w:rPr>
+        <w:t xml:space="preserve">/</w:t>
+      </w:r>
+      <w:r>
+        <w:rPr>
+          <w:rStyle w:val="NormalTok"/>
+        </w:rPr>
+        <w:t xml:space="preserve"> (</w:t>
+      </w:r>
+      <w:r>
+        <w:rPr>
+          <w:rStyle w:val="DecValTok"/>
+        </w:rPr>
+        <w:t xml:space="preserve">1</w:t>
+      </w:r>
+      <w:r>
+        <w:rPr>
+          <w:rStyle w:val="NormalTok"/>
+        </w:rPr>
+        <w:t xml:space="preserve"> </w:t>
+      </w:r>
+      <w:r>
+        <w:rPr>
+          <w:rStyle w:val="SpecialCharTok"/>
+        </w:rPr>
+        <w:t xml:space="preserve">+</w:t>
+      </w:r>
+      <w:r>
+        <w:rPr>
+          <w:rStyle w:val="NormalTok"/>
+        </w:rPr>
+        <w:t xml:space="preserve"> </w:t>
+      </w:r>
+      <w:r>
+        <w:rPr>
+          <w:rStyle w:val="FunctionTok"/>
+        </w:rPr>
+        <w:t xml:space="preserve">exp</w:t>
+      </w:r>
+      <w:r>
+        <w:rPr>
+          <w:rStyle w:val="NormalTok"/>
+        </w:rPr>
+        <w:t xml:space="preserve">(</w:t>
+      </w:r>
+      <w:r>
+        <w:rPr>
+          <w:rStyle w:val="SpecialCharTok"/>
+        </w:rPr>
+        <w:t xml:space="preserve">-</w:t>
+      </w:r>
+      <w:r>
+        <w:rPr>
+          <w:rStyle w:val="NormalTok"/>
+        </w:rPr>
+        <w:t xml:space="preserve">z)))</w:t>
+      </w:r>
+      <w:r>
+        <w:br/>
+      </w:r>
+      <w:r>
+        <w:rPr>
+          <w:rStyle w:val="CommentTok"/>
+        </w:rPr>
+        <w:t xml:space="preserve">#&gt; # A tibble: 3 × 2</w:t>
+      </w:r>
+      <w:r>
+        <w:br/>
+      </w:r>
+      <w:r>
+        <w:rPr>
+          <w:rStyle w:val="CommentTok"/>
+        </w:rPr>
+        <w:t xml:space="preserve">#&gt;       z sigmoid</w:t>
+      </w:r>
+      <w:r>
+        <w:br/>
+      </w:r>
+      <w:r>
+        <w:rPr>
+          <w:rStyle w:val="CommentTok"/>
+        </w:rPr>
+        <w:t xml:space="preserve">#&gt;   &lt;dbl&gt;   &lt;dbl&gt;</w:t>
+      </w:r>
+      <w:r>
+        <w:br/>
+      </w:r>
+      <w:r>
+        <w:rPr>
+          <w:rStyle w:val="CommentTok"/>
+        </w:rPr>
+        <w:t xml:space="preserve">#&gt; 1    -2   0.119</w:t>
+      </w:r>
+      <w:r>
+        <w:br/>
+      </w:r>
+      <w:r>
+        <w:rPr>
+          <w:rStyle w:val="CommentTok"/>
+        </w:rPr>
+        <w:t xml:space="preserve">#&gt; 2     0   0.5  </w:t>
+      </w:r>
+      <w:r>
+        <w:br/>
+      </w:r>
+      <w:r>
+        <w:rPr>
+          <w:rStyle w:val="CommentTok"/>
+        </w:rPr>
+        <w:t xml:space="preserve">#&gt; 3     2   0.881</w:t>
+      </w:r>
+    </w:p>
+    <w:p>
+      <w:pPr>
+        <w:pStyle w:val="FirstParagraph"/>
+      </w:pPr>
+      <w:r>
+        <w:t xml:space="preserve">The</w:t>
+      </w:r>
+      <w:r>
+        <w:t xml:space="preserve"> </w:t>
+      </w:r>
+      <w:hyperlink w:anchor="def-value">
+        <w:r>
+          <w:rPr>
+            <w:rStyle w:val="Hyperlink"/>
+          </w:rPr>
+          <w:t xml:space="preserve">value</w:t>
+        </w:r>
+      </w:hyperlink>
+      <w:r>
+        <w:t xml:space="preserve"> </w:t>
+      </w:r>
+      <w:r>
+        <w:t xml:space="preserve">at</w:t>
+      </w:r>
+      <w:r>
+        <w:t xml:space="preserve"> </w:t>
+      </w:r>
+      <m:oMath>
+        <m:r>
+          <m:t>z</m:t>
+        </m:r>
+        <m:r>
+          <m:rPr>
+            <m:sty m:val="p"/>
+          </m:rPr>
+          <m:t>=</m:t>
+        </m:r>
+        <m:r>
+          <m:t>0</m:t>
+        </m:r>
+      </m:oMath>
+      <w:r>
+        <w:t xml:space="preserve"> </w:t>
+      </w:r>
+      <w:r>
+        <w:t xml:space="preserve">is</w:t>
+      </w:r>
+      <w:r>
+        <w:t xml:space="preserve"> </w:t>
+      </w:r>
+      <m:oMath>
+        <m:r>
+          <m:t>1</m:t>
+        </m:r>
+        <m:r>
+          <m:rPr>
+            <m:sty m:val="p"/>
+          </m:rPr>
+          <m:t>/</m:t>
+        </m:r>
+        <m:r>
+          <m:rPr>
+            <m:sty m:val="p"/>
+          </m:rPr>
+          <m:t>(</m:t>
+        </m:r>
+        <m:r>
+          <m:t>1</m:t>
+        </m:r>
+        <m:r>
+          <m:rPr>
+            <m:sty m:val="p"/>
+          </m:rPr>
+          <m:t>+</m:t>
+        </m:r>
+        <m:sSup>
+          <m:e>
+            <m:r>
+              <m:t>e</m:t>
+            </m:r>
+          </m:e>
+          <m:sup>
+            <m:r>
+              <m:t>0</m:t>
+            </m:r>
+          </m:sup>
+        </m:sSup>
+        <m:r>
+          <m:rPr>
+            <m:sty m:val="p"/>
+          </m:rPr>
+          <m:t>)</m:t>
+        </m:r>
+        <m:r>
+          <m:rPr>
+            <m:sty m:val="p"/>
+          </m:rPr>
+          <m:t>=</m:t>
+        </m:r>
+        <m:r>
+          <m:t>1</m:t>
+        </m:r>
+        <m:r>
+          <m:rPr>
+            <m:sty m:val="p"/>
+          </m:rPr>
+          <m:t>/</m:t>
+        </m:r>
+        <m:r>
+          <m:t>2</m:t>
+        </m:r>
+      </m:oMath>
+      <w:r>
+        <w:t xml:space="preserve">.</w:t>
+      </w:r>
+      <w:r>
+        <w:t xml:space="preserve"> </w:t>
+      </w:r>
+      <w:r>
+        <w:t xml:space="preserve">The values at</w:t>
+      </w:r>
+      <w:r>
+        <w:t xml:space="preserve"> </w:t>
+      </w:r>
+      <m:oMath>
+        <m:r>
+          <m:rPr>
+            <m:sty m:val="p"/>
+          </m:rPr>
+          <m:t>±</m:t>
+        </m:r>
+        <m:r>
+          <m:t>2</m:t>
+        </m:r>
+      </m:oMath>
+      <w:r>
+        <w:t xml:space="preserve"> </w:t>
+      </w:r>
+      <w:r>
+        <w:t xml:space="preserve">add to 1; each lies in</w:t>
+      </w:r>
+      <w:r>
+        <w:t xml:space="preserve"> </w:t>
+      </w:r>
+      <m:oMath>
+        <m:r>
+          <m:rPr>
+            <m:sty m:val="p"/>
+          </m:rPr>
+          <m:t>(</m:t>
+        </m:r>
+        <m:r>
+          <m:t>0</m:t>
+        </m:r>
+        <m:r>
+          <m:rPr>
+            <m:sty m:val="p"/>
+          </m:rPr>
+          <m:t>,</m:t>
+        </m:r>
+        <m:r>
+          <m:t>1</m:t>
+        </m:r>
+        <m:r>
+          <m:rPr>
+            <m:sty m:val="p"/>
+          </m:rPr>
+          <m:t>)</m:t>
+        </m:r>
+      </m:oMath>
+      <w:r>
+        <w:t xml:space="preserve">.</w:t>
+      </w:r>
+    </w:p>
+    <w:bookmarkEnd w:id="55"/>
+    <w:bookmarkEnd w:id="56"/>
+    <w:bookmarkStart w:id="73" w:name="countable-sets"/>
     <w:p>
       <w:pPr>
         <w:pStyle w:val="Heading2"/>
@@ -10878,7 +11657,7 @@
         <w:t xml:space="preserve">2 Countable sets</w:t>
       </w:r>
     </w:p>
-    <w:bookmarkStart w:id="55" w:name="def-finite-set"/>
+    <w:bookmarkStart w:id="57" w:name="def-finite-set"/>
     <w:p>
       <w:pPr>
         <w:pStyle w:val="FirstParagraph"/>
@@ -10888,7 +11667,7 @@
           <w:b/>
           <w:bCs/>
         </w:rPr>
-        <w:t xml:space="preserve">Definition 20 (Finite set)</w:t>
+        <w:t xml:space="preserve">Definition 21 (Finite set)</w:t>
       </w:r>
       <w:r>
         <w:t xml:space="preserve"> </w:t>
@@ -10924,7 +11703,7 @@
         <w:t xml:space="preserve"> </w:t>
       </w:r>
       <w:r>
-        <w:t xml:space="preserve">[14]</w:t>
+        <w:t xml:space="preserve">[15]</w:t>
       </w:r>
       <w:r>
         <w:t xml:space="preserve"> </w:t>
@@ -11034,8 +11813,8 @@
         <w:t xml:space="preserve">appears exactly once.</w:t>
       </w:r>
     </w:p>
-    <w:bookmarkEnd w:id="55"/>
-    <w:bookmarkStart w:id="56" w:name="def-cardinality"/>
+    <w:bookmarkEnd w:id="57"/>
+    <w:bookmarkStart w:id="58" w:name="def-cardinality"/>
     <w:p>
       <w:pPr>
         <w:pStyle w:val="BodyText"/>
@@ -11045,7 +11824,7 @@
           <w:b/>
           <w:bCs/>
         </w:rPr>
-        <w:t xml:space="preserve">Definition 21 (Cardinality)</w:t>
+        <w:t xml:space="preserve">Definition 22 (Cardinality)</w:t>
       </w:r>
       <w:r>
         <w:t xml:space="preserve"> </w:t>
@@ -11072,7 +11851,7 @@
           <w:rPr>
             <w:rStyle w:val="Hyperlink"/>
           </w:rPr>
-          <w:t xml:space="preserve">Definition 20</w:t>
+          <w:t xml:space="preserve">Definition 21</w:t>
         </w:r>
       </w:hyperlink>
       <w:r>
@@ -11112,7 +11891,7 @@
         <w:t xml:space="preserve"> </w:t>
       </w:r>
       <w:r>
-        <w:t xml:space="preserve">[15]</w:t>
+        <w:t xml:space="preserve">[16]</w:t>
       </w:r>
       <w:r>
         <w:t xml:space="preserve"> </w:t>
@@ -11210,8 +11989,8 @@
         <w:t xml:space="preserve">.</w:t>
       </w:r>
     </w:p>
-    <w:bookmarkEnd w:id="56"/>
-    <w:bookmarkStart w:id="59" w:name="rem-cardinality-bars"/>
+    <w:bookmarkEnd w:id="58"/>
+    <w:bookmarkStart w:id="61" w:name="rem-cardinality-bars"/>
     <w:p>
       <w:pPr>
         <w:pStyle w:val="BodyText"/>
@@ -11339,7 +12118,7 @@
       <w:r>
         <w:t xml:space="preserve"> </w:t>
       </w:r>
-      <w:hyperlink r:id="rId57">
+      <w:hyperlink r:id="rId59">
         <w:r>
           <w:rPr>
             <w:rStyle w:val="Hyperlink"/>
@@ -11359,7 +12138,7 @@
       <w:r>
         <w:t xml:space="preserve"> </w:t>
       </w:r>
-      <w:hyperlink r:id="rId58">
+      <w:hyperlink r:id="rId60">
         <w:r>
           <w:rPr>
             <w:rStyle w:val="Hyperlink"/>
@@ -11494,8 +12273,8 @@
         <w:t xml:space="preserve">.</w:t>
       </w:r>
     </w:p>
-    <w:bookmarkEnd w:id="59"/>
-    <w:bookmarkStart w:id="60" w:name="exm-finite-set"/>
+    <w:bookmarkEnd w:id="61"/>
+    <w:bookmarkStart w:id="62" w:name="exm-finite-set"/>
     <w:p>
       <w:pPr>
         <w:pStyle w:val="BodyText"/>
@@ -11505,7 +12284,7 @@
           <w:b/>
           <w:bCs/>
         </w:rPr>
-        <w:t xml:space="preserve">Example 14 (Finite and infinite sets)</w:t>
+        <w:t xml:space="preserve">Example 15 (Finite and infinite sets)</w:t>
       </w:r>
       <w:r>
         <w:t xml:space="preserve"> </w:t>
@@ -12087,8 +12866,8 @@
         <w:t xml:space="preserve">which is larger than every number in the list.</w:t>
       </w:r>
     </w:p>
-    <w:bookmarkEnd w:id="60"/>
-    <w:bookmarkStart w:id="61" w:name="def-infinite-set"/>
+    <w:bookmarkEnd w:id="62"/>
+    <w:bookmarkStart w:id="63" w:name="def-infinite-set"/>
     <w:p>
       <w:pPr>
         <w:pStyle w:val="FirstParagraph"/>
@@ -12098,7 +12877,7 @@
           <w:b/>
           <w:bCs/>
         </w:rPr>
-        <w:t xml:space="preserve">Definition 22 (Infinite set)</w:t>
+        <w:t xml:space="preserve">Definition 23 (Infinite set)</w:t>
       </w:r>
       <w:r>
         <w:t xml:space="preserve"> </w:t>
@@ -12111,7 +12890,7 @@
           <w:rPr>
             <w:rStyle w:val="Hyperlink"/>
           </w:rPr>
-          <w:t xml:space="preserve">Definition 20</w:t>
+          <w:t xml:space="preserve">Definition 21</w:t>
         </w:r>
       </w:hyperlink>
       <w:r>
@@ -12131,14 +12910,14 @@
         <w:t xml:space="preserve"> </w:t>
       </w:r>
       <w:r>
-        <w:t xml:space="preserve">[16]</w:t>
+        <w:t xml:space="preserve">[17]</w:t>
       </w:r>
       <w:r>
         <w:t xml:space="preserve">.</w:t>
       </w:r>
     </w:p>
-    <w:bookmarkEnd w:id="61"/>
-    <w:bookmarkStart w:id="62" w:name="def-countable-set"/>
+    <w:bookmarkEnd w:id="63"/>
+    <w:bookmarkStart w:id="64" w:name="def-countable-set"/>
     <w:p>
       <w:pPr>
         <w:pStyle w:val="BodyText"/>
@@ -12148,7 +12927,7 @@
           <w:b/>
           <w:bCs/>
         </w:rPr>
-        <w:t xml:space="preserve">Definition 23 (Countable set)</w:t>
+        <w:t xml:space="preserve">Definition 24 (Countable set)</w:t>
       </w:r>
       <w:r>
         <w:t xml:space="preserve"> </w:t>
@@ -12170,7 +12949,7 @@
         <w:t xml:space="preserve"> </w:t>
       </w:r>
       <w:r>
-        <w:t xml:space="preserve">[17]</w:t>
+        <w:t xml:space="preserve">[18]</w:t>
       </w:r>
       <w:r>
         <w:t xml:space="preserve"> </w:t>
@@ -12183,7 +12962,7 @@
           <w:rPr>
             <w:rStyle w:val="Hyperlink"/>
           </w:rPr>
-          <w:t xml:space="preserve">Definition 20</w:t>
+          <w:t xml:space="preserve">Definition 21</w:t>
         </w:r>
       </w:hyperlink>
       <w:r>
@@ -12278,8 +13057,8 @@
         <w:t xml:space="preserve">in which every element appears.</w:t>
       </w:r>
     </w:p>
-    <w:bookmarkEnd w:id="62"/>
-    <w:bookmarkStart w:id="63" w:name="def-countably-infinite"/>
+    <w:bookmarkEnd w:id="64"/>
+    <w:bookmarkStart w:id="65" w:name="def-countably-infinite"/>
     <w:p>
       <w:pPr>
         <w:pStyle w:val="BodyText"/>
@@ -12289,7 +13068,7 @@
           <w:b/>
           <w:bCs/>
         </w:rPr>
-        <w:t xml:space="preserve">Definition 24 (Countably infinite set)</w:t>
+        <w:t xml:space="preserve">Definition 25 (Countably infinite set)</w:t>
       </w:r>
       <w:r>
         <w:t xml:space="preserve"> </w:t>
@@ -12331,8 +13110,8 @@
         <w:t xml:space="preserve">and not finite.</w:t>
       </w:r>
     </w:p>
-    <w:bookmarkEnd w:id="63"/>
-    <w:bookmarkStart w:id="66" w:name="exm-countable-set"/>
+    <w:bookmarkEnd w:id="65"/>
+    <w:bookmarkStart w:id="68" w:name="exm-countable-set"/>
     <w:p>
       <w:pPr>
         <w:pStyle w:val="BodyText"/>
@@ -12342,7 +13121,7 @@
           <w:b/>
           <w:bCs/>
         </w:rPr>
-        <w:t xml:space="preserve">Example 15 (Countable and uncountable sets)</w:t>
+        <w:t xml:space="preserve">Example 16 (Countable and uncountable sets)</w:t>
       </w:r>
       <w:r>
         <w:t xml:space="preserve"> </w:t>
@@ -12446,7 +13225,7 @@
       <w:r>
         <w:t xml:space="preserve"> </w:t>
       </w:r>
-      <w:hyperlink r:id="rId64">
+      <w:hyperlink r:id="rId66">
         <w:r>
           <w:rPr>
             <w:rStyle w:val="Hyperlink"/>
@@ -12579,7 +13358,7 @@
       <w:r>
         <w:t xml:space="preserve"> </w:t>
       </w:r>
-      <w:hyperlink r:id="rId65">
+      <w:hyperlink r:id="rId67">
         <w:r>
           <w:rPr>
             <w:rStyle w:val="Hyperlink"/>
@@ -12698,8 +13477,8 @@
         <w:t xml:space="preserve">lists every one of them.</w:t>
       </w:r>
     </w:p>
-    <w:bookmarkEnd w:id="66"/>
-    <w:bookmarkStart w:id="67" w:name="thm-interval-uncountable"/>
+    <w:bookmarkEnd w:id="68"/>
+    <w:bookmarkStart w:id="69" w:name="thm-interval-uncountable"/>
     <w:p>
       <w:pPr>
         <w:pStyle w:val="FirstParagraph"/>
@@ -12767,8 +13546,8 @@
         <w:t xml:space="preserve">.</w:t>
       </w:r>
     </w:p>
-    <w:bookmarkEnd w:id="67"/>
-    <w:bookmarkStart w:id="70" w:name="rem-cantor-diagonal"/>
+    <w:bookmarkEnd w:id="69"/>
+    <w:bookmarkStart w:id="72" w:name="rem-cantor-diagonal"/>
     <w:p>
       <w:pPr>
         <w:pStyle w:val="BodyText"/>
@@ -12789,7 +13568,7 @@
       <w:r>
         <w:t xml:space="preserve"> </w:t>
       </w:r>
-      <w:hyperlink r:id="rId68">
+      <w:hyperlink r:id="rId70">
         <w:r>
           <w:rPr>
             <w:rStyle w:val="Hyperlink"/>
@@ -12885,7 +13664,7 @@
       <w:r>
         <w:t xml:space="preserve"> </w:t>
       </w:r>
-      <w:hyperlink r:id="rId69">
+      <w:hyperlink r:id="rId71">
         <w:r>
           <w:rPr>
             <w:rStyle w:val="Hyperlink"/>
@@ -12989,7 +13768,7 @@
         <w:t xml:space="preserve"> </w:t>
       </w:r>
       <w:r>
-        <w:t xml:space="preserve">[18]</w:t>
+        <w:t xml:space="preserve">[19]</w:t>
       </w:r>
       <w:r>
         <w:t xml:space="preserve">.</w:t>
@@ -13210,9 +13989,9 @@
         <w:t xml:space="preserve">and from the third in the third digit.</w:t>
       </w:r>
     </w:p>
-    <w:bookmarkEnd w:id="70"/>
-    <w:bookmarkEnd w:id="71"/>
-    <w:bookmarkStart w:id="109" w:name="references"/>
+    <w:bookmarkEnd w:id="72"/>
+    <w:bookmarkEnd w:id="73"/>
+    <w:bookmarkStart w:id="113" w:name="references"/>
     <w:p>
       <w:pPr>
         <w:pStyle w:val="Heading2"/>
@@ -13221,8 +14000,8 @@
         <w:t xml:space="preserve">References</w:t>
       </w:r>
     </w:p>
-    <w:bookmarkStart w:id="108" w:name="refs"/>
-    <w:bookmarkStart w:id="73" w:name="ref-wikipedia_function_mathematics"/>
+    <w:bookmarkStart w:id="112" w:name="refs"/>
+    <w:bookmarkStart w:id="75" w:name="ref-wikipedia_function_mathematics"/>
     <w:p>
       <w:pPr>
         <w:pStyle w:val="Bibliography"/>
@@ -13269,7 +14048,7 @@
       <w:r>
         <w:t xml:space="preserve"> </w:t>
       </w:r>
-      <w:hyperlink r:id="rId72">
+      <w:hyperlink r:id="rId74">
         <w:r>
           <w:rPr>
             <w:rStyle w:val="Hyperlink"/>
@@ -13278,8 +14057,8 @@
         </w:r>
       </w:hyperlink>
     </w:p>
-    <w:bookmarkEnd w:id="73"/>
-    <w:bookmarkStart w:id="75" w:name="ref-wikipedia_binary_relation"/>
+    <w:bookmarkEnd w:id="75"/>
+    <w:bookmarkStart w:id="77" w:name="ref-wikipedia_binary_relation"/>
     <w:p>
       <w:pPr>
         <w:pStyle w:val="Bibliography"/>
@@ -13326,7 +14105,7 @@
       <w:r>
         <w:t xml:space="preserve"> </w:t>
       </w:r>
-      <w:hyperlink r:id="rId74">
+      <w:hyperlink r:id="rId76">
         <w:r>
           <w:rPr>
             <w:rStyle w:val="Hyperlink"/>
@@ -13335,8 +14114,8 @@
         </w:r>
       </w:hyperlink>
     </w:p>
-    <w:bookmarkEnd w:id="75"/>
-    <w:bookmarkStart w:id="77" w:name="ref-wikipedia_domain_of_a_function"/>
+    <w:bookmarkEnd w:id="77"/>
+    <w:bookmarkStart w:id="79" w:name="ref-wikipedia_domain_of_a_function"/>
     <w:p>
       <w:pPr>
         <w:pStyle w:val="Bibliography"/>
@@ -13383,7 +14162,7 @@
       <w:r>
         <w:t xml:space="preserve"> </w:t>
       </w:r>
-      <w:hyperlink r:id="rId76">
+      <w:hyperlink r:id="rId78">
         <w:r>
           <w:rPr>
             <w:rStyle w:val="Hyperlink"/>
@@ -13392,8 +14171,8 @@
         </w:r>
       </w:hyperlink>
     </w:p>
-    <w:bookmarkEnd w:id="77"/>
-    <w:bookmarkStart w:id="79" w:name="ref-wikipedia_codomain"/>
+    <w:bookmarkEnd w:id="79"/>
+    <w:bookmarkStart w:id="81" w:name="ref-wikipedia_codomain"/>
     <w:p>
       <w:pPr>
         <w:pStyle w:val="Bibliography"/>
@@ -13440,7 +14219,7 @@
       <w:r>
         <w:t xml:space="preserve"> </w:t>
       </w:r>
-      <w:hyperlink r:id="rId78">
+      <w:hyperlink r:id="rId80">
         <w:r>
           <w:rPr>
             <w:rStyle w:val="Hyperlink"/>
@@ -13449,8 +14228,8 @@
         </w:r>
       </w:hyperlink>
     </w:p>
-    <w:bookmarkEnd w:id="79"/>
-    <w:bookmarkStart w:id="81" w:name="ref-wikipedia_image_mathematics"/>
+    <w:bookmarkEnd w:id="81"/>
+    <w:bookmarkStart w:id="83" w:name="ref-wikipedia_image_mathematics"/>
     <w:p>
       <w:pPr>
         <w:pStyle w:val="Bibliography"/>
@@ -13497,7 +14276,7 @@
       <w:r>
         <w:t xml:space="preserve"> </w:t>
       </w:r>
-      <w:hyperlink r:id="rId80">
+      <w:hyperlink r:id="rId82">
         <w:r>
           <w:rPr>
             <w:rStyle w:val="Hyperlink"/>
@@ -13506,8 +14285,8 @@
         </w:r>
       </w:hyperlink>
     </w:p>
-    <w:bookmarkEnd w:id="81"/>
-    <w:bookmarkStart w:id="83" w:name="ref-wikipedia_range_of_a_function"/>
+    <w:bookmarkEnd w:id="83"/>
+    <w:bookmarkStart w:id="85" w:name="ref-wikipedia_range_of_a_function"/>
     <w:p>
       <w:pPr>
         <w:pStyle w:val="Bibliography"/>
@@ -13554,7 +14333,7 @@
       <w:r>
         <w:t xml:space="preserve"> </w:t>
       </w:r>
-      <w:hyperlink r:id="rId82">
+      <w:hyperlink r:id="rId84">
         <w:r>
           <w:rPr>
             <w:rStyle w:val="Hyperlink"/>
@@ -13563,8 +14342,8 @@
         </w:r>
       </w:hyperlink>
     </w:p>
-    <w:bookmarkEnd w:id="83"/>
-    <w:bookmarkStart w:id="85" w:name="ref-wikipedia_graph_of_a_function"/>
+    <w:bookmarkEnd w:id="85"/>
+    <w:bookmarkStart w:id="87" w:name="ref-wikipedia_graph_of_a_function"/>
     <w:p>
       <w:pPr>
         <w:pStyle w:val="Bibliography"/>
@@ -13611,7 +14390,7 @@
       <w:r>
         <w:t xml:space="preserve"> </w:t>
       </w:r>
-      <w:hyperlink r:id="rId84">
+      <w:hyperlink r:id="rId86">
         <w:r>
           <w:rPr>
             <w:rStyle w:val="Hyperlink"/>
@@ -13620,8 +14399,8 @@
         </w:r>
       </w:hyperlink>
     </w:p>
-    <w:bookmarkEnd w:id="85"/>
-    <w:bookmarkStart w:id="87" w:name="ref-halmos1974naive"/>
+    <w:bookmarkEnd w:id="87"/>
+    <w:bookmarkStart w:id="89" w:name="ref-halmos1974naive"/>
     <w:p>
       <w:pPr>
         <w:pStyle w:val="Bibliography"/>
@@ -13654,7 +14433,7 @@
       <w:r>
         <w:t xml:space="preserve"> </w:t>
       </w:r>
-      <w:hyperlink r:id="rId86">
+      <w:hyperlink r:id="rId88">
         <w:r>
           <w:rPr>
             <w:rStyle w:val="Hyperlink"/>
@@ -13666,8 +14445,8 @@
         <w:t xml:space="preserve">.</w:t>
       </w:r>
     </w:p>
-    <w:bookmarkEnd w:id="87"/>
-    <w:bookmarkStart w:id="89" w:name="ref-wikipedia_function_composition"/>
+    <w:bookmarkEnd w:id="89"/>
+    <w:bookmarkStart w:id="91" w:name="ref-wikipedia_function_composition"/>
     <w:p>
       <w:pPr>
         <w:pStyle w:val="Bibliography"/>
@@ -13714,7 +14493,7 @@
       <w:r>
         <w:t xml:space="preserve"> </w:t>
       </w:r>
-      <w:hyperlink r:id="rId88">
+      <w:hyperlink r:id="rId90">
         <w:r>
           <w:rPr>
             <w:rStyle w:val="Hyperlink"/>
@@ -13723,8 +14502,8 @@
         </w:r>
       </w:hyperlink>
     </w:p>
-    <w:bookmarkEnd w:id="89"/>
-    <w:bookmarkStart w:id="91" w:name="ref-wikipedia_inverse_function"/>
+    <w:bookmarkEnd w:id="91"/>
+    <w:bookmarkStart w:id="93" w:name="ref-wikipedia_inverse_function"/>
     <w:p>
       <w:pPr>
         <w:pStyle w:val="Bibliography"/>
@@ -13771,7 +14550,7 @@
       <w:r>
         <w:t xml:space="preserve"> </w:t>
       </w:r>
-      <w:hyperlink r:id="rId90">
+      <w:hyperlink r:id="rId92">
         <w:r>
           <w:rPr>
             <w:rStyle w:val="Hyperlink"/>
@@ -13780,8 +14559,8 @@
         </w:r>
       </w:hyperlink>
     </w:p>
-    <w:bookmarkEnd w:id="91"/>
-    <w:bookmarkStart w:id="93" w:name="ref-wikipedia_operator_mathematics"/>
+    <w:bookmarkEnd w:id="93"/>
+    <w:bookmarkStart w:id="95" w:name="ref-wikipedia_operator_mathematics"/>
     <w:p>
       <w:pPr>
         <w:pStyle w:val="Bibliography"/>
@@ -13828,7 +14607,7 @@
       <w:r>
         <w:t xml:space="preserve"> </w:t>
       </w:r>
-      <w:hyperlink r:id="rId92">
+      <w:hyperlink r:id="rId94">
         <w:r>
           <w:rPr>
             <w:rStyle w:val="Hyperlink"/>
@@ -13837,8 +14616,8 @@
         </w:r>
       </w:hyperlink>
     </w:p>
-    <w:bookmarkEnd w:id="93"/>
-    <w:bookmarkStart w:id="95" w:name="ref-wikipedia_functional_mathematics"/>
+    <w:bookmarkEnd w:id="95"/>
+    <w:bookmarkStart w:id="97" w:name="ref-wikipedia_functional_mathematics"/>
     <w:p>
       <w:pPr>
         <w:pStyle w:val="Bibliography"/>
@@ -13885,7 +14664,7 @@
       <w:r>
         <w:t xml:space="preserve"> </w:t>
       </w:r>
-      <w:hyperlink r:id="rId94">
+      <w:hyperlink r:id="rId96">
         <w:r>
           <w:rPr>
             <w:rStyle w:val="Hyperlink"/>
@@ -13894,8 +14673,8 @@
         </w:r>
       </w:hyperlink>
     </w:p>
-    <w:bookmarkEnd w:id="95"/>
-    <w:bookmarkStart w:id="97" w:name="ref-wikipedia_sequence"/>
+    <w:bookmarkEnd w:id="97"/>
+    <w:bookmarkStart w:id="99" w:name="ref-wikipedia_sequence"/>
     <w:p>
       <w:pPr>
         <w:pStyle w:val="Bibliography"/>
@@ -13942,7 +14721,7 @@
       <w:r>
         <w:t xml:space="preserve"> </w:t>
       </w:r>
-      <w:hyperlink r:id="rId96">
+      <w:hyperlink r:id="rId98">
         <w:r>
           <w:rPr>
             <w:rStyle w:val="Hyperlink"/>
@@ -13951,8 +14730,8 @@
         </w:r>
       </w:hyperlink>
     </w:p>
-    <w:bookmarkEnd w:id="97"/>
-    <w:bookmarkStart w:id="99" w:name="ref-wikipedia_finite_set"/>
+    <w:bookmarkEnd w:id="99"/>
+    <w:bookmarkStart w:id="101" w:name="ref-wikipedia_logistic_function"/>
     <w:p>
       <w:pPr>
         <w:pStyle w:val="Bibliography"/>
@@ -13973,6 +14752,63 @@
         <w:t xml:space="preserve"> </w:t>
       </w:r>
       <w:r>
+        <w:t xml:space="preserve">“Logistic function —</w:t>
+      </w:r>
+      <w:r>
+        <w:t xml:space="preserve"> </w:t>
+      </w:r>
+      <w:r>
+        <w:t xml:space="preserve">Wikipedia</w:t>
+      </w:r>
+      <w:r>
+        <w:t xml:space="preserve">,</w:t>
+      </w:r>
+      <w:r>
+        <w:t xml:space="preserve"> </w:t>
+      </w:r>
+      <w:r>
+        <w:t xml:space="preserve">the free encyclopedia.”</w:t>
+      </w:r>
+      <w:r>
+        <w:t xml:space="preserve"> </w:t>
+      </w:r>
+      <w:r>
+        <w:t xml:space="preserve">2026. Available:</w:t>
+      </w:r>
+      <w:r>
+        <w:t xml:space="preserve"> </w:t>
+      </w:r>
+      <w:hyperlink r:id="rId100">
+        <w:r>
+          <w:rPr>
+            <w:rStyle w:val="Hyperlink"/>
+          </w:rPr>
+          <w:t xml:space="preserve">https://en.wikipedia.org/wiki/Logistic_function</w:t>
+        </w:r>
+      </w:hyperlink>
+    </w:p>
+    <w:bookmarkEnd w:id="101"/>
+    <w:bookmarkStart w:id="103" w:name="ref-wikipedia_finite_set"/>
+    <w:p>
+      <w:pPr>
+        <w:pStyle w:val="Bibliography"/>
+      </w:pPr>
+      <w:r>
+        <w:t xml:space="preserve">[15]</w:t>
+      </w:r>
+      <w:r>
+        <w:t xml:space="preserve"> </w:t>
+      </w:r>
+      <w:r>
+        <w:t xml:space="preserve">	</w:t>
+      </w:r>
+      <w:r>
+        <w:t xml:space="preserve">Wikipedia contributors,</w:t>
+      </w:r>
+      <w:r>
+        <w:t xml:space="preserve"> </w:t>
+      </w:r>
+      <w:r>
         <w:t xml:space="preserve">“Finite set —</w:t>
       </w:r>
       <w:r>
@@ -13999,7 +14835,7 @@
       <w:r>
         <w:t xml:space="preserve"> </w:t>
       </w:r>
-      <w:hyperlink r:id="rId98">
+      <w:hyperlink r:id="rId102">
         <w:r>
           <w:rPr>
             <w:rStyle w:val="Hyperlink"/>
@@ -14008,14 +14844,14 @@
         </w:r>
       </w:hyperlink>
     </w:p>
-    <w:bookmarkEnd w:id="99"/>
-    <w:bookmarkStart w:id="101" w:name="ref-wikipedia_cardinality"/>
+    <w:bookmarkEnd w:id="103"/>
+    <w:bookmarkStart w:id="105" w:name="ref-wikipedia_cardinality"/>
     <w:p>
       <w:pPr>
         <w:pStyle w:val="Bibliography"/>
       </w:pPr>
       <w:r>
-        <w:t xml:space="preserve">[15]</w:t>
+        <w:t xml:space="preserve">[16]</w:t>
       </w:r>
       <w:r>
         <w:t xml:space="preserve"> </w:t>
@@ -14056,7 +14892,7 @@
       <w:r>
         <w:t xml:space="preserve"> </w:t>
       </w:r>
-      <w:hyperlink r:id="rId100">
+      <w:hyperlink r:id="rId104">
         <w:r>
           <w:rPr>
             <w:rStyle w:val="Hyperlink"/>
@@ -14065,14 +14901,14 @@
         </w:r>
       </w:hyperlink>
     </w:p>
-    <w:bookmarkEnd w:id="101"/>
-    <w:bookmarkStart w:id="103" w:name="ref-wikipedia_infinite_set"/>
+    <w:bookmarkEnd w:id="105"/>
+    <w:bookmarkStart w:id="107" w:name="ref-wikipedia_infinite_set"/>
     <w:p>
       <w:pPr>
         <w:pStyle w:val="Bibliography"/>
       </w:pPr>
       <w:r>
-        <w:t xml:space="preserve">[16]</w:t>
+        <w:t xml:space="preserve">[17]</w:t>
       </w:r>
       <w:r>
         <w:t xml:space="preserve"> </w:t>
@@ -14113,7 +14949,7 @@
       <w:r>
         <w:t xml:space="preserve"> </w:t>
       </w:r>
-      <w:hyperlink r:id="rId102">
+      <w:hyperlink r:id="rId106">
         <w:r>
           <w:rPr>
             <w:rStyle w:val="Hyperlink"/>
@@ -14122,14 +14958,14 @@
         </w:r>
       </w:hyperlink>
     </w:p>
-    <w:bookmarkEnd w:id="103"/>
-    <w:bookmarkStart w:id="105" w:name="ref-wikipedia_countable_set"/>
+    <w:bookmarkEnd w:id="107"/>
+    <w:bookmarkStart w:id="109" w:name="ref-wikipedia_countable_set"/>
     <w:p>
       <w:pPr>
         <w:pStyle w:val="Bibliography"/>
       </w:pPr>
       <w:r>
-        <w:t xml:space="preserve">[17]</w:t>
+        <w:t xml:space="preserve">[18]</w:t>
       </w:r>
       <w:r>
         <w:t xml:space="preserve"> </w:t>
@@ -14170,7 +15006,7 @@
       <w:r>
         <w:t xml:space="preserve"> </w:t>
       </w:r>
-      <w:hyperlink r:id="rId104">
+      <w:hyperlink r:id="rId108">
         <w:r>
           <w:rPr>
             <w:rStyle w:val="Hyperlink"/>
@@ -14179,14 +15015,14 @@
         </w:r>
       </w:hyperlink>
     </w:p>
-    <w:bookmarkEnd w:id="105"/>
-    <w:bookmarkStart w:id="107" w:name="ref-wikipedia_cantors_diagonal_argument"/>
+    <w:bookmarkEnd w:id="109"/>
+    <w:bookmarkStart w:id="111" w:name="ref-wikipedia_cantors_diagonal_argument"/>
     <w:p>
       <w:pPr>
         <w:pStyle w:val="Bibliography"/>
       </w:pPr>
       <w:r>
-        <w:t xml:space="preserve">[18]</w:t>
+        <w:t xml:space="preserve">[19]</w:t>
       </w:r>
       <w:r>
         <w:t xml:space="preserve"> </w:t>
@@ -14227,7 +15063,7 @@
       <w:r>
         <w:t xml:space="preserve"> </w:t>
       </w:r>
-      <w:hyperlink r:id="rId106">
+      <w:hyperlink r:id="rId110">
         <w:r>
           <w:rPr>
             <w:rStyle w:val="Hyperlink"/>
@@ -14236,9 +15072,9 @@
         </w:r>
       </w:hyperlink>
     </w:p>
-    <w:bookmarkEnd w:id="107"/>
-    <w:bookmarkEnd w:id="108"/>
-    <w:bookmarkEnd w:id="109"/>
+    <w:bookmarkEnd w:id="111"/>
+    <w:bookmarkEnd w:id="112"/>
+    <w:bookmarkEnd w:id="113"/>
     <w:sectPr>
       <w:footnotePr>
         <w:numRestart w:val="eachSect"/>

</xml_diff>

<commit_message>
Deploying to gh-pages from @ Morrison-Lab/mds@d9e7b6f66185d117d53eb7e9a8d3c43cb19dc37e 🚀
</commit_message>
<xml_diff>
--- a/functions.docx
+++ b/functions.docx
@@ -15,7 +15,7 @@
         <w:pStyle w:val="Date"/>
       </w:pPr>
       <w:r>
-        <w:t xml:space="preserve">Last modified: 2026-10-24 15:35:26 (PDT)</w:t>
+        <w:t xml:space="preserve">Last modified: 2026-10-24 20:19:00 (PDT)</w:t>
       </w:r>
     </w:p>
     <w:p>
@@ -12243,7 +12243,10 @@
       </w:r>
       <m:oMath>
         <m:r>
-          <m:t>σ</m:t>
+          <m:rPr>
+            <m:sty m:val="p"/>
+          </m:rPr>
+          <m:t>expit</m:t>
         </m:r>
         <m:r>
           <m:rPr>
@@ -12312,7 +12315,10 @@
         </m:oMathParaPr>
         <m:oMath>
           <m:r>
-            <m:t>σ</m:t>
+            <m:rPr>
+              <m:sty m:val="p"/>
+            </m:rPr>
+            <m:t>expit</m:t>
           </m:r>
           <m:r>
             <m:t>​</m:t>

</xml_diff>

<commit_message>
Deploying to gh-pages from @ Morrison-Lab/mds@f5878786158fda91d8208902744d77bb223badac 🚀
</commit_message>
<xml_diff>
--- a/functions.docx
+++ b/functions.docx
@@ -15,7 +15,7 @@
         <w:pStyle w:val="Date"/>
       </w:pPr>
       <w:r>
-        <w:t xml:space="preserve">Last modified: 2026-10-25 18:01:14 (PDT)</w:t>
+        <w:t xml:space="preserve">Last modified: 2026-10-26 02:21:32 (PDT)</w:t>
       </w:r>
     </w:p>
     <w:p>
@@ -4195,6 +4195,15 @@
               <w:t xml:space="preserve">(</w:t>
             </w:r>
             <w:r>
+              <w:br/>
+            </w:r>
+            <w:r>
+              <w:rPr>
+                <w:rStyle w:val="NormalTok"/>
+              </w:rPr>
+              <w:t xml:space="preserve">    </w:t>
+            </w:r>
+            <w:r>
               <w:rPr>
                 <w:rStyle w:val="AttributeTok"/>
               </w:rPr>
@@ -4210,13 +4219,22 @@
               <w:rPr>
                 <w:rStyle w:val="StringTok"/>
               </w:rPr>
-              <w:t xml:space="preserve">"a (the roll)"</w:t>
-            </w:r>
-            <w:r>
-              <w:rPr>
-                <w:rStyle w:val="NormalTok"/>
-              </w:rPr>
-              <w:t xml:space="preserve">, </w:t>
+              <w:t xml:space="preserve">"Input, a (the roll)"</w:t>
+            </w:r>
+            <w:r>
+              <w:rPr>
+                <w:rStyle w:val="NormalTok"/>
+              </w:rPr>
+              <w:t xml:space="preserve">,</w:t>
+            </w:r>
+            <w:r>
+              <w:br/>
+            </w:r>
+            <w:r>
+              <w:rPr>
+                <w:rStyle w:val="NormalTok"/>
+              </w:rPr>
+              <w:t xml:space="preserve">    </w:t>
             </w:r>
             <w:r>
               <w:rPr>
@@ -4234,13 +4252,22 @@
               <w:rPr>
                 <w:rStyle w:val="StringTok"/>
               </w:rPr>
-              <w:t xml:space="preserve">"f(a) = 2a"</w:t>
-            </w:r>
-            <w:r>
-              <w:rPr>
-                <w:rStyle w:val="NormalTok"/>
-              </w:rPr>
-              <w:t xml:space="preserve">, </w:t>
+              <w:t xml:space="preserve">"Output, f(a) = 2a"</w:t>
+            </w:r>
+            <w:r>
+              <w:rPr>
+                <w:rStyle w:val="NormalTok"/>
+              </w:rPr>
+              <w:t xml:space="preserve">,</w:t>
+            </w:r>
+            <w:r>
+              <w:br/>
+            </w:r>
+            <w:r>
+              <w:rPr>
+                <w:rStyle w:val="NormalTok"/>
+              </w:rPr>
+              <w:t xml:space="preserve">    </w:t>
             </w:r>
             <w:r>
               <w:rPr>
@@ -4261,10 +4288,13 @@
               <w:t xml:space="preserve">NULL</w:t>
             </w:r>
             <w:r>
-              <w:rPr>
-                <w:rStyle w:val="NormalTok"/>
-              </w:rPr>
-              <w:t xml:space="preserve">) </w:t>
+              <w:br/>
+            </w:r>
+            <w:r>
+              <w:rPr>
+                <w:rStyle w:val="NormalTok"/>
+              </w:rPr>
+              <w:t xml:space="preserve">  ) </w:t>
             </w:r>
             <w:r>
               <w:rPr>
@@ -9851,6 +9881,15 @@
               <w:t xml:space="preserve">(</w:t>
             </w:r>
             <w:r>
+              <w:br/>
+            </w:r>
+            <w:r>
+              <w:rPr>
+                <w:rStyle w:val="NormalTok"/>
+              </w:rPr>
+              <w:t xml:space="preserve">    </w:t>
+            </w:r>
+            <w:r>
               <w:rPr>
                 <w:rStyle w:val="AttributeTok"/>
               </w:rPr>
@@ -9866,13 +9905,22 @@
               <w:rPr>
                 <w:rStyle w:val="StringTok"/>
               </w:rPr>
-              <w:t xml:space="preserve">"a (the roll)"</w:t>
-            </w:r>
-            <w:r>
-              <w:rPr>
-                <w:rStyle w:val="NormalTok"/>
-              </w:rPr>
-              <w:t xml:space="preserve">, </w:t>
+              <w:t xml:space="preserve">"Input, a (the roll)"</w:t>
+            </w:r>
+            <w:r>
+              <w:rPr>
+                <w:rStyle w:val="NormalTok"/>
+              </w:rPr>
+              <w:t xml:space="preserve">,</w:t>
+            </w:r>
+            <w:r>
+              <w:br/>
+            </w:r>
+            <w:r>
+              <w:rPr>
+                <w:rStyle w:val="NormalTok"/>
+              </w:rPr>
+              <w:t xml:space="preserve">    </w:t>
             </w:r>
             <w:r>
               <w:rPr>
@@ -9890,13 +9938,22 @@
               <w:rPr>
                 <w:rStyle w:val="StringTok"/>
               </w:rPr>
-              <w:t xml:space="preserve">"f(a) = 2a"</w:t>
-            </w:r>
-            <w:r>
-              <w:rPr>
-                <w:rStyle w:val="NormalTok"/>
-              </w:rPr>
-              <w:t xml:space="preserve">, </w:t>
+              <w:t xml:space="preserve">"Output, f(a) = 2a"</w:t>
+            </w:r>
+            <w:r>
+              <w:rPr>
+                <w:rStyle w:val="NormalTok"/>
+              </w:rPr>
+              <w:t xml:space="preserve">,</w:t>
+            </w:r>
+            <w:r>
+              <w:br/>
+            </w:r>
+            <w:r>
+              <w:rPr>
+                <w:rStyle w:val="NormalTok"/>
+              </w:rPr>
+              <w:t xml:space="preserve">    </w:t>
             </w:r>
             <w:r>
               <w:rPr>
@@ -9917,10 +9974,13 @@
               <w:t xml:space="preserve">NULL</w:t>
             </w:r>
             <w:r>
-              <w:rPr>
-                <w:rStyle w:val="NormalTok"/>
-              </w:rPr>
-              <w:t xml:space="preserve">) </w:t>
+              <w:br/>
+            </w:r>
+            <w:r>
+              <w:rPr>
+                <w:rStyle w:val="NormalTok"/>
+              </w:rPr>
+              <w:t xml:space="preserve">  ) </w:t>
             </w:r>
             <w:r>
               <w:rPr>
@@ -11751,7 +11811,7 @@
               <w:rPr>
                 <w:rStyle w:val="StringTok"/>
               </w:rPr>
-              <w:t xml:space="preserve">"a"</w:t>
+              <w:t xml:space="preserve">"Input, a"</w:t>
             </w:r>
             <w:r>
               <w:rPr>
@@ -11775,7 +11835,7 @@
               <w:rPr>
                 <w:rStyle w:val="StringTok"/>
               </w:rPr>
-              <w:t xml:space="preserve">"f(a) = a^2"</w:t>
+              <w:t xml:space="preserve">"Output, f(a) = a^2"</w:t>
             </w:r>
             <w:r>
               <w:rPr>
@@ -15807,7 +15867,7 @@
               <w:rPr>
                 <w:rStyle w:val="StringTok"/>
               </w:rPr>
-              <w:t xml:space="preserve">"x"</w:t>
+              <w:t xml:space="preserve">"Input, x"</w:t>
             </w:r>
             <w:r>
               <w:rPr>
@@ -15831,7 +15891,7 @@
               <w:rPr>
                 <w:rStyle w:val="StringTok"/>
               </w:rPr>
-              <w:t xml:space="preserve">"value"</w:t>
+              <w:t xml:space="preserve">"Output, value"</w:t>
             </w:r>
             <w:r>
               <w:rPr>

</xml_diff>

<commit_message>
Deploying to gh-pages from @ Morrison-Lab/mds@f44ad2e3631f7183f449b4db4e33b5103c84c101 🚀
</commit_message>
<xml_diff>
--- a/functions.docx
+++ b/functions.docx
@@ -15,7 +15,7 @@
         <w:pStyle w:val="Date"/>
       </w:pPr>
       <w:r>
-        <w:t xml:space="preserve">Last modified: 2026-10-27 20:53:54 (PDT)</w:t>
+        <w:t xml:space="preserve">Last modified: 2026-10-28 13:13:09 (PDT)</w:t>
       </w:r>
     </w:p>
     <w:p>
@@ -7973,7 +7973,7 @@
               <w:rPr>
                 <w:rStyle w:val="StringTok"/>
               </w:rPr>
-              <w:t xml:space="preserve">"a"</w:t>
+              <w:t xml:space="preserve">"Input, a"</w:t>
             </w:r>
             <w:r>
               <w:rPr>
@@ -7997,7 +7997,7 @@
               <w:rPr>
                 <w:rStyle w:val="StringTok"/>
               </w:rPr>
-              <w:t xml:space="preserve">"f(a) = a^2"</w:t>
+              <w:t xml:space="preserve">"Output, f(a) = a^2"</w:t>
             </w:r>
             <w:r>
               <w:rPr>
@@ -19840,7 +19840,7 @@
               <w:rPr>
                 <w:rStyle w:val="StringTok"/>
               </w:rPr>
-              <w:t xml:space="preserve">"x"</w:t>
+              <w:t xml:space="preserve">"Input, x"</w:t>
             </w:r>
             <w:r>
               <w:rPr>
@@ -19864,7 +19864,7 @@
               <w:rPr>
                 <w:rStyle w:val="StringTok"/>
               </w:rPr>
-              <w:t xml:space="preserve">"y"</w:t>
+              <w:t xml:space="preserve">"Output, y"</w:t>
             </w:r>
             <w:r>
               <w:rPr>
@@ -21411,7 +21411,7 @@
               <w:rPr>
                 <w:rStyle w:val="StringTok"/>
               </w:rPr>
-              <w:t xml:space="preserve">"x"</w:t>
+              <w:t xml:space="preserve">"Input, x"</w:t>
             </w:r>
             <w:r>
               <w:rPr>
@@ -21435,7 +21435,7 @@
               <w:rPr>
                 <w:rStyle w:val="StringTok"/>
               </w:rPr>
-              <w:t xml:space="preserve">"h(x) = x^2"</w:t>
+              <w:t xml:space="preserve">"Output, h(x) = x^2"</w:t>
             </w:r>
             <w:r>
               <w:rPr>
@@ -25644,7 +25644,7 @@
               <w:rPr>
                 <w:rStyle w:val="StringTok"/>
               </w:rPr>
-              <w:t xml:space="preserve">"n"</w:t>
+              <w:t xml:space="preserve">"Index, n"</w:t>
             </w:r>
             <w:r>
               <w:rPr>
@@ -28944,7 +28944,7 @@
               <w:rPr>
                 <w:rStyle w:val="StringTok"/>
               </w:rPr>
-              <w:t xml:space="preserve">"z"</w:t>
+              <w:t xml:space="preserve">"Score, z"</w:t>
             </w:r>
             <w:r>
               <w:rPr>

</xml_diff>

<commit_message>
Deploying to gh-pages from @ Morrison-Lab/mds@8736f99182906b21d03330e38eec203f2af33ae3 🚀
</commit_message>
<xml_diff>
--- a/functions.docx
+++ b/functions.docx
@@ -15,7 +15,7 @@
         <w:pStyle w:val="Date"/>
       </w:pPr>
       <w:r>
-        <w:t xml:space="preserve">Last modified: 2026-10-28 16:00:43 (PDT)</w:t>
+        <w:t xml:space="preserve">Last modified: 2026-10-28 17:04:35 (PDT)</w:t>
       </w:r>
     </w:p>
     <w:p>
@@ -25668,7 +25668,7 @@
               <w:rPr>
                 <w:rStyle w:val="StringTok"/>
               </w:rPr>
-              <w:t xml:space="preserve">"term"</w:t>
+              <w:t xml:space="preserve">"Term value"</w:t>
             </w:r>
             <w:r>
               <w:rPr>
@@ -28944,7 +28944,7 @@
               <w:rPr>
                 <w:rStyle w:val="StringTok"/>
               </w:rPr>
-              <w:t xml:space="preserve">"Score, z"</w:t>
+              <w:t xml:space="preserve">"Log-odds, z"</w:t>
             </w:r>
             <w:r>
               <w:rPr>
@@ -28968,7 +28968,7 @@
               <w:rPr>
                 <w:rStyle w:val="StringTok"/>
               </w:rPr>
-              <w:t xml:space="preserve">"logistic(z)"</w:t>
+              <w:t xml:space="preserve">"Probability, logistic(z)"</w:t>
             </w:r>
             <w:r>
               <w:rPr>

</xml_diff>

<commit_message>
Deploying to gh-pages from @ Morrison-Lab/mds@8c87bcc5040c40b3a087af7c92145ad00a6343fa 🚀
</commit_message>
<xml_diff>
--- a/functions.docx
+++ b/functions.docx
@@ -15,7 +15,7 @@
         <w:pStyle w:val="Date"/>
       </w:pPr>
       <w:r>
-        <w:t xml:space="preserve">Last modified: 2026-10-28 17:04:35 (PDT)</w:t>
+        <w:t xml:space="preserve">Last modified: 2026-10-28 18:32:18 (PDT)</w:t>
       </w:r>
     </w:p>
     <w:p>
@@ -27023,7 +27023,7 @@
             </m:dPr>
             <m:e>
               <m:r>
-                <m:t>z</m:t>
+                <m:t>η</m:t>
               </m:r>
             </m:e>
           </m:d>
@@ -27071,6 +27071,10 @@
               <m:sSup>
                 <m:e>
                   <m:r>
+                    <m:rPr>
+                      <m:nor/>
+                      <m:sty m:val="p"/>
+                    </m:rPr>
                     <m:t>e</m:t>
                   </m:r>
                 </m:e>
@@ -27082,7 +27086,7 @@
                     <m:t>−</m:t>
                   </m:r>
                   <m:r>
-                    <m:t>z</m:t>
+                    <m:t>η</m:t>
                   </m:r>
                 </m:sup>
               </m:sSup>
@@ -27138,7 +27142,7 @@
       </w:r>
       <m:oMath>
         <m:r>
-          <m:t>z</m:t>
+          <m:t>η</m:t>
         </m:r>
         <m:r>
           <m:rPr>
@@ -27164,7 +27168,7 @@
       </w:r>
       <m:oMath>
         <m:r>
-          <m:t>z</m:t>
+          <m:t>η</m:t>
         </m:r>
         <m:r>
           <m:rPr>
@@ -27187,7 +27191,7 @@
       </w:r>
       <m:oMath>
         <m:r>
-          <m:t>z</m:t>
+          <m:t>η</m:t>
         </m:r>
         <m:r>
           <m:rPr>
@@ -27228,7 +27232,7 @@
         <w:rPr>
           <w:rStyle w:val="NormalTok"/>
         </w:rPr>
-        <w:t xml:space="preserve">z </w:t>
+        <w:t xml:space="preserve">eta </w:t>
       </w:r>
       <w:r>
         <w:rPr>
@@ -27315,13 +27319,13 @@
         <w:rPr>
           <w:rStyle w:val="AttributeTok"/>
         </w:rPr>
-        <w:t xml:space="preserve">z =</w:t>
+        <w:t xml:space="preserve">eta =</w:t>
       </w:r>
       <w:r>
         <w:rPr>
           <w:rStyle w:val="NormalTok"/>
         </w:rPr>
-        <w:t xml:space="preserve"> z, </w:t>
+        <w:t xml:space="preserve"> eta, </w:t>
       </w:r>
       <w:r>
         <w:rPr>
@@ -27405,7 +27409,7 @@
         <w:rPr>
           <w:rStyle w:val="NormalTok"/>
         </w:rPr>
-        <w:t xml:space="preserve">z)))</w:t>
+        <w:t xml:space="preserve">eta)))</w:t>
       </w:r>
       <w:r>
         <w:br/>
@@ -27423,7 +27427,7 @@
         <w:rPr>
           <w:rStyle w:val="CommentTok"/>
         </w:rPr>
-        <w:t xml:space="preserve">#&gt;       z sigmoid</w:t>
+        <w:t xml:space="preserve">#&gt;     eta sigmoid</w:t>
       </w:r>
       <w:r>
         <w:br/>
@@ -27491,7 +27495,7 @@
       </w:r>
       <m:oMath>
         <m:r>
-          <m:t>z</m:t>
+          <m:t>η</m:t>
         </m:r>
         <m:r>
           <m:rPr>
@@ -27540,10 +27544,20 @@
         <m:sSup>
           <m:e>
             <m:r>
+              <m:rPr>
+                <m:nor/>
+                <m:sty m:val="p"/>
+              </m:rPr>
               <m:t>e</m:t>
             </m:r>
           </m:e>
           <m:sup>
+            <m:r>
+              <m:rPr>
+                <m:sty m:val="p"/>
+              </m:rPr>
+              <m:t>−</m:t>
+            </m:r>
             <m:r>
               <m:t>0</m:t>
             </m:r>
@@ -27658,9 +27672,18 @@
             </w:pPr>
             <w:r>
               <w:rPr>
-                <w:rStyle w:val="NormalTok"/>
-              </w:rPr>
-              <w:t xml:space="preserve">z_grid </w:t>
+                <w:rStyle w:val="CommentTok"/>
+              </w:rPr>
+              <w:t xml:space="preserve"># the Greek letter eta, written as a code point to keep this file ASCII</w:t>
+            </w:r>
+            <w:r>
+              <w:br/>
+            </w:r>
+            <w:r>
+              <w:rPr>
+                <w:rStyle w:val="NormalTok"/>
+              </w:rPr>
+              <w:t xml:space="preserve">eta_symbol </w:t>
             </w:r>
             <w:r>
               <w:rPr>
@@ -27678,6 +27701,51 @@
               <w:rPr>
                 <w:rStyle w:val="FunctionTok"/>
               </w:rPr>
+              <w:t xml:space="preserve">intToUtf8</w:t>
+            </w:r>
+            <w:r>
+              <w:rPr>
+                <w:rStyle w:val="NormalTok"/>
+              </w:rPr>
+              <w:t xml:space="preserve">(</w:t>
+            </w:r>
+            <w:r>
+              <w:rPr>
+                <w:rStyle w:val="DecValTok"/>
+              </w:rPr>
+              <w:t xml:space="preserve">0x3b7</w:t>
+            </w:r>
+            <w:r>
+              <w:rPr>
+                <w:rStyle w:val="NormalTok"/>
+              </w:rPr>
+              <w:t xml:space="preserve">)</w:t>
+            </w:r>
+            <w:r>
+              <w:br/>
+            </w:r>
+            <w:r>
+              <w:rPr>
+                <w:rStyle w:val="NormalTok"/>
+              </w:rPr>
+              <w:t xml:space="preserve">eta_grid </w:t>
+            </w:r>
+            <w:r>
+              <w:rPr>
+                <w:rStyle w:val="OtherTok"/>
+              </w:rPr>
+              <w:t xml:space="preserve">&lt;-</w:t>
+            </w:r>
+            <w:r>
+              <w:rPr>
+                <w:rStyle w:val="NormalTok"/>
+              </w:rPr>
+              <w:t xml:space="preserve"> </w:t>
+            </w:r>
+            <w:r>
+              <w:rPr>
+                <w:rStyle w:val="FunctionTok"/>
+              </w:rPr>
               <w:t xml:space="preserve">seq</w:t>
             </w:r>
             <w:r>
@@ -27777,13 +27845,13 @@
               <w:rPr>
                 <w:rStyle w:val="AttributeTok"/>
               </w:rPr>
-              <w:t xml:space="preserve">z =</w:t>
-            </w:r>
-            <w:r>
-              <w:rPr>
-                <w:rStyle w:val="NormalTok"/>
-              </w:rPr>
-              <w:t xml:space="preserve"> z_grid, </w:t>
+              <w:t xml:space="preserve">eta =</w:t>
+            </w:r>
+            <w:r>
+              <w:rPr>
+                <w:rStyle w:val="NormalTok"/>
+              </w:rPr>
+              <w:t xml:space="preserve"> eta_grid, </w:t>
             </w:r>
             <w:r>
               <w:rPr>
@@ -27807,7 +27875,7 @@
               <w:rPr>
                 <w:rStyle w:val="NormalTok"/>
               </w:rPr>
-              <w:t xml:space="preserve">(z_grid))</w:t>
+              <w:t xml:space="preserve">(eta_grid))</w:t>
             </w:r>
             <w:r>
               <w:br/>
@@ -27846,7 +27914,7 @@
               <w:rPr>
                 <w:rStyle w:val="AttributeTok"/>
               </w:rPr>
-              <w:t xml:space="preserve">z =</w:t>
+              <w:t xml:space="preserve">eta =</w:t>
             </w:r>
             <w:r>
               <w:rPr>
@@ -28347,7 +28415,7 @@
               <w:rPr>
                 <w:rStyle w:val="NormalTok"/>
               </w:rPr>
-              <w:t xml:space="preserve"> z, </w:t>
+              <w:t xml:space="preserve"> eta, </w:t>
             </w:r>
             <w:r>
               <w:rPr>
@@ -28488,7 +28556,7 @@
               <w:rPr>
                 <w:rStyle w:val="NormalTok"/>
               </w:rPr>
-              <w:t xml:space="preserve"> z, </w:t>
+              <w:t xml:space="preserve"> eta, </w:t>
             </w:r>
             <w:r>
               <w:rPr>
@@ -28662,7 +28730,7 @@
               <w:rPr>
                 <w:rStyle w:val="NormalTok"/>
               </w:rPr>
-              <w:t xml:space="preserve"> z, </w:t>
+              <w:t xml:space="preserve"> eta, </w:t>
             </w:r>
             <w:r>
               <w:rPr>
@@ -28929,6 +28997,15 @@
               <w:t xml:space="preserve">(</w:t>
             </w:r>
             <w:r>
+              <w:br/>
+            </w:r>
+            <w:r>
+              <w:rPr>
+                <w:rStyle w:val="NormalTok"/>
+              </w:rPr>
+              <w:t xml:space="preserve">    </w:t>
+            </w:r>
+            <w:r>
               <w:rPr>
                 <w:rStyle w:val="AttributeTok"/>
               </w:rPr>
@@ -28942,15 +29019,36 @@
             </w:r>
             <w:r>
               <w:rPr>
+                <w:rStyle w:val="FunctionTok"/>
+              </w:rPr>
+              <w:t xml:space="preserve">paste0</w:t>
+            </w:r>
+            <w:r>
+              <w:rPr>
+                <w:rStyle w:val="NormalTok"/>
+              </w:rPr>
+              <w:t xml:space="preserve">(</w:t>
+            </w:r>
+            <w:r>
+              <w:rPr>
                 <w:rStyle w:val="StringTok"/>
               </w:rPr>
-              <w:t xml:space="preserve">"Log-odds, z"</w:t>
-            </w:r>
-            <w:r>
-              <w:rPr>
-                <w:rStyle w:val="NormalTok"/>
-              </w:rPr>
-              <w:t xml:space="preserve">, </w:t>
+              <w:t xml:space="preserve">"Log-odds, "</w:t>
+            </w:r>
+            <w:r>
+              <w:rPr>
+                <w:rStyle w:val="NormalTok"/>
+              </w:rPr>
+              <w:t xml:space="preserve">, eta_symbol),</w:t>
+            </w:r>
+            <w:r>
+              <w:br/>
+            </w:r>
+            <w:r>
+              <w:rPr>
+                <w:rStyle w:val="NormalTok"/>
+              </w:rPr>
+              <w:t xml:space="preserve">    </w:t>
             </w:r>
             <w:r>
               <w:rPr>
@@ -28966,15 +29064,48 @@
             </w:r>
             <w:r>
               <w:rPr>
+                <w:rStyle w:val="FunctionTok"/>
+              </w:rPr>
+              <w:t xml:space="preserve">paste0</w:t>
+            </w:r>
+            <w:r>
+              <w:rPr>
+                <w:rStyle w:val="NormalTok"/>
+              </w:rPr>
+              <w:t xml:space="preserve">(</w:t>
+            </w:r>
+            <w:r>
+              <w:rPr>
                 <w:rStyle w:val="StringTok"/>
               </w:rPr>
-              <w:t xml:space="preserve">"Probability, logistic(z)"</w:t>
-            </w:r>
-            <w:r>
-              <w:rPr>
-                <w:rStyle w:val="NormalTok"/>
-              </w:rPr>
-              <w:t xml:space="preserve">) </w:t>
+              <w:t xml:space="preserve">"Probability, logistic("</w:t>
+            </w:r>
+            <w:r>
+              <w:rPr>
+                <w:rStyle w:val="NormalTok"/>
+              </w:rPr>
+              <w:t xml:space="preserve">, eta_symbol, </w:t>
+            </w:r>
+            <w:r>
+              <w:rPr>
+                <w:rStyle w:val="StringTok"/>
+              </w:rPr>
+              <w:t xml:space="preserve">")"</w:t>
+            </w:r>
+            <w:r>
+              <w:rPr>
+                <w:rStyle w:val="NormalTok"/>
+              </w:rPr>
+              <w:t xml:space="preserve">)</w:t>
+            </w:r>
+            <w:r>
+              <w:br/>
+            </w:r>
+            <w:r>
+              <w:rPr>
+                <w:rStyle w:val="NormalTok"/>
+              </w:rPr>
+              <w:t xml:space="preserve">  ) </w:t>
             </w:r>
             <w:r>
               <w:rPr>
@@ -29307,7 +29438,7 @@
             </w:r>
             <m:oMath>
               <m:r>
-                <m:t>z</m:t>
+                <m:t>η</m:t>
               </m:r>
             </m:oMath>
             <w:r>
@@ -29400,7 +29531,7 @@
             </w:r>
             <m:oMath>
               <m:r>
-                <m:t>z</m:t>
+                <m:t>η</m:t>
               </m:r>
               <m:r>
                 <m:rPr>

</xml_diff>